<commit_message>
Layout da estação conforme o desenho da operação
- esteira de transporte, alto giro ao longo dela, transferências de entrada e saída,
  área de espera e corredor perpendicular do baixo giro (P015 na cabeceira,
  020-031 lado esquerdo, 032 em diante lado direito), vizinhas em cinza
- andar 0 em cima; altura do endereço conforme o número de endereços do prédio
- bacias de tamanho único; vista de planta
- diagramas (planta e elevações), documento técnico e apresentação atualizados

Co-Authored-By: Claude Opus 5.5 <noreply@anthropic.com>
Claude-Session: https://claude.ai/code/session_01TBWA3G7ku1j3oTf4VMkLud
</commit_message>
<xml_diff>
--- a/projeto/entregaveis/Arquitetura_PTL_Documento_Tecnico.docx
+++ b/projeto/entregaveis/Arquitetura_PTL_Documento_Tecnico.docx
@@ -881,7 +881,7 @@
           <w:sz w:val="21"/>
           <w:szCs w:val="21"/>
         </w:rPr>
-        <w:t xml:space="preserve">Simulador 3D de uma estação completa (frente e fundo) para demonstração.</w:t>
+        <w:t xml:space="preserve">Simulador 3D de uma estação completa (alto giro, área de espera e corredor do baixo giro, com as vizinhas) para demonstração.</w:t>
       </w:r>
     </w:p>
     <w:p>
@@ -2131,7 +2131,7 @@
                 <w:sz w:val="18"/>
                 <w:szCs w:val="18"/>
               </w:rPr>
-              <w:t xml:space="preserve">Frente — alto giro</w:t>
+              <w:t xml:space="preserve">Alto giro (ao longo da esteira de transporte)</w:t>
             </w:r>
           </w:p>
         </w:tc>
@@ -2195,7 +2195,7 @@
                 <w:sz w:val="18"/>
                 <w:szCs w:val="18"/>
               </w:rPr>
-              <w:t xml:space="preserve">0 a 3</w:t>
+              <w:t xml:space="preserve">0 a 3 (de cima)</w:t>
             </w:r>
           </w:p>
         </w:tc>
@@ -2261,7 +2261,7 @@
                 <w:sz w:val="18"/>
                 <w:szCs w:val="18"/>
               </w:rPr>
-              <w:t xml:space="preserve">Frente — alto giro (alto)</w:t>
+              <w:t xml:space="preserve">Alto giro (níveis de baixo)</w:t>
             </w:r>
           </w:p>
         </w:tc>
@@ -2391,7 +2391,7 @@
                 <w:sz w:val="18"/>
                 <w:szCs w:val="18"/>
               </w:rPr>
-              <w:t xml:space="preserve">Posições tipo "N"</w:t>
+              <w:t xml:space="preserve">Cabeceira do corredor ("150-153")</w:t>
             </w:r>
           </w:p>
         </w:tc>
@@ -2521,7 +2521,7 @@
                 <w:sz w:val="18"/>
                 <w:szCs w:val="18"/>
               </w:rPr>
-              <w:t xml:space="preserve">Fundo — baixo giro</w:t>
+              <w:t xml:space="preserve">Baixo giro (corredor perpendicular)</w:t>
             </w:r>
           </w:p>
         </w:tc>
@@ -2553,7 +2553,7 @@
                 <w:sz w:val="18"/>
                 <w:szCs w:val="18"/>
               </w:rPr>
-              <w:t xml:space="preserve">020-043 (Med.) / 022-045 (Perf.)</w:t>
+              <w:t xml:space="preserve">Lado esquerdo: 020/022-031 · lado direito: 032 até o último</w:t>
             </w:r>
           </w:p>
         </w:tc>
@@ -2585,7 +2585,7 @@
                 <w:sz w:val="18"/>
                 <w:szCs w:val="18"/>
               </w:rPr>
-              <w:t xml:space="preserve">0 a 7</w:t>
+              <w:t xml:space="preserve">0 a 7 (de cima)</w:t>
             </w:r>
           </w:p>
         </w:tc>
@@ -2790,13 +2790,300 @@
     </w:p>
     <w:p>
       <w:pPr>
+        <w:pStyle w:val="Heading2"/>
+        <w:spacing w:after="120" w:before="200"/>
+      </w:pPr>
+      <w:r>
+        <w:rPr>
+          <w:rFonts w:ascii="Arial" w:cs="Arial" w:eastAsia="Arial" w:hAnsi="Arial"/>
+        </w:rPr>
+        <w:t xml:space="preserve">3.2 Disposição física</w:t>
+      </w:r>
+    </w:p>
+    <w:p>
+      <w:pPr>
+        <w:spacing w:after="120" w:before="0" w:line="300"/>
+      </w:pPr>
+      <w:r>
+        <w:rPr>
+          <w:rFonts w:ascii="Arial" w:cs="Arial" w:eastAsia="Arial" w:hAnsi="Arial"/>
+          <w:b w:val="false"/>
+          <w:bCs w:val="false"/>
+          <w:sz w:val="21"/>
+          <w:szCs w:val="21"/>
+        </w:rPr>
+        <w:t xml:space="preserve">A </w:t>
+      </w:r>
+      <w:r>
+        <w:rPr>
+          <w:rFonts w:ascii="Arial" w:cs="Arial" w:eastAsia="Arial" w:hAnsi="Arial"/>
+          <w:b/>
+          <w:bCs/>
+          <w:sz w:val="21"/>
+          <w:szCs w:val="21"/>
+        </w:rPr>
+        <w:t xml:space="preserve">esteira de transporte</w:t>
+      </w:r>
+      <w:r>
+        <w:rPr>
+          <w:rFonts w:ascii="Arial" w:cs="Arial" w:eastAsia="Arial" w:hAnsi="Arial"/>
+          <w:b w:val="false"/>
+          <w:bCs w:val="false"/>
+          <w:sz w:val="21"/>
+          <w:szCs w:val="21"/>
+        </w:rPr>
+        <w:t xml:space="preserve"> passa atrás do </w:t>
+      </w:r>
+      <w:r>
+        <w:rPr>
+          <w:rFonts w:ascii="Arial" w:cs="Arial" w:eastAsia="Arial" w:hAnsi="Arial"/>
+          <w:b/>
+          <w:bCs/>
+          <w:sz w:val="21"/>
+          <w:szCs w:val="21"/>
+        </w:rPr>
+        <w:t xml:space="preserve">alto giro</w:t>
+      </w:r>
+      <w:r>
+        <w:rPr>
+          <w:rFonts w:ascii="Arial" w:cs="Arial" w:eastAsia="Arial" w:hAnsi="Arial"/>
+          <w:b w:val="false"/>
+          <w:bCs w:val="false"/>
+          <w:sz w:val="21"/>
+          <w:szCs w:val="21"/>
+        </w:rPr>
+        <w:t xml:space="preserve"> de todas as estações. Entre uma estação e outra há um vão com duas </w:t>
+      </w:r>
+      <w:r>
+        <w:rPr>
+          <w:rFonts w:ascii="Arial" w:cs="Arial" w:eastAsia="Arial" w:hAnsi="Arial"/>
+          <w:b/>
+          <w:bCs/>
+          <w:sz w:val="21"/>
+          <w:szCs w:val="21"/>
+        </w:rPr>
+        <w:t xml:space="preserve">transferências</w:t>
+      </w:r>
+      <w:r>
+        <w:rPr>
+          <w:rFonts w:ascii="Arial" w:cs="Arial" w:eastAsia="Arial" w:hAnsi="Arial"/>
+          <w:b w:val="false"/>
+          <w:bCs w:val="false"/>
+          <w:sz w:val="21"/>
+          <w:szCs w:val="21"/>
+        </w:rPr>
+        <w:t xml:space="preserve">: a da direita traz a bacia da esteira para a </w:t>
+      </w:r>
+      <w:r>
+        <w:rPr>
+          <w:rFonts w:ascii="Arial" w:cs="Arial" w:eastAsia="Arial" w:hAnsi="Arial"/>
+          <w:b/>
+          <w:bCs/>
+          <w:sz w:val="21"/>
+          <w:szCs w:val="21"/>
+        </w:rPr>
+        <w:t xml:space="preserve">área de espera</w:t>
+      </w:r>
+      <w:r>
+        <w:rPr>
+          <w:rFonts w:ascii="Arial" w:cs="Arial" w:eastAsia="Arial" w:hAnsi="Arial"/>
+          <w:b w:val="false"/>
+          <w:bCs w:val="false"/>
+          <w:sz w:val="21"/>
+          <w:szCs w:val="21"/>
+        </w:rPr>
+        <w:t xml:space="preserve"> da estação seguinte; a da esquerda devolve a bacia separada para a esteira. A área de espera fica em frente ao alto giro, e o operador trabalha entre ela e a entrada do </w:t>
+      </w:r>
+      <w:r>
+        <w:rPr>
+          <w:rFonts w:ascii="Arial" w:cs="Arial" w:eastAsia="Arial" w:hAnsi="Arial"/>
+          <w:b/>
+          <w:bCs/>
+          <w:sz w:val="21"/>
+          <w:szCs w:val="21"/>
+        </w:rPr>
+        <w:t xml:space="preserve">corredor do baixo giro</w:t>
+      </w:r>
+      <w:r>
+        <w:rPr>
+          <w:rFonts w:ascii="Arial" w:cs="Arial" w:eastAsia="Arial" w:hAnsi="Arial"/>
+          <w:b w:val="false"/>
+          <w:bCs w:val="false"/>
+          <w:sz w:val="21"/>
+          <w:szCs w:val="21"/>
+        </w:rPr>
+        <w:t xml:space="preserve">, perpendicular à esteira.</w:t>
+      </w:r>
+    </w:p>
+    <w:p>
+      <w:pPr>
+        <w:pStyle w:val="ListParagraph"/>
+        <w:numPr>
+          <w:ilvl w:val="0"/>
+          <w:numId w:val="2"/>
+        </w:numPr>
+        <w:spacing w:after="60" w:line="290"/>
+      </w:pPr>
+      <w:r>
+        <w:rPr>
+          <w:rFonts w:ascii="Arial" w:cs="Arial" w:eastAsia="Arial" w:hAnsi="Arial"/>
+          <w:b w:val="false"/>
+          <w:bCs w:val="false"/>
+          <w:sz w:val="21"/>
+          <w:szCs w:val="21"/>
+        </w:rPr>
+        <w:t xml:space="preserve">No corredor, olhando a partir da área de espera: </w:t>
+      </w:r>
+      <w:r>
+        <w:rPr>
+          <w:rFonts w:ascii="Arial" w:cs="Arial" w:eastAsia="Arial" w:hAnsi="Arial"/>
+          <w:b/>
+          <w:bCs/>
+          <w:sz w:val="21"/>
+          <w:szCs w:val="21"/>
+        </w:rPr>
+        <w:t xml:space="preserve">lado esquerdo</w:t>
+      </w:r>
+      <w:r>
+        <w:rPr>
+          <w:rFonts w:ascii="Arial" w:cs="Arial" w:eastAsia="Arial" w:hAnsi="Arial"/>
+          <w:b w:val="false"/>
+          <w:bCs w:val="false"/>
+          <w:sz w:val="21"/>
+          <w:szCs w:val="21"/>
+        </w:rPr>
+        <w:t xml:space="preserve"> com os prédios 020 (ou 022) a 031 ("210 a 310") e </w:t>
+      </w:r>
+      <w:r>
+        <w:rPr>
+          <w:rFonts w:ascii="Arial" w:cs="Arial" w:eastAsia="Arial" w:hAnsi="Arial"/>
+          <w:b/>
+          <w:bCs/>
+          <w:sz w:val="21"/>
+          <w:szCs w:val="21"/>
+        </w:rPr>
+        <w:t xml:space="preserve">lado direito</w:t>
+      </w:r>
+      <w:r>
+        <w:rPr>
+          <w:rFonts w:ascii="Arial" w:cs="Arial" w:eastAsia="Arial" w:hAnsi="Arial"/>
+          <w:b w:val="false"/>
+          <w:bCs w:val="false"/>
+          <w:sz w:val="21"/>
+          <w:szCs w:val="21"/>
+        </w:rPr>
+        <w:t xml:space="preserve"> do 032 até o último ("320 em diante"). A rota é em U: desce pelo lado esquerdo e volta pelo direito.</w:t>
+      </w:r>
+    </w:p>
+    <w:p>
+      <w:pPr>
+        <w:pStyle w:val="ListParagraph"/>
+        <w:numPr>
+          <w:ilvl w:val="0"/>
+          <w:numId w:val="2"/>
+        </w:numPr>
+        <w:spacing w:after="60" w:line="290"/>
+      </w:pPr>
+      <w:r>
+        <w:rPr>
+          <w:rFonts w:ascii="Arial" w:cs="Arial" w:eastAsia="Arial" w:hAnsi="Arial"/>
+          <w:b w:val="false"/>
+          <w:bCs w:val="false"/>
+          <w:sz w:val="21"/>
+          <w:szCs w:val="21"/>
+        </w:rPr>
+        <w:t xml:space="preserve">O </w:t>
+      </w:r>
+      <w:r>
+        <w:rPr>
+          <w:rFonts w:ascii="Arial" w:cs="Arial" w:eastAsia="Arial" w:hAnsi="Arial"/>
+          <w:b/>
+          <w:bCs/>
+          <w:sz w:val="21"/>
+          <w:szCs w:val="21"/>
+        </w:rPr>
+        <w:t xml:space="preserve">prédio 015</w:t>
+      </w:r>
+      <w:r>
+        <w:rPr>
+          <w:rFonts w:ascii="Arial" w:cs="Arial" w:eastAsia="Arial" w:hAnsi="Arial"/>
+          <w:b w:val="false"/>
+          <w:bCs w:val="false"/>
+          <w:sz w:val="21"/>
+          <w:szCs w:val="21"/>
+        </w:rPr>
+        <w:t xml:space="preserve"> ("150 a 153") fica na cabeceira do bloco à direita da entrada do corredor, de frente para o operador.</w:t>
+      </w:r>
+    </w:p>
+    <w:p>
+      <w:pPr>
+        <w:pStyle w:val="ListParagraph"/>
+        <w:numPr>
+          <w:ilvl w:val="0"/>
+          <w:numId w:val="2"/>
+        </w:numPr>
+        <w:spacing w:after="60" w:line="290"/>
+      </w:pPr>
+      <w:r>
+        <w:rPr>
+          <w:rFonts w:ascii="Arial" w:cs="Arial" w:eastAsia="Arial" w:hAnsi="Arial"/>
+          <w:b w:val="false"/>
+          <w:bCs w:val="false"/>
+          <w:sz w:val="21"/>
+          <w:szCs w:val="21"/>
+        </w:rPr>
+        <w:t xml:space="preserve">Os blocos do baixo giro são de costas: cada bloco tem um lado de uma estação e o outro lado da estação vizinha.</w:t>
+      </w:r>
+    </w:p>
+    <w:p>
+      <w:pPr>
+        <w:pStyle w:val="ListParagraph"/>
+        <w:numPr>
+          <w:ilvl w:val="0"/>
+          <w:numId w:val="2"/>
+        </w:numPr>
+        <w:spacing w:after="60" w:line="290"/>
+      </w:pPr>
+      <w:r>
+        <w:rPr>
+          <w:rFonts w:ascii="Arial" w:cs="Arial" w:eastAsia="Arial" w:hAnsi="Arial"/>
+          <w:b w:val="false"/>
+          <w:bCs w:val="false"/>
+          <w:sz w:val="21"/>
+          <w:szCs w:val="21"/>
+        </w:rPr>
+        <w:t xml:space="preserve"/>
+      </w:r>
+      <w:r>
+        <w:rPr>
+          <w:rFonts w:ascii="Arial" w:cs="Arial" w:eastAsia="Arial" w:hAnsi="Arial"/>
+          <w:b/>
+          <w:bCs/>
+          <w:sz w:val="21"/>
+          <w:szCs w:val="21"/>
+        </w:rPr>
+        <w:t xml:space="preserve">O andar 0 é o de cima.</w:t>
+      </w:r>
+      <w:r>
+        <w:rPr>
+          <w:rFonts w:ascii="Arial" w:cs="Arial" w:eastAsia="Arial" w:hAnsi="Arial"/>
+          <w:b w:val="false"/>
+          <w:bCs w:val="false"/>
+          <w:sz w:val="21"/>
+          <w:szCs w:val="21"/>
+        </w:rPr>
+        <w:t xml:space="preserve"> A altura de cada endereço depende de quantos endereços o prédio tem (prédio com 8 endereços = 8 níveis; com 2 endereços = 2 níveis com o dobro da altura). As bacias têm tamanho único.</w:t>
+      </w:r>
+    </w:p>
+    <w:p>
+      <w:pPr>
         <w:spacing w:after="60" w:before="120"/>
         <w:jc w:val="center"/>
       </w:pPr>
       <w:r>
         <w:drawing>
           <wp:inline distT="0" distB="0" distL="0" distR="0">
-            <wp:extent cx="6096000" cy="2686050"/>
+            <wp:extent cx="6096000" cy="3248025"/>
             <wp:effectExtent t="0" r="0" b="0" l="0"/>
             <wp:docPr id="1" name="" descr="" title=""/>
             <wp:cNvGraphicFramePr>
@@ -2821,7 +3108,7 @@
                   <pic:spPr bwMode="auto">
                     <a:xfrm>
                       <a:off x="0" y="0"/>
-                      <a:ext cx="6096000" cy="2686050"/>
+                      <a:ext cx="6096000" cy="3248025"/>
                     </a:xfrm>
                     <a:prstGeom prst="rect">
                       <a:avLst/>
@@ -2848,7 +3135,70 @@
           <w:sz w:val="18"/>
           <w:szCs w:val="18"/>
         </w:rPr>
-        <w:t xml:space="preserve">Figura 1 — Estação 05 com os 209 endereços reais: frente (alto giro) e fundo (baixo giro) com as 6 zonas</w:t>
+        <w:t xml:space="preserve">Figura 1 — Planta da estação 05 e das vizinhas, conforme o desenho da operação (sem escala)</w:t>
+      </w:r>
+    </w:p>
+    <w:p>
+      <w:pPr>
+        <w:spacing w:after="60" w:before="120"/>
+        <w:jc w:val="center"/>
+      </w:pPr>
+      <w:r>
+        <w:drawing>
+          <wp:inline distT="0" distB="0" distL="0" distR="0">
+            <wp:extent cx="6096000" cy="2028825"/>
+            <wp:effectExtent t="0" r="0" b="0" l="0"/>
+            <wp:docPr id="2" name="" descr="" title=""/>
+            <wp:cNvGraphicFramePr>
+              <a:graphicFrameLocks xmlns:a="http://schemas.openxmlformats.org/drawingml/2006/main" noChangeAspect="1"/>
+            </wp:cNvGraphicFramePr>
+            <a:graphic xmlns:a="http://schemas.openxmlformats.org/drawingml/2006/main">
+              <a:graphicData uri="http://schemas.openxmlformats.org/drawingml/2006/picture">
+                <pic:pic xmlns:pic="http://schemas.openxmlformats.org/drawingml/2006/picture">
+                  <pic:nvPicPr>
+                    <pic:cNvPr id="0" name="" descr=""/>
+                    <pic:cNvPicPr>
+                      <a:picLocks noChangeAspect="1" noChangeArrowheads="1"/>
+                    </pic:cNvPicPr>
+                  </pic:nvPicPr>
+                  <pic:blipFill>
+                    <a:blip r:embed="rId10" cstate="none"/>
+                    <a:srcRect/>
+                    <a:stretch>
+                      <a:fillRect/>
+                    </a:stretch>
+                  </pic:blipFill>
+                  <pic:spPr bwMode="auto">
+                    <a:xfrm>
+                      <a:off x="0" y="0"/>
+                      <a:ext cx="6096000" cy="2028825"/>
+                    </a:xfrm>
+                    <a:prstGeom prst="rect">
+                      <a:avLst/>
+                    </a:prstGeom>
+                  </pic:spPr>
+                </pic:pic>
+              </a:graphicData>
+            </a:graphic>
+          </wp:inline>
+        </w:drawing>
+      </w:r>
+    </w:p>
+    <w:p>
+      <w:pPr>
+        <w:spacing w:after="200"/>
+        <w:jc w:val="center"/>
+      </w:pPr>
+      <w:r>
+        <w:rPr>
+          <w:rFonts w:ascii="Arial" w:cs="Arial" w:eastAsia="Arial" w:hAnsi="Arial"/>
+          <w:i/>
+          <w:iCs/>
+          <w:color w:val="5B6675"/>
+          <w:sz w:val="18"/>
+          <w:szCs w:val="18"/>
+        </w:rPr>
+        <w:t xml:space="preserve">Figura 2 — Elevações da estação 05 com os 209 endereços reais (andar 0 em cima) e as 6 zonas do baixo giro</w:t>
       </w:r>
     </w:p>
     <w:p>
@@ -2860,7 +3210,7 @@
         <w:rPr>
           <w:rFonts w:ascii="Arial" w:cs="Arial" w:eastAsia="Arial" w:hAnsi="Arial"/>
         </w:rPr>
-        <w:t xml:space="preserve">3.2 Totais por tipo de estação</w:t>
+        <w:t xml:space="preserve">3.3 Totais por tipo de estação</w:t>
       </w:r>
     </w:p>
     <w:tbl>
@@ -4577,7 +4927,7 @@
         <w:rPr>
           <w:rFonts w:ascii="Arial" w:cs="Arial" w:eastAsia="Arial" w:hAnsi="Arial"/>
         </w:rPr>
-        <w:t xml:space="preserve">3.3 Zoneamento do baixo giro</w:t>
+        <w:t xml:space="preserve">3.4 Zoneamento do baixo giro</w:t>
       </w:r>
     </w:p>
     <w:p>
@@ -4612,7 +4962,7 @@
           <w:sz w:val="21"/>
           <w:szCs w:val="21"/>
         </w:rPr>
-        <w:t xml:space="preserve"> do fundo, com todas as zonas que têm itens trabalhando ao mesmo tempo. Cada zona mostra </w:t>
+        <w:t xml:space="preserve"> do baixo giro, com todas as zonas que têm itens trabalhando ao mesmo tempo. Cada zona mostra </w:t>
       </w:r>
       <w:r>
         <w:rPr>
@@ -4692,7 +5042,7 @@
           <w:sz w:val="21"/>
           <w:szCs w:val="21"/>
         </w:rPr>
-        <w:t xml:space="preserve"> no topo de cada prédio do fundo, que acende a coluna do item atual da zona (≈ R$ 1.000 para toda a operação).</w:t>
+        <w:t xml:space="preserve"> no topo de cada prédio do baixo giro, que acende a coluna do item atual da zona (≈ R$ 1.000 para toda a operação).</w:t>
       </w:r>
     </w:p>
     <w:p>
@@ -6095,7 +6445,7 @@
           <wp:inline distT="0" distB="0" distL="0" distR="0">
             <wp:extent cx="6096000" cy="3305175"/>
             <wp:effectExtent t="0" r="0" b="0" l="0"/>
-            <wp:docPr id="2" name="" descr="" title=""/>
+            <wp:docPr id="3" name="" descr="" title=""/>
             <wp:cNvGraphicFramePr>
               <a:graphicFrameLocks xmlns:a="http://schemas.openxmlformats.org/drawingml/2006/main" noChangeAspect="1"/>
             </wp:cNvGraphicFramePr>
@@ -6109,7 +6459,7 @@
                     </pic:cNvPicPr>
                   </pic:nvPicPr>
                   <pic:blipFill>
-                    <a:blip r:embed="rId10" cstate="none"/>
+                    <a:blip r:embed="rId11" cstate="none"/>
                     <a:srcRect/>
                     <a:stretch>
                       <a:fillRect/>
@@ -6145,7 +6495,7 @@
           <w:sz w:val="18"/>
           <w:szCs w:val="18"/>
         </w:rPr>
-        <w:t xml:space="preserve">Figura 2 — Visão geral da Arquitetura A</w:t>
+        <w:t xml:space="preserve">Figura 3 — Visão geral da Arquitetura A</w:t>
       </w:r>
     </w:p>
     <w:p>
@@ -7940,7 +8290,7 @@
           <wp:inline distT="0" distB="0" distL="0" distR="0">
             <wp:extent cx="6096000" cy="3571875"/>
             <wp:effectExtent t="0" r="0" b="0" l="0"/>
-            <wp:docPr id="3" name="" descr="" title=""/>
+            <wp:docPr id="4" name="" descr="" title=""/>
             <wp:cNvGraphicFramePr>
               <a:graphicFrameLocks xmlns:a="http://schemas.openxmlformats.org/drawingml/2006/main" noChangeAspect="1"/>
             </wp:cNvGraphicFramePr>
@@ -7954,7 +8304,7 @@
                     </pic:cNvPicPr>
                   </pic:nvPicPr>
                   <pic:blipFill>
-                    <a:blip r:embed="rId11" cstate="none"/>
+                    <a:blip r:embed="rId12" cstate="none"/>
                     <a:srcRect/>
                     <a:stretch>
                       <a:fillRect/>
@@ -7990,7 +8340,7 @@
           <w:sz w:val="18"/>
           <w:szCs w:val="18"/>
         </w:rPr>
-        <w:t xml:space="preserve">Figura 3 — Sequência de mensagens de uma caixa na estação</w:t>
+        <w:t xml:space="preserve">Figura 4 — Sequência de mensagens de uma caixa na estação</w:t>
       </w:r>
     </w:p>
     <w:p>
@@ -8010,7 +8360,7 @@
           <w:sz w:val="21"/>
           <w:szCs w:val="21"/>
         </w:rPr>
-        <w:t xml:space="preserve">A caixa chega à estação pela esteira (controle do sistema BHT).</w:t>
+        <w:t xml:space="preserve">A bacia chega pela esteira de transporte e entra na área de espera da estação pela transferência (controle do sistema BHT).</w:t>
       </w:r>
     </w:p>
     <w:p>
@@ -8170,7 +8520,7 @@
           <w:sz w:val="21"/>
           <w:szCs w:val="21"/>
         </w:rPr>
-        <w:t xml:space="preserve">, o Serviço PTL grava a sessão e (se validado) avisa o BHT, e a caixa segue.</w:t>
+        <w:t xml:space="preserve">, o Serviço PTL grava a sessão e (se validado) avisa o BHT, e o operador empurra a bacia para a transferência de saída, que a devolve à esteira de transporte.</w:t>
       </w:r>
     </w:p>
     <w:p>
@@ -8250,7 +8600,7 @@
           <wp:inline distT="0" distB="0" distL="0" distR="0">
             <wp:extent cx="6096000" cy="3305175"/>
             <wp:effectExtent t="0" r="0" b="0" l="0"/>
-            <wp:docPr id="4" name="" descr="" title=""/>
+            <wp:docPr id="5" name="" descr="" title=""/>
             <wp:cNvGraphicFramePr>
               <a:graphicFrameLocks xmlns:a="http://schemas.openxmlformats.org/drawingml/2006/main" noChangeAspect="1"/>
             </wp:cNvGraphicFramePr>
@@ -8264,7 +8614,7 @@
                     </pic:cNvPicPr>
                   </pic:nvPicPr>
                   <pic:blipFill>
-                    <a:blip r:embed="rId12" cstate="none"/>
+                    <a:blip r:embed="rId13" cstate="none"/>
                     <a:srcRect/>
                     <a:stretch>
                       <a:fillRect/>
@@ -8300,7 +8650,7 @@
           <w:sz w:val="18"/>
           <w:szCs w:val="18"/>
         </w:rPr>
-        <w:t xml:space="preserve">Figura 4 — Visão geral da Arquitetura B</w:t>
+        <w:t xml:space="preserve">Figura 5 — Visão geral da Arquitetura B</w:t>
       </w:r>
     </w:p>
     <w:p>
@@ -8669,7 +9019,7 @@
                 <w:sz w:val="17"/>
                 <w:szCs w:val="17"/>
               </w:rPr>
-              <w:t xml:space="preserve">Leitor NFC sob a posição onde a caixa para, ligado ao concentrador. Painel LCD mostra caixa e itens restantes; fechar com nova leitura ou botão FECHAR.</w:t>
+              <w:t xml:space="preserve">Leitor NFC sob a posição de pega da área de espera, ligado ao concentrador. Painel LCD mostra caixa e itens restantes; fechar com nova leitura ou botão FECHAR.</w:t>
             </w:r>
           </w:p>
         </w:tc>
@@ -11646,7 +11996,7 @@
           <wp:inline distT="0" distB="0" distL="0" distR="0">
             <wp:extent cx="6096000" cy="2876550"/>
             <wp:effectExtent t="0" r="0" b="0" l="0"/>
-            <wp:docPr id="5" name="" descr="" title=""/>
+            <wp:docPr id="6" name="" descr="" title=""/>
             <wp:cNvGraphicFramePr>
               <a:graphicFrameLocks xmlns:a="http://schemas.openxmlformats.org/drawingml/2006/main" noChangeAspect="1"/>
             </wp:cNvGraphicFramePr>
@@ -11660,7 +12010,7 @@
                     </pic:cNvPicPr>
                   </pic:nvPicPr>
                   <pic:blipFill>
-                    <a:blip r:embed="rId13" cstate="none"/>
+                    <a:blip r:embed="rId14" cstate="none"/>
                     <a:srcRect/>
                     <a:stretch>
                       <a:fillRect/>
@@ -11696,7 +12046,7 @@
           <w:sz w:val="18"/>
           <w:szCs w:val="18"/>
         </w:rPr>
-        <w:t xml:space="preserve">Figura 5 — Telas do app PTL: espera, separação, conclusão e alerta</w:t>
+        <w:t xml:space="preserve">Figura 6 — Telas do app PTL: espera, separação, conclusão e alerta</w:t>
       </w:r>
     </w:p>
     <w:p>
@@ -11721,7 +12071,7 @@
           <wp:inline distT="0" distB="0" distL="0" distR="0">
             <wp:extent cx="6096000" cy="2047875"/>
             <wp:effectExtent t="0" r="0" b="0" l="0"/>
-            <wp:docPr id="6" name="" descr="" title=""/>
+            <wp:docPr id="7" name="" descr="" title=""/>
             <wp:cNvGraphicFramePr>
               <a:graphicFrameLocks xmlns:a="http://schemas.openxmlformats.org/drawingml/2006/main" noChangeAspect="1"/>
             </wp:cNvGraphicFramePr>
@@ -11735,7 +12085,7 @@
                     </pic:cNvPicPr>
                   </pic:nvPicPr>
                   <pic:blipFill>
-                    <a:blip r:embed="rId14" cstate="none"/>
+                    <a:blip r:embed="rId15" cstate="none"/>
                     <a:srcRect/>
                     <a:stretch>
                       <a:fillRect/>
@@ -11771,7 +12121,7 @@
           <w:sz w:val="18"/>
           <w:szCs w:val="18"/>
         </w:rPr>
-        <w:t xml:space="preserve">Figura 6 — Módulo Q, Módulo E+Q e gabinete do concentrador</w:t>
+        <w:t xml:space="preserve">Figura 7 — Módulo Q, Módulo E+Q e gabinete do concentrador</w:t>
       </w:r>
     </w:p>
     <w:p>
@@ -12857,7 +13207,7 @@
           <w:sz w:val="21"/>
           <w:szCs w:val="21"/>
         </w:rPr>
-        <w:t xml:space="preserve">Dois barramentos por estação (frente e fundo), 38.400 bps, protocolo mestre-escravo com endereço de 1 byte por dispositivo (dip switch ou gravado na instalação).</w:t>
+        <w:t xml:space="preserve">Dois barramentos por estação (alto giro e baixo giro), 38.400 bps, protocolo mestre-escravo com endereço de 1 byte por dispositivo (dip switch ou gravado na instalação).</w:t>
       </w:r>
     </w:p>
     <w:p>
@@ -14431,7 +14781,7 @@
           <wp:inline distT="0" distB="0" distL="0" distR="0">
             <wp:extent cx="6096000" cy="2609850"/>
             <wp:effectExtent t="0" r="0" b="0" l="0"/>
-            <wp:docPr id="7" name="" descr="" title=""/>
+            <wp:docPr id="8" name="" descr="" title=""/>
             <wp:cNvGraphicFramePr>
               <a:graphicFrameLocks xmlns:a="http://schemas.openxmlformats.org/drawingml/2006/main" noChangeAspect="1"/>
             </wp:cNvGraphicFramePr>
@@ -14445,7 +14795,7 @@
                     </pic:cNvPicPr>
                   </pic:nvPicPr>
                   <pic:blipFill>
-                    <a:blip r:embed="rId15" cstate="none"/>
+                    <a:blip r:embed="rId16" cstate="none"/>
                     <a:srcRect/>
                     <a:stretch>
                       <a:fillRect/>
@@ -14481,7 +14831,7 @@
           <w:sz w:val="18"/>
           <w:szCs w:val="18"/>
         </w:rPr>
-        <w:t xml:space="preserve">Figura 7 — Topologia de cabeamento: barramento da frente com nós de coluna e do fundo com módulos em cadeia</w:t>
+        <w:t xml:space="preserve">Figura 8 — Topologia de cabeamento: barramento do alto giro com nós de coluna e do baixo giro com módulos em cadeia (eletrocalha sobre o corredor)</w:t>
       </w:r>
     </w:p>
     <w:p>
@@ -33206,7 +33556,139 @@
                 <w:sz w:val="18"/>
                 <w:szCs w:val="18"/>
               </w:rPr>
-              <w:t xml:space="preserve">Endereços com muita / pouca saída. Alto giro na frente (prédios 1-10), baixo giro no fundo.</w:t>
+              <w:t xml:space="preserve">Endereços com muita / pouca saída. Alto giro ao longo da esteira de transporte (prédios 001-010); baixo giro no corredor perpendicular.</w:t>
+            </w:r>
+          </w:p>
+        </w:tc>
+      </w:tr>
+      <w:tr>
+        <w:tc>
+          <w:tcPr>
+            <w:tcW w:type="dxa" w:w="2478"/>
+            <w:tcBorders>
+              <w:top w:val="single" w:color="BFC7D2" w:sz="4"/>
+              <w:left w:val="single" w:color="BFC7D2" w:sz="4"/>
+              <w:bottom w:val="single" w:color="BFC7D2" w:sz="4"/>
+              <w:right w:val="single" w:color="BFC7D2" w:sz="4"/>
+            </w:tcBorders>
+            <w:tcMar>
+              <w:top w:type="dxa" w:w="60"/>
+              <w:left w:type="dxa" w:w="100"/>
+              <w:bottom w:type="dxa" w:w="60"/>
+              <w:right w:type="dxa" w:w="100"/>
+            </w:tcMar>
+            <w:vAlign w:val="center"/>
+          </w:tcPr>
+          <w:p>
+            <w:pPr>
+              <w:jc w:val="left"/>
+            </w:pPr>
+            <w:r>
+              <w:rPr>
+                <w:rFonts w:ascii="Arial" w:cs="Arial" w:eastAsia="Arial" w:hAnsi="Arial"/>
+                <w:color w:val="1C2430"/>
+                <w:sz w:val="18"/>
+                <w:szCs w:val="18"/>
+              </w:rPr>
+              <w:t xml:space="preserve">Andar</w:t>
+            </w:r>
+          </w:p>
+        </w:tc>
+        <w:tc>
+          <w:tcPr>
+            <w:tcW w:type="dxa" w:w="7160"/>
+            <w:tcBorders>
+              <w:top w:val="single" w:color="BFC7D2" w:sz="4"/>
+              <w:left w:val="single" w:color="BFC7D2" w:sz="4"/>
+              <w:bottom w:val="single" w:color="BFC7D2" w:sz="4"/>
+              <w:right w:val="single" w:color="BFC7D2" w:sz="4"/>
+            </w:tcBorders>
+            <w:tcMar>
+              <w:top w:type="dxa" w:w="60"/>
+              <w:left w:type="dxa" w:w="100"/>
+              <w:bottom w:type="dxa" w:w="60"/>
+              <w:right w:type="dxa" w:w="100"/>
+            </w:tcMar>
+            <w:vAlign w:val="center"/>
+          </w:tcPr>
+          <w:p>
+            <w:pPr>
+              <w:jc w:val="left"/>
+            </w:pPr>
+            <w:r>
+              <w:rPr>
+                <w:rFonts w:ascii="Arial" w:cs="Arial" w:eastAsia="Arial" w:hAnsi="Arial"/>
+                <w:color w:val="1C2430"/>
+                <w:sz w:val="18"/>
+                <w:szCs w:val="18"/>
+              </w:rPr>
+              <w:t xml:space="preserve">Nível do prédio; o andar 0 é o de cima.</w:t>
+            </w:r>
+          </w:p>
+        </w:tc>
+      </w:tr>
+      <w:tr>
+        <w:tc>
+          <w:tcPr>
+            <w:tcW w:type="dxa" w:w="2478"/>
+            <w:tcBorders>
+              <w:top w:val="single" w:color="BFC7D2" w:sz="4"/>
+              <w:left w:val="single" w:color="BFC7D2" w:sz="4"/>
+              <w:bottom w:val="single" w:color="BFC7D2" w:sz="4"/>
+              <w:right w:val="single" w:color="BFC7D2" w:sz="4"/>
+            </w:tcBorders>
+            <w:tcMar>
+              <w:top w:type="dxa" w:w="60"/>
+              <w:left w:type="dxa" w:w="100"/>
+              <w:bottom w:type="dxa" w:w="60"/>
+              <w:right w:type="dxa" w:w="100"/>
+            </w:tcMar>
+            <w:vAlign w:val="center"/>
+          </w:tcPr>
+          <w:p>
+            <w:pPr>
+              <w:jc w:val="left"/>
+            </w:pPr>
+            <w:r>
+              <w:rPr>
+                <w:rFonts w:ascii="Arial" w:cs="Arial" w:eastAsia="Arial" w:hAnsi="Arial"/>
+                <w:color w:val="1C2430"/>
+                <w:sz w:val="18"/>
+                <w:szCs w:val="18"/>
+              </w:rPr>
+              <w:t xml:space="preserve">Área de espera</w:t>
+            </w:r>
+          </w:p>
+        </w:tc>
+        <w:tc>
+          <w:tcPr>
+            <w:tcW w:type="dxa" w:w="7160"/>
+            <w:tcBorders>
+              <w:top w:val="single" w:color="BFC7D2" w:sz="4"/>
+              <w:left w:val="single" w:color="BFC7D2" w:sz="4"/>
+              <w:bottom w:val="single" w:color="BFC7D2" w:sz="4"/>
+              <w:right w:val="single" w:color="BFC7D2" w:sz="4"/>
+            </w:tcBorders>
+            <w:tcMar>
+              <w:top w:type="dxa" w:w="60"/>
+              <w:left w:type="dxa" w:w="100"/>
+              <w:bottom w:type="dxa" w:w="60"/>
+              <w:right w:type="dxa" w:w="100"/>
+            </w:tcMar>
+            <w:vAlign w:val="center"/>
+          </w:tcPr>
+          <w:p>
+            <w:pPr>
+              <w:jc w:val="left"/>
+            </w:pPr>
+            <w:r>
+              <w:rPr>
+                <w:rFonts w:ascii="Arial" w:cs="Arial" w:eastAsia="Arial" w:hAnsi="Arial"/>
+                <w:color w:val="1C2430"/>
+                <w:sz w:val="18"/>
+                <w:szCs w:val="18"/>
+              </w:rPr>
+              <w:t xml:space="preserve">Trecho em frente ao alto giro onde as bacias aguardam a separação.</w:t>
             </w:r>
           </w:p>
         </w:tc>

</xml_diff>

<commit_message>
Layout pelas fotos: esteiras lado a lado, transferência a cada 4 estações, alto giro atrás do operador
- transferência com rolete direcionador (2 estações à esquerda, 2 à direita; ponta 3/26)
- bacia volta à esteira de transporte de qualquer ponto da estação
- prateleiras alinhadas, caixa do endereço pelo tipo; 015 abre o lado direito do corredor
- 4 displays E+Q nos andares 4-5 (orçamento, documento e apresentação atualizados)
- bacia verde e operador com uniforme verde, calça e sapato pretos

Co-Authored-By: Claude Opus 5.5 <noreply@anthropic.com>
Claude-Session: https://claude.ai/code/session_01TBWA3G7ku1j3oTf4VMkLud
</commit_message>
<xml_diff>
--- a/projeto/entregaveis/Arquitetura_PTL_Documento_Tecnico.docx
+++ b/projeto/entregaveis/Arquitetura_PTL_Documento_Tecnico.docx
@@ -2131,7 +2131,7 @@
                 <w:sz w:val="18"/>
                 <w:szCs w:val="18"/>
               </w:rPr>
-              <w:t xml:space="preserve">Alto giro (ao longo da esteira de transporte)</w:t>
+              <w:t xml:space="preserve">Alto giro (atrás do operador, de frente para as esteiras)</w:t>
             </w:r>
           </w:p>
         </w:tc>
@@ -2357,7 +2357,7 @@
                 <w:sz w:val="18"/>
                 <w:szCs w:val="18"/>
               </w:rPr>
-              <w:t xml:space="preserve">2 blocos por estação (esquerdo: prédios 1-5; direito: 6-10), cada um com 1 display de endereço + quantidade</w:t>
+              <w:t xml:space="preserve">4 displays de endereço + quantidade por estação: um por andar (A4 e A5) em cada lado (prédios 001-005 e 006-010), como no sistema atual</w:t>
             </w:r>
           </w:p>
         </w:tc>
@@ -2391,7 +2391,7 @@
                 <w:sz w:val="18"/>
                 <w:szCs w:val="18"/>
               </w:rPr>
-              <w:t xml:space="preserve">Cabeceira do corredor ("150-153")</w:t>
+              <w:t xml:space="preserve">Início do lado direito do corredor ("150-153")</w:t>
             </w:r>
           </w:p>
         </w:tc>
@@ -2832,7 +2832,27 @@
           <w:sz w:val="21"/>
           <w:szCs w:val="21"/>
         </w:rPr>
-        <w:t xml:space="preserve"> passa atrás do </w:t>
+        <w:t xml:space="preserve"> e a </w:t>
+      </w:r>
+      <w:r>
+        <w:rPr>
+          <w:rFonts w:ascii="Arial" w:cs="Arial" w:eastAsia="Arial" w:hAnsi="Arial"/>
+          <w:b/>
+          <w:bCs/>
+          <w:sz w:val="21"/>
+          <w:szCs w:val="21"/>
+        </w:rPr>
+        <w:t xml:space="preserve">esteira de separação</w:t>
+      </w:r>
+      <w:r>
+        <w:rPr>
+          <w:rFonts w:ascii="Arial" w:cs="Arial" w:eastAsia="Arial" w:hAnsi="Arial"/>
+          <w:b w:val="false"/>
+          <w:bCs w:val="false"/>
+          <w:sz w:val="21"/>
+          <w:szCs w:val="21"/>
+        </w:rPr>
+        <w:t xml:space="preserve"> correm lado a lado, com cerca de 20 cm entre elas. O operador fica entre a esteira de separação e o </w:t>
       </w:r>
       <w:r>
         <w:rPr>
@@ -2852,47 +2872,7 @@
           <w:sz w:val="21"/>
           <w:szCs w:val="21"/>
         </w:rPr>
-        <w:t xml:space="preserve"> de todas as estações. Entre uma estação e outra há um vão com duas </w:t>
-      </w:r>
-      <w:r>
-        <w:rPr>
-          <w:rFonts w:ascii="Arial" w:cs="Arial" w:eastAsia="Arial" w:hAnsi="Arial"/>
-          <w:b/>
-          <w:bCs/>
-          <w:sz w:val="21"/>
-          <w:szCs w:val="21"/>
-        </w:rPr>
-        <w:t xml:space="preserve">transferências</w:t>
-      </w:r>
-      <w:r>
-        <w:rPr>
-          <w:rFonts w:ascii="Arial" w:cs="Arial" w:eastAsia="Arial" w:hAnsi="Arial"/>
-          <w:b w:val="false"/>
-          <w:bCs w:val="false"/>
-          <w:sz w:val="21"/>
-          <w:szCs w:val="21"/>
-        </w:rPr>
-        <w:t xml:space="preserve">: a da direita traz a bacia da esteira para a </w:t>
-      </w:r>
-      <w:r>
-        <w:rPr>
-          <w:rFonts w:ascii="Arial" w:cs="Arial" w:eastAsia="Arial" w:hAnsi="Arial"/>
-          <w:b/>
-          <w:bCs/>
-          <w:sz w:val="21"/>
-          <w:szCs w:val="21"/>
-        </w:rPr>
-        <w:t xml:space="preserve">área de espera</w:t>
-      </w:r>
-      <w:r>
-        <w:rPr>
-          <w:rFonts w:ascii="Arial" w:cs="Arial" w:eastAsia="Arial" w:hAnsi="Arial"/>
-          <w:b w:val="false"/>
-          <w:bCs w:val="false"/>
-          <w:sz w:val="21"/>
-          <w:szCs w:val="21"/>
-        </w:rPr>
-        <w:t xml:space="preserve"> da estação seguinte; a da esquerda devolve a bacia separada para a esteira. A área de espera fica em frente ao alto giro, e o operador trabalha entre ela e a entrada do </w:t>
+        <w:t xml:space="preserve">, que fica atrás dele, de frente para as esteiras; no meio do alto giro há a passagem para o </w:t>
       </w:r>
       <w:r>
         <w:rPr>
@@ -2912,7 +2892,147 @@
           <w:sz w:val="21"/>
           <w:szCs w:val="21"/>
         </w:rPr>
-        <w:t xml:space="preserve">, perpendicular à esteira.</w:t>
+        <w:t xml:space="preserve">, perpendicular às esteiras. As prateleiras são alinhadas (mesmos níveis em toda a estante).</w:t>
+      </w:r>
+    </w:p>
+    <w:p>
+      <w:pPr>
+        <w:pStyle w:val="ListParagraph"/>
+        <w:numPr>
+          <w:ilvl w:val="0"/>
+          <w:numId w:val="2"/>
+        </w:numPr>
+        <w:spacing w:after="60" w:line="290"/>
+      </w:pPr>
+      <w:r>
+        <w:rPr>
+          <w:rFonts w:ascii="Arial" w:cs="Arial" w:eastAsia="Arial" w:hAnsi="Arial"/>
+          <w:b w:val="false"/>
+          <w:bCs w:val="false"/>
+          <w:sz w:val="21"/>
+          <w:szCs w:val="21"/>
+        </w:rPr>
+        <w:t xml:space="preserve"/>
+      </w:r>
+      <w:r>
+        <w:rPr>
+          <w:rFonts w:ascii="Arial" w:cs="Arial" w:eastAsia="Arial" w:hAnsi="Arial"/>
+          <w:b/>
+          <w:bCs/>
+          <w:sz w:val="21"/>
+          <w:szCs w:val="21"/>
+        </w:rPr>
+        <w:t xml:space="preserve">Transferência:</w:t>
+      </w:r>
+      <w:r>
+        <w:rPr>
+          <w:rFonts w:ascii="Arial" w:cs="Arial" w:eastAsia="Arial" w:hAnsi="Arial"/>
+          <w:b w:val="false"/>
+          <w:bCs w:val="false"/>
+          <w:sz w:val="21"/>
+          <w:szCs w:val="21"/>
+        </w:rPr>
+        <w:t xml:space="preserve"> cada transferência alimenta até 4 estações. A bacia passa da esteira de transporte para a de separação e, na zona de espera, um </w:t>
+      </w:r>
+      <w:r>
+        <w:rPr>
+          <w:rFonts w:ascii="Arial" w:cs="Arial" w:eastAsia="Arial" w:hAnsi="Arial"/>
+          <w:b/>
+          <w:bCs/>
+          <w:sz w:val="21"/>
+          <w:szCs w:val="21"/>
+        </w:rPr>
+        <w:t xml:space="preserve">rolete direcionador</w:t>
+      </w:r>
+      <w:r>
+        <w:rPr>
+          <w:rFonts w:ascii="Arial" w:cs="Arial" w:eastAsia="Arial" w:hAnsi="Arial"/>
+          <w:b w:val="false"/>
+          <w:bCs w:val="false"/>
+          <w:sz w:val="21"/>
+          <w:szCs w:val="21"/>
+        </w:rPr>
+        <w:t xml:space="preserve"> manda a bacia para a esquerda (2 estações) ou para a direita (2 estações). Ex.: transferência entre 11 e 12 atende 10 e 11 (esquerda) e 12 e 13 (direita). Nas pontas, a transferência entre 3 e 4 atende 3 (esquerda) ou 4 e 5 (direita); na Perfumaria, entre 26 e 27 atende 26 ou 27 e 28.</w:t>
+      </w:r>
+    </w:p>
+    <w:p>
+      <w:pPr>
+        <w:pStyle w:val="ListParagraph"/>
+        <w:numPr>
+          <w:ilvl w:val="0"/>
+          <w:numId w:val="2"/>
+        </w:numPr>
+        <w:spacing w:after="60" w:line="290"/>
+      </w:pPr>
+      <w:r>
+        <w:rPr>
+          <w:rFonts w:ascii="Arial" w:cs="Arial" w:eastAsia="Arial" w:hAnsi="Arial"/>
+          <w:b w:val="false"/>
+          <w:bCs w:val="false"/>
+          <w:sz w:val="21"/>
+          <w:szCs w:val="21"/>
+        </w:rPr>
+        <w:t xml:space="preserve"/>
+      </w:r>
+      <w:r>
+        <w:rPr>
+          <w:rFonts w:ascii="Arial" w:cs="Arial" w:eastAsia="Arial" w:hAnsi="Arial"/>
+          <w:b/>
+          <w:bCs/>
+          <w:sz w:val="21"/>
+          <w:szCs w:val="21"/>
+        </w:rPr>
+        <w:t xml:space="preserve">Pedido:</w:t>
+      </w:r>
+      <w:r>
+        <w:rPr>
+          <w:rFonts w:ascii="Arial" w:cs="Arial" w:eastAsia="Arial" w:hAnsi="Arial"/>
+          <w:b w:val="false"/>
+          <w:bCs w:val="false"/>
+          <w:sz w:val="21"/>
+          <w:szCs w:val="21"/>
+        </w:rPr>
+        <w:t xml:space="preserve"> a bacia só entra nas estações em que o pedido tem itens. Se o pedido começa na 3 e continua só na 7, depois da 3 a bacia volta à esteira de transporte e não entra na 4 nem na 5.</w:t>
+      </w:r>
+    </w:p>
+    <w:p>
+      <w:pPr>
+        <w:pStyle w:val="ListParagraph"/>
+        <w:numPr>
+          <w:ilvl w:val="0"/>
+          <w:numId w:val="2"/>
+        </w:numPr>
+        <w:spacing w:after="60" w:line="290"/>
+      </w:pPr>
+      <w:r>
+        <w:rPr>
+          <w:rFonts w:ascii="Arial" w:cs="Arial" w:eastAsia="Arial" w:hAnsi="Arial"/>
+          <w:b w:val="false"/>
+          <w:bCs w:val="false"/>
+          <w:sz w:val="21"/>
+          <w:szCs w:val="21"/>
+        </w:rPr>
+        <w:t xml:space="preserve"/>
+      </w:r>
+      <w:r>
+        <w:rPr>
+          <w:rFonts w:ascii="Arial" w:cs="Arial" w:eastAsia="Arial" w:hAnsi="Arial"/>
+          <w:b/>
+          <w:bCs/>
+          <w:sz w:val="21"/>
+          <w:szCs w:val="21"/>
+        </w:rPr>
+        <w:t xml:space="preserve">Saída:</w:t>
+      </w:r>
+      <w:r>
+        <w:rPr>
+          <w:rFonts w:ascii="Arial" w:cs="Arial" w:eastAsia="Arial" w:hAnsi="Arial"/>
+          <w:b w:val="false"/>
+          <w:bCs w:val="false"/>
+          <w:sz w:val="21"/>
+          <w:szCs w:val="21"/>
+        </w:rPr>
+        <w:t xml:space="preserve"> terminada a separação, o operador empurra a bacia de volta para a esteira de transporte a partir de qualquer ponto da estação.</w:t>
       </w:r>
     </w:p>
     <w:p>
@@ -3012,7 +3132,7 @@
           <w:sz w:val="21"/>
           <w:szCs w:val="21"/>
         </w:rPr>
-        <w:t xml:space="preserve"> ("150 a 153") fica na cabeceira do bloco à direita da entrada do corredor, de frente para o operador.</w:t>
+        <w:t xml:space="preserve"> ("150 a 153") é o primeiro prédio do lado direito, logo na entrada do corredor.</w:t>
       </w:r>
     </w:p>
     <w:p>
@@ -3072,7 +3192,7 @@
           <w:sz w:val="21"/>
           <w:szCs w:val="21"/>
         </w:rPr>
-        <w:t xml:space="preserve"> A altura de cada endereço depende de quantos endereços o prédio tem (prédio com 8 endereços = 8 níveis; com 2 endereços = 2 níveis com o dobro da altura). As bacias têm tamanho único.</w:t>
+        <w:t xml:space="preserve"> As prateleiras são alinhadas; o que muda de tamanho é a caixa do endereço, conforme o tipo (A, B, C, F, N). Andar que o prédio não usa fica vazio. As bacias que percorrem as esteiras têm tamanho único.</w:t>
       </w:r>
     </w:p>
     <w:p>
@@ -3083,7 +3203,7 @@
       <w:r>
         <w:drawing>
           <wp:inline distT="0" distB="0" distL="0" distR="0">
-            <wp:extent cx="6096000" cy="3248025"/>
+            <wp:extent cx="6096000" cy="3086100"/>
             <wp:effectExtent t="0" r="0" b="0" l="0"/>
             <wp:docPr id="1" name="" descr="" title=""/>
             <wp:cNvGraphicFramePr>
@@ -3108,7 +3228,7 @@
                   <pic:spPr bwMode="auto">
                     <a:xfrm>
                       <a:off x="0" y="0"/>
-                      <a:ext cx="6096000" cy="3248025"/>
+                      <a:ext cx="6096000" cy="3086100"/>
                     </a:xfrm>
                     <a:prstGeom prst="rect">
                       <a:avLst/>
@@ -3135,7 +3255,7 @@
           <w:sz w:val="18"/>
           <w:szCs w:val="18"/>
         </w:rPr>
-        <w:t xml:space="preserve">Figura 1 — Planta da estação 05 e das vizinhas, conforme o desenho da operação (sem escala)</w:t>
+        <w:t xml:space="preserve">Figura 1 — Planta da estação 05 e das vizinhas: esteiras, transferência, alto giro e corredor do baixo giro (sem escala)</w:t>
       </w:r>
     </w:p>
     <w:p>
@@ -3146,7 +3266,7 @@
       <w:r>
         <w:drawing>
           <wp:inline distT="0" distB="0" distL="0" distR="0">
-            <wp:extent cx="6096000" cy="2028825"/>
+            <wp:extent cx="6096000" cy="2190750"/>
             <wp:effectExtent t="0" r="0" b="0" l="0"/>
             <wp:docPr id="2" name="" descr="" title=""/>
             <wp:cNvGraphicFramePr>
@@ -3171,7 +3291,7 @@
                   <pic:spPr bwMode="auto">
                     <a:xfrm>
                       <a:off x="0" y="0"/>
-                      <a:ext cx="6096000" cy="2028825"/>
+                      <a:ext cx="6096000" cy="2190750"/>
                     </a:xfrm>
                     <a:prstGeom prst="rect">
                       <a:avLst/>
@@ -5381,7 +5501,7 @@
                 <w:sz w:val="18"/>
                 <w:szCs w:val="18"/>
               </w:rPr>
-              <w:t xml:space="preserve">Nos blocos 4-5 e nas zonas de baixo giro, mostrar endereço e quantidade de um item por vez, na ordem da rota.</w:t>
+              <w:t xml:space="preserve">Nos andares 4-5 do alto giro e nas zonas de baixo giro, mostrar endereço e quantidade de um item por vez, na ordem da rota.</w:t>
             </w:r>
           </w:p>
         </w:tc>
@@ -7482,7 +7602,7 @@
                 <w:sz w:val="17"/>
                 <w:szCs w:val="17"/>
               </w:rPr>
-              <w:t xml:space="preserve">Endereço (8 dígitos) + quantidade (3 dígitos) + botão; blocos 4-5 e zonas de baixo giro.</w:t>
+              <w:t xml:space="preserve">Endereço (8 dígitos) + quantidade (3 dígitos) + botão; andares 4-5 do alto giro (4 por estação) e zonas de baixo giro.</w:t>
             </w:r>
           </w:p>
         </w:tc>
@@ -8360,7 +8480,7 @@
           <w:sz w:val="21"/>
           <w:szCs w:val="21"/>
         </w:rPr>
-        <w:t xml:space="preserve">A bacia chega pela esteira de transporte e entra na área de espera da estação pela transferência (controle do sistema BHT).</w:t>
+        <w:t xml:space="preserve">A bacia vem pela esteira de transporte, passa pela transferência para a esteira de separação e o rolete direcionador a leva até a estação (controle do sistema BHT).</w:t>
       </w:r>
     </w:p>
     <w:p>
@@ -8420,7 +8540,7 @@
           <w:sz w:val="21"/>
           <w:szCs w:val="21"/>
         </w:rPr>
-        <w:t xml:space="preserve">O Serviço PTL busca os itens da caixa (Sybase/API), filtra os endereços daquela estação, separa em alto giro, blocos 4-5 e zonas, e ordena pela rota.</w:t>
+        <w:t xml:space="preserve">O Serviço PTL busca os itens da caixa (Sybase/API), filtra os endereços daquela estação, separa em alto giro, andares 4-5 e zonas, e ordena pela rota.</w:t>
       </w:r>
     </w:p>
     <w:p>
@@ -8440,7 +8560,7 @@
           <w:sz w:val="21"/>
           <w:szCs w:val="21"/>
         </w:rPr>
-        <w:t xml:space="preserve">O concentrador acende todos os displays de alto giro com a quantidade e o primeiro item de cada bloco/zona.</w:t>
+        <w:t xml:space="preserve">O concentrador acende todos os displays de alto giro com a quantidade e o primeiro item de cada display E+Q (andares 4-5 e zonas).</w:t>
       </w:r>
     </w:p>
     <w:p>
@@ -8460,7 +8580,7 @@
           <w:sz w:val="21"/>
           <w:szCs w:val="21"/>
         </w:rPr>
-        <w:t xml:space="preserve">O operador pega a quantidade e aperta o botão; o display apaga (alto giro) ou passa ao próximo item (bloco/zona). O coletor mostra o progresso.</w:t>
+        <w:t xml:space="preserve">O operador pega a quantidade e aperta o botão; o display apaga (alto giro) ou passa ao próximo item (andares 4-5 e zonas). O coletor mostra o progresso.</w:t>
       </w:r>
     </w:p>
     <w:p>
@@ -8520,7 +8640,7 @@
           <w:sz w:val="21"/>
           <w:szCs w:val="21"/>
         </w:rPr>
-        <w:t xml:space="preserve">, o Serviço PTL grava a sessão e (se validado) avisa o BHT, e o operador empurra a bacia para a transferência de saída, que a devolve à esteira de transporte.</w:t>
+        <w:t xml:space="preserve">, o Serviço PTL grava a sessão e (se validado) avisa o BHT, e o operador empurra a bacia de volta para a esteira de transporte.</w:t>
       </w:r>
     </w:p>
     <w:p>
@@ -9019,7 +9139,7 @@
                 <w:sz w:val="17"/>
                 <w:szCs w:val="17"/>
               </w:rPr>
-              <w:t xml:space="preserve">Leitor NFC sob a posição de pega da área de espera, ligado ao concentrador. Painel LCD mostra caixa e itens restantes; fechar com nova leitura ou botão FECHAR.</w:t>
+              <w:t xml:space="preserve">Leitor NFC sob a posição de pega na esteira de separação, ligado ao concentrador. Painel LCD mostra caixa e itens restantes; fechar com nova leitura ou botão FECHAR.</w:t>
             </w:r>
           </w:p>
         </w:tc>
@@ -9818,7 +9938,7 @@
                 <w:sz w:val="18"/>
                 <w:szCs w:val="18"/>
               </w:rPr>
-              <w:t xml:space="preserve">R$ 255 mil</w:t>
+              <w:t xml:space="preserve">R$ 270 mil</w:t>
             </w:r>
           </w:p>
         </w:tc>
@@ -9850,7 +9970,7 @@
                 <w:sz w:val="18"/>
                 <w:szCs w:val="18"/>
               </w:rPr>
-              <w:t xml:space="preserve">R$ 278 mil</w:t>
+              <w:t xml:space="preserve">R$ 293 mil</w:t>
             </w:r>
           </w:p>
         </w:tc>
@@ -10999,7 +11119,7 @@
           <w:sz w:val="21"/>
           <w:szCs w:val="21"/>
         </w:rPr>
-        <w:t xml:space="preserve">Blocos 4-5 e zonas de baixo giro:</w:t>
+        <w:t xml:space="preserve">Andares 4-5 e zonas de baixo giro:</w:t>
       </w:r>
       <w:r>
         <w:rPr>
@@ -11009,7 +11129,7 @@
           <w:sz w:val="21"/>
           <w:szCs w:val="21"/>
         </w:rPr>
-        <w:t xml:space="preserve"> um item por vez por bloco/zona; todos os blocos e zonas com itens ficam ativos ao mesmo tempo.</w:t>
+        <w:t xml:space="preserve"> um item por vez em cada display E+Q; todos os displays com itens ficam ativos ao mesmo tempo.</w:t>
       </w:r>
     </w:p>
     <w:p>
@@ -14397,7 +14517,7 @@
                 <w:sz w:val="18"/>
                 <w:szCs w:val="18"/>
               </w:rPr>
-              <w:t xml:space="preserve">Módulos E+Q (blocos 4-5 + zonas)</w:t>
+              <w:t xml:space="preserve">Módulos E+Q (andares 4-5 + zonas)</w:t>
             </w:r>
           </w:p>
         </w:tc>
@@ -14429,7 +14549,7 @@
                 <w:sz w:val="18"/>
                 <w:szCs w:val="18"/>
               </w:rPr>
-              <w:t xml:space="preserve">2 + 6 = 8</w:t>
+              <w:t xml:space="preserve">4 + 6 = 10</w:t>
             </w:r>
           </w:p>
         </w:tc>
@@ -14461,7 +14581,7 @@
                 <w:sz w:val="18"/>
                 <w:szCs w:val="18"/>
               </w:rPr>
-              <w:t xml:space="preserve">16</w:t>
+              <w:t xml:space="preserve">20</w:t>
             </w:r>
           </w:p>
         </w:tc>
@@ -14493,7 +14613,7 @@
                 <w:sz w:val="18"/>
                 <w:szCs w:val="18"/>
               </w:rPr>
-              <w:t xml:space="preserve">328</w:t>
+              <w:t xml:space="preserve">408</w:t>
             </w:r>
           </w:p>
         </w:tc>
@@ -15497,7 +15617,7 @@
                 <w:sz w:val="18"/>
                 <w:szCs w:val="18"/>
               </w:rPr>
-              <w:t xml:space="preserve">≈ R$ 187 mil</w:t>
+              <w:t xml:space="preserve">≈ R$ 199 mil</w:t>
             </w:r>
           </w:p>
         </w:tc>
@@ -15529,7 +15649,7 @@
                 <w:sz w:val="18"/>
                 <w:szCs w:val="18"/>
               </w:rPr>
-              <w:t xml:space="preserve">≈ R$ 186 mil (economia nos reguladores compensada pelo cabo de força)</w:t>
+              <w:t xml:space="preserve">≈ R$ 197 mil (economia nos reguladores compensada pelo cabo de força)</w:t>
             </w:r>
           </w:p>
         </w:tc>
@@ -16832,7 +16952,7 @@
                 <w:sz w:val="18"/>
                 <w:szCs w:val="18"/>
               </w:rPr>
-              <w:t xml:space="preserve">R$ 10.443</w:t>
+              <w:t xml:space="preserve">R$ 10.994</w:t>
             </w:r>
           </w:p>
         </w:tc>
@@ -16864,7 +16984,7 @@
                 <w:sz w:val="18"/>
                 <w:szCs w:val="18"/>
               </w:rPr>
-              <w:t xml:space="preserve">R$ 187.236</w:t>
+              <w:t xml:space="preserve">R$ 199.239</w:t>
             </w:r>
           </w:p>
         </w:tc>
@@ -16896,7 +17016,7 @@
                 <w:sz w:val="18"/>
                 <w:szCs w:val="18"/>
               </w:rPr>
-              <w:t xml:space="preserve">R$ 4.681</w:t>
+              <w:t xml:space="preserve">R$ 4.981</w:t>
             </w:r>
           </w:p>
         </w:tc>
@@ -16962,7 +17082,7 @@
                 <w:sz w:val="18"/>
                 <w:szCs w:val="18"/>
               </w:rPr>
-              <w:t xml:space="preserve">R$ 10.354</w:t>
+              <w:t xml:space="preserve">R$ 10.873</w:t>
             </w:r>
           </w:p>
         </w:tc>
@@ -16994,7 +17114,7 @@
                 <w:sz w:val="18"/>
                 <w:szCs w:val="18"/>
               </w:rPr>
-              <w:t xml:space="preserve">R$ 185.657</w:t>
+              <w:t xml:space="preserve">R$ 196.956</w:t>
             </w:r>
           </w:p>
         </w:tc>
@@ -17026,7 +17146,7 @@
                 <w:sz w:val="18"/>
                 <w:szCs w:val="18"/>
               </w:rPr>
-              <w:t xml:space="preserve">R$ 4.641</w:t>
+              <w:t xml:space="preserve">R$ 4.924</w:t>
             </w:r>
           </w:p>
         </w:tc>
@@ -17092,7 +17212,7 @@
                 <w:sz w:val="18"/>
                 <w:szCs w:val="18"/>
               </w:rPr>
-              <w:t xml:space="preserve">R$ 13.875</w:t>
+              <w:t xml:space="preserve">R$ 14.566</w:t>
             </w:r>
           </w:p>
         </w:tc>
@@ -17124,7 +17244,7 @@
                 <w:sz w:val="18"/>
                 <w:szCs w:val="18"/>
               </w:rPr>
-              <w:t xml:space="preserve">R$ 254.687</w:t>
+              <w:t xml:space="preserve">R$ 269.764</w:t>
             </w:r>
           </w:p>
         </w:tc>
@@ -17156,7 +17276,7 @@
                 <w:sz w:val="18"/>
                 <w:szCs w:val="18"/>
               </w:rPr>
-              <w:t xml:space="preserve">R$ 6.367</w:t>
+              <w:t xml:space="preserve">R$ 6.744</w:t>
             </w:r>
           </w:p>
         </w:tc>
@@ -17222,7 +17342,7 @@
                 <w:sz w:val="18"/>
                 <w:szCs w:val="18"/>
               </w:rPr>
-              <w:t xml:space="preserve">R$ 31.822</w:t>
+              <w:t xml:space="preserve">R$ 32.808</w:t>
             </w:r>
           </w:p>
         </w:tc>
@@ -17254,7 +17374,7 @@
                 <w:sz w:val="18"/>
                 <w:szCs w:val="18"/>
               </w:rPr>
-              <w:t xml:space="preserve">R$ 326.285</w:t>
+              <w:t xml:space="preserve">R$ 347.860</w:t>
             </w:r>
           </w:p>
         </w:tc>
@@ -17286,7 +17406,7 @@
                 <w:sz w:val="18"/>
                 <w:szCs w:val="18"/>
               </w:rPr>
-              <w:t xml:space="preserve">R$ 8.157</w:t>
+              <w:t xml:space="preserve">R$ 8.697</w:t>
             </w:r>
           </w:p>
         </w:tc>
@@ -17352,7 +17472,7 @@
                 <w:sz w:val="18"/>
                 <w:szCs w:val="18"/>
               </w:rPr>
-              <w:t xml:space="preserve">R$ 40.650</w:t>
+              <w:t xml:space="preserve">R$ 43.196</w:t>
             </w:r>
           </w:p>
         </w:tc>
@@ -17384,7 +17504,7 @@
                 <w:sz w:val="18"/>
                 <w:szCs w:val="18"/>
               </w:rPr>
-              <w:t xml:space="preserve">R$ 796.446</w:t>
+              <w:t xml:space="preserve">R$ 852.330</w:t>
             </w:r>
           </w:p>
         </w:tc>
@@ -17416,7 +17536,7 @@
                 <w:sz w:val="18"/>
                 <w:szCs w:val="18"/>
               </w:rPr>
-              <w:t xml:space="preserve">R$ 19.911</w:t>
+              <w:t xml:space="preserve">R$ 21.308</w:t>
             </w:r>
           </w:p>
         </w:tc>
@@ -17482,7 +17602,7 @@
                 <w:sz w:val="18"/>
                 <w:szCs w:val="18"/>
               </w:rPr>
-              <w:t xml:space="preserve">R$ 15.205</w:t>
+              <w:t xml:space="preserve">R$ 15.896</w:t>
             </w:r>
           </w:p>
         </w:tc>
@@ -17514,7 +17634,7 @@
                 <w:sz w:val="18"/>
                 <w:szCs w:val="18"/>
               </w:rPr>
-              <w:t xml:space="preserve">R$ 279.129</w:t>
+              <w:t xml:space="preserve">R$ 294.206</w:t>
             </w:r>
           </w:p>
         </w:tc>
@@ -17546,7 +17666,7 @@
                 <w:sz w:val="18"/>
                 <w:szCs w:val="18"/>
               </w:rPr>
-              <w:t xml:space="preserve">R$ 6.978</w:t>
+              <w:t xml:space="preserve">R$ 7.355</w:t>
             </w:r>
           </w:p>
         </w:tc>
@@ -17612,7 +17732,7 @@
                 <w:sz w:val="18"/>
                 <w:szCs w:val="18"/>
               </w:rPr>
-              <w:t xml:space="preserve">R$ 15.048</w:t>
+              <w:t xml:space="preserve">R$ 15.738</w:t>
             </w:r>
           </w:p>
         </w:tc>
@@ -17644,7 +17764,7 @@
                 <w:sz w:val="18"/>
                 <w:szCs w:val="18"/>
               </w:rPr>
-              <w:t xml:space="preserve">R$ 278.143</w:t>
+              <w:t xml:space="preserve">R$ 293.220</w:t>
             </w:r>
           </w:p>
         </w:tc>
@@ -17676,7 +17796,7 @@
                 <w:sz w:val="18"/>
                 <w:szCs w:val="18"/>
               </w:rPr>
-              <w:t xml:space="preserve">R$ 6.954</w:t>
+              <w:t xml:space="preserve">R$ 7.330</w:t>
             </w:r>
           </w:p>
         </w:tc>
@@ -20991,7 +21111,7 @@
                 <w:sz w:val="16"/>
                 <w:szCs w:val="16"/>
               </w:rPr>
-              <w:t xml:space="preserve">5</w:t>
+              <w:t xml:space="preserve">7</w:t>
             </w:r>
           </w:p>
         </w:tc>
@@ -21299,7 +21419,7 @@
                 <w:sz w:val="16"/>
                 <w:szCs w:val="16"/>
               </w:rPr>
-              <w:t xml:space="preserve">8</w:t>
+              <w:t xml:space="preserve">10</w:t>
             </w:r>
           </w:p>
         </w:tc>
@@ -21607,7 +21727,7 @@
                 <w:sz w:val="16"/>
                 <w:szCs w:val="16"/>
               </w:rPr>
-              <w:t xml:space="preserve">8</w:t>
+              <w:t xml:space="preserve">10</w:t>
             </w:r>
           </w:p>
         </w:tc>
@@ -21915,7 +22035,7 @@
                 <w:sz w:val="16"/>
                 <w:szCs w:val="16"/>
               </w:rPr>
-              <w:t xml:space="preserve">8</w:t>
+              <w:t xml:space="preserve">10</w:t>
             </w:r>
           </w:p>
         </w:tc>
@@ -22223,7 +22343,7 @@
                 <w:sz w:val="16"/>
                 <w:szCs w:val="16"/>
               </w:rPr>
-              <w:t xml:space="preserve">8</w:t>
+              <w:t xml:space="preserve">10</w:t>
             </w:r>
           </w:p>
         </w:tc>
@@ -22531,7 +22651,7 @@
                 <w:sz w:val="16"/>
                 <w:szCs w:val="16"/>
               </w:rPr>
-              <w:t xml:space="preserve">8</w:t>
+              <w:t xml:space="preserve">10</w:t>
             </w:r>
           </w:p>
         </w:tc>
@@ -22839,7 +22959,7 @@
                 <w:sz w:val="16"/>
                 <w:szCs w:val="16"/>
               </w:rPr>
-              <w:t xml:space="preserve">9</w:t>
+              <w:t xml:space="preserve">11</w:t>
             </w:r>
           </w:p>
         </w:tc>
@@ -23147,7 +23267,7 @@
                 <w:sz w:val="16"/>
                 <w:szCs w:val="16"/>
               </w:rPr>
-              <w:t xml:space="preserve">9</w:t>
+              <w:t xml:space="preserve">11</w:t>
             </w:r>
           </w:p>
         </w:tc>
@@ -23455,7 +23575,7 @@
                 <w:sz w:val="16"/>
                 <w:szCs w:val="16"/>
               </w:rPr>
-              <w:t xml:space="preserve">8</w:t>
+              <w:t xml:space="preserve">10</w:t>
             </w:r>
           </w:p>
         </w:tc>
@@ -23763,7 +23883,7 @@
                 <w:sz w:val="16"/>
                 <w:szCs w:val="16"/>
               </w:rPr>
-              <w:t xml:space="preserve">8</w:t>
+              <w:t xml:space="preserve">10</w:t>
             </w:r>
           </w:p>
         </w:tc>
@@ -24071,7 +24191,7 @@
                 <w:sz w:val="16"/>
                 <w:szCs w:val="16"/>
               </w:rPr>
-              <w:t xml:space="preserve">8</w:t>
+              <w:t xml:space="preserve">10</w:t>
             </w:r>
           </w:p>
         </w:tc>
@@ -24379,7 +24499,7 @@
                 <w:sz w:val="16"/>
                 <w:szCs w:val="16"/>
               </w:rPr>
-              <w:t xml:space="preserve">8</w:t>
+              <w:t xml:space="preserve">10</w:t>
             </w:r>
           </w:p>
         </w:tc>
@@ -24687,7 +24807,7 @@
                 <w:sz w:val="16"/>
                 <w:szCs w:val="16"/>
               </w:rPr>
-              <w:t xml:space="preserve">9</w:t>
+              <w:t xml:space="preserve">11</w:t>
             </w:r>
           </w:p>
         </w:tc>
@@ -24995,7 +25115,7 @@
                 <w:sz w:val="16"/>
                 <w:szCs w:val="16"/>
               </w:rPr>
-              <w:t xml:space="preserve">9</w:t>
+              <w:t xml:space="preserve">11</w:t>
             </w:r>
           </w:p>
         </w:tc>
@@ -25303,7 +25423,7 @@
                 <w:sz w:val="16"/>
                 <w:szCs w:val="16"/>
               </w:rPr>
-              <w:t xml:space="preserve">8</w:t>
+              <w:t xml:space="preserve">10</w:t>
             </w:r>
           </w:p>
         </w:tc>
@@ -25611,7 +25731,7 @@
                 <w:sz w:val="16"/>
                 <w:szCs w:val="16"/>
               </w:rPr>
-              <w:t xml:space="preserve">8</w:t>
+              <w:t xml:space="preserve">10</w:t>
             </w:r>
           </w:p>
         </w:tc>
@@ -25919,7 +26039,7 @@
                 <w:sz w:val="16"/>
                 <w:szCs w:val="16"/>
               </w:rPr>
-              <w:t xml:space="preserve">8</w:t>
+              <w:t xml:space="preserve">10</w:t>
             </w:r>
           </w:p>
         </w:tc>
@@ -26227,7 +26347,7 @@
                 <w:sz w:val="16"/>
                 <w:szCs w:val="16"/>
               </w:rPr>
-              <w:t xml:space="preserve">8</w:t>
+              <w:t xml:space="preserve">10</w:t>
             </w:r>
           </w:p>
         </w:tc>
@@ -26535,7 +26655,7 @@
                 <w:sz w:val="16"/>
                 <w:szCs w:val="16"/>
               </w:rPr>
-              <w:t xml:space="preserve">8</w:t>
+              <w:t xml:space="preserve">10</w:t>
             </w:r>
           </w:p>
         </w:tc>
@@ -26843,7 +26963,7 @@
                 <w:sz w:val="16"/>
                 <w:szCs w:val="16"/>
               </w:rPr>
-              <w:t xml:space="preserve">3</w:t>
+              <w:t xml:space="preserve">5</w:t>
             </w:r>
           </w:p>
         </w:tc>
@@ -27151,7 +27271,7 @@
                 <w:sz w:val="16"/>
                 <w:szCs w:val="16"/>
               </w:rPr>
-              <w:t xml:space="preserve">8</w:t>
+              <w:t xml:space="preserve">10</w:t>
             </w:r>
           </w:p>
         </w:tc>
@@ -27459,7 +27579,7 @@
                 <w:sz w:val="16"/>
                 <w:szCs w:val="16"/>
               </w:rPr>
-              <w:t xml:space="preserve">8</w:t>
+              <w:t xml:space="preserve">10</w:t>
             </w:r>
           </w:p>
         </w:tc>
@@ -27767,7 +27887,7 @@
                 <w:sz w:val="16"/>
                 <w:szCs w:val="16"/>
               </w:rPr>
-              <w:t xml:space="preserve">8</w:t>
+              <w:t xml:space="preserve">10</w:t>
             </w:r>
           </w:p>
         </w:tc>
@@ -28075,7 +28195,7 @@
                 <w:sz w:val="16"/>
                 <w:szCs w:val="16"/>
               </w:rPr>
-              <w:t xml:space="preserve">8</w:t>
+              <w:t xml:space="preserve">10</w:t>
             </w:r>
           </w:p>
         </w:tc>
@@ -28383,7 +28503,7 @@
                 <w:sz w:val="16"/>
                 <w:szCs w:val="16"/>
               </w:rPr>
-              <w:t xml:space="preserve">8</w:t>
+              <w:t xml:space="preserve">10</w:t>
             </w:r>
           </w:p>
         </w:tc>
@@ -28691,7 +28811,7 @@
                 <w:sz w:val="16"/>
                 <w:szCs w:val="16"/>
               </w:rPr>
-              <w:t xml:space="preserve">8</w:t>
+              <w:t xml:space="preserve">10</w:t>
             </w:r>
           </w:p>
         </w:tc>
@@ -28999,7 +29119,7 @@
                 <w:sz w:val="16"/>
                 <w:szCs w:val="16"/>
               </w:rPr>
-              <w:t xml:space="preserve">11</w:t>
+              <w:t xml:space="preserve">13</w:t>
             </w:r>
           </w:p>
         </w:tc>
@@ -29307,7 +29427,7 @@
                 <w:sz w:val="16"/>
                 <w:szCs w:val="16"/>
               </w:rPr>
-              <w:t xml:space="preserve">11</w:t>
+              <w:t xml:space="preserve">13</w:t>
             </w:r>
           </w:p>
         </w:tc>
@@ -29615,7 +29735,7 @@
                 <w:sz w:val="16"/>
                 <w:szCs w:val="16"/>
               </w:rPr>
-              <w:t xml:space="preserve">8</w:t>
+              <w:t xml:space="preserve">10</w:t>
             </w:r>
           </w:p>
         </w:tc>
@@ -29923,7 +30043,7 @@
                 <w:sz w:val="16"/>
                 <w:szCs w:val="16"/>
               </w:rPr>
-              <w:t xml:space="preserve">8</w:t>
+              <w:t xml:space="preserve">10</w:t>
             </w:r>
           </w:p>
         </w:tc>
@@ -30231,7 +30351,7 @@
                 <w:sz w:val="16"/>
                 <w:szCs w:val="16"/>
               </w:rPr>
-              <w:t xml:space="preserve">8</w:t>
+              <w:t xml:space="preserve">10</w:t>
             </w:r>
           </w:p>
         </w:tc>
@@ -30539,7 +30659,7 @@
                 <w:sz w:val="16"/>
                 <w:szCs w:val="16"/>
               </w:rPr>
-              <w:t xml:space="preserve">8</w:t>
+              <w:t xml:space="preserve">10</w:t>
             </w:r>
           </w:p>
         </w:tc>
@@ -30847,7 +30967,7 @@
                 <w:sz w:val="16"/>
                 <w:szCs w:val="16"/>
               </w:rPr>
-              <w:t xml:space="preserve">11</w:t>
+              <w:t xml:space="preserve">13</w:t>
             </w:r>
           </w:p>
         </w:tc>
@@ -31155,7 +31275,7 @@
                 <w:sz w:val="16"/>
                 <w:szCs w:val="16"/>
               </w:rPr>
-              <w:t xml:space="preserve">11</w:t>
+              <w:t xml:space="preserve">13</w:t>
             </w:r>
           </w:p>
         </w:tc>
@@ -31463,7 +31583,7 @@
                 <w:sz w:val="16"/>
                 <w:szCs w:val="16"/>
               </w:rPr>
-              <w:t xml:space="preserve">8</w:t>
+              <w:t xml:space="preserve">10</w:t>
             </w:r>
           </w:p>
         </w:tc>
@@ -31771,7 +31891,7 @@
                 <w:sz w:val="16"/>
                 <w:szCs w:val="16"/>
               </w:rPr>
-              <w:t xml:space="preserve">8</w:t>
+              <w:t xml:space="preserve">10</w:t>
             </w:r>
           </w:p>
         </w:tc>
@@ -32079,7 +32199,7 @@
                 <w:sz w:val="16"/>
                 <w:szCs w:val="16"/>
               </w:rPr>
-              <w:t xml:space="preserve">8</w:t>
+              <w:t xml:space="preserve">10</w:t>
             </w:r>
           </w:p>
         </w:tc>
@@ -32387,7 +32507,7 @@
                 <w:sz w:val="16"/>
                 <w:szCs w:val="16"/>
               </w:rPr>
-              <w:t xml:space="preserve">8</w:t>
+              <w:t xml:space="preserve">10</w:t>
             </w:r>
           </w:p>
         </w:tc>
@@ -32695,7 +32815,7 @@
                 <w:sz w:val="16"/>
                 <w:szCs w:val="16"/>
               </w:rPr>
-              <w:t xml:space="preserve">8</w:t>
+              <w:t xml:space="preserve">10</w:t>
             </w:r>
           </w:p>
         </w:tc>
@@ -33003,7 +33123,7 @@
                 <w:sz w:val="16"/>
                 <w:szCs w:val="16"/>
               </w:rPr>
-              <w:t xml:space="preserve">8</w:t>
+              <w:t xml:space="preserve">10</w:t>
             </w:r>
           </w:p>
         </w:tc>
@@ -33320,7 +33440,7 @@
                 <w:sz w:val="16"/>
                 <w:szCs w:val="16"/>
               </w:rPr>
-              <w:t xml:space="preserve">328</w:t>
+              <w:t xml:space="preserve">408</w:t>
             </w:r>
           </w:p>
         </w:tc>
@@ -33556,7 +33676,7 @@
                 <w:sz w:val="18"/>
                 <w:szCs w:val="18"/>
               </w:rPr>
-              <w:t xml:space="preserve">Endereços com muita / pouca saída. Alto giro ao longo da esteira de transporte (prédios 001-010); baixo giro no corredor perpendicular.</w:t>
+              <w:t xml:space="preserve">Endereços com muita / pouca saída. Alto giro atrás do operador, de frente para as esteiras (prédios 001-010); baixo giro no corredor perpendicular.</w:t>
             </w:r>
           </w:p>
         </w:tc>
@@ -33656,7 +33776,7 @@
                 <w:sz w:val="18"/>
                 <w:szCs w:val="18"/>
               </w:rPr>
-              <w:t xml:space="preserve">Área de espera</w:t>
+              <w:t xml:space="preserve">Esteira de separação</w:t>
             </w:r>
           </w:p>
         </w:tc>
@@ -33688,7 +33808,73 @@
                 <w:sz w:val="18"/>
                 <w:szCs w:val="18"/>
               </w:rPr>
-              <w:t xml:space="preserve">Trecho em frente ao alto giro onde as bacias aguardam a separação.</w:t>
+              <w:t xml:space="preserve">Esteira paralela à de transporte (≈ 20 cm entre elas) onde a bacia fica durante a separação.</w:t>
+            </w:r>
+          </w:p>
+        </w:tc>
+      </w:tr>
+      <w:tr>
+        <w:tc>
+          <w:tcPr>
+            <w:tcW w:type="dxa" w:w="2478"/>
+            <w:tcBorders>
+              <w:top w:val="single" w:color="BFC7D2" w:sz="4"/>
+              <w:left w:val="single" w:color="BFC7D2" w:sz="4"/>
+              <w:bottom w:val="single" w:color="BFC7D2" w:sz="4"/>
+              <w:right w:val="single" w:color="BFC7D2" w:sz="4"/>
+            </w:tcBorders>
+            <w:tcMar>
+              <w:top w:type="dxa" w:w="60"/>
+              <w:left w:type="dxa" w:w="100"/>
+              <w:bottom w:type="dxa" w:w="60"/>
+              <w:right w:type="dxa" w:w="100"/>
+            </w:tcMar>
+            <w:vAlign w:val="center"/>
+          </w:tcPr>
+          <w:p>
+            <w:pPr>
+              <w:jc w:val="left"/>
+            </w:pPr>
+            <w:r>
+              <w:rPr>
+                <w:rFonts w:ascii="Arial" w:cs="Arial" w:eastAsia="Arial" w:hAnsi="Arial"/>
+                <w:color w:val="1C2430"/>
+                <w:sz w:val="18"/>
+                <w:szCs w:val="18"/>
+              </w:rPr>
+              <w:t xml:space="preserve">Transferência</w:t>
+            </w:r>
+          </w:p>
+        </w:tc>
+        <w:tc>
+          <w:tcPr>
+            <w:tcW w:type="dxa" w:w="7160"/>
+            <w:tcBorders>
+              <w:top w:val="single" w:color="BFC7D2" w:sz="4"/>
+              <w:left w:val="single" w:color="BFC7D2" w:sz="4"/>
+              <w:bottom w:val="single" w:color="BFC7D2" w:sz="4"/>
+              <w:right w:val="single" w:color="BFC7D2" w:sz="4"/>
+            </w:tcBorders>
+            <w:tcMar>
+              <w:top w:type="dxa" w:w="60"/>
+              <w:left w:type="dxa" w:w="100"/>
+              <w:bottom w:type="dxa" w:w="60"/>
+              <w:right w:type="dxa" w:w="100"/>
+            </w:tcMar>
+            <w:vAlign w:val="center"/>
+          </w:tcPr>
+          <w:p>
+            <w:pPr>
+              <w:jc w:val="left"/>
+            </w:pPr>
+            <w:r>
+              <w:rPr>
+                <w:rFonts w:ascii="Arial" w:cs="Arial" w:eastAsia="Arial" w:hAnsi="Arial"/>
+                <w:color w:val="1C2430"/>
+                <w:sz w:val="18"/>
+                <w:szCs w:val="18"/>
+              </w:rPr>
+              <w:t xml:space="preserve">Desvio da esteira de transporte para a de separação; com o rolete direcionador atende até 4 estações.</w:t>
             </w:r>
           </w:p>
         </w:tc>

</xml_diff>

<commit_message>
Alto giro na frente do operador com as esteiras passando por dentro
- esteira de separação e de transporte por baixo do andar 3 e por cima do andar 4
- corredor do baixo giro atrás do operador
- planta, elevações, documento técnico e apresentação atualizados

Co-Authored-By: Claude Opus 5.5 <noreply@anthropic.com>
Claude-Session: https://claude.ai/code/session_01TBWA3G7ku1j3oTf4VMkLud
</commit_message>
<xml_diff>
--- a/projeto/entregaveis/Arquitetura_PTL_Documento_Tecnico.docx
+++ b/projeto/entregaveis/Arquitetura_PTL_Documento_Tecnico.docx
@@ -2131,7 +2131,7 @@
                 <w:sz w:val="18"/>
                 <w:szCs w:val="18"/>
               </w:rPr>
-              <w:t xml:space="preserve">Alto giro (atrás do operador, de frente para as esteiras)</w:t>
+              <w:t xml:space="preserve">Alto giro (na frente do operador; esteiras passam por dentro)</w:t>
             </w:r>
           </w:p>
         </w:tc>
@@ -2195,7 +2195,7 @@
                 <w:sz w:val="18"/>
                 <w:szCs w:val="18"/>
               </w:rPr>
-              <w:t xml:space="preserve">0 a 3 (de cima)</w:t>
+              <w:t xml:space="preserve">0 a 3 (acima das esteiras)</w:t>
             </w:r>
           </w:p>
         </w:tc>
@@ -2325,7 +2325,7 @@
                 <w:sz w:val="18"/>
                 <w:szCs w:val="18"/>
               </w:rPr>
-              <w:t xml:space="preserve">4 e 5</w:t>
+              <w:t xml:space="preserve">4 e 5 (abaixo das esteiras)</w:t>
             </w:r>
           </w:p>
         </w:tc>
@@ -2812,7 +2812,47 @@
           <w:sz w:val="21"/>
           <w:szCs w:val="21"/>
         </w:rPr>
-        <w:t xml:space="preserve">A </w:t>
+        <w:t xml:space="preserve">O </w:t>
+      </w:r>
+      <w:r>
+        <w:rPr>
+          <w:rFonts w:ascii="Arial" w:cs="Arial" w:eastAsia="Arial" w:hAnsi="Arial"/>
+          <w:b/>
+          <w:bCs/>
+          <w:sz w:val="21"/>
+          <w:szCs w:val="21"/>
+        </w:rPr>
+        <w:t xml:space="preserve">alto giro</w:t>
+      </w:r>
+      <w:r>
+        <w:rPr>
+          <w:rFonts w:ascii="Arial" w:cs="Arial" w:eastAsia="Arial" w:hAnsi="Arial"/>
+          <w:b w:val="false"/>
+          <w:bCs w:val="false"/>
+          <w:sz w:val="21"/>
+          <w:szCs w:val="21"/>
+        </w:rPr>
+        <w:t xml:space="preserve"> fica na frente do operador. A </w:t>
+      </w:r>
+      <w:r>
+        <w:rPr>
+          <w:rFonts w:ascii="Arial" w:cs="Arial" w:eastAsia="Arial" w:hAnsi="Arial"/>
+          <w:b/>
+          <w:bCs/>
+          <w:sz w:val="21"/>
+          <w:szCs w:val="21"/>
+        </w:rPr>
+        <w:t xml:space="preserve">esteira de separação</w:t>
+      </w:r>
+      <w:r>
+        <w:rPr>
+          <w:rFonts w:ascii="Arial" w:cs="Arial" w:eastAsia="Arial" w:hAnsi="Arial"/>
+          <w:b w:val="false"/>
+          <w:bCs w:val="false"/>
+          <w:sz w:val="21"/>
+          <w:szCs w:val="21"/>
+        </w:rPr>
+        <w:t xml:space="preserve"> e a </w:t>
       </w:r>
       <w:r>
         <w:rPr>
@@ -2832,7 +2872,7 @@
           <w:sz w:val="21"/>
           <w:szCs w:val="21"/>
         </w:rPr>
-        <w:t xml:space="preserve"> e a </w:t>
+        <w:t xml:space="preserve"> correm lado a lado (cerca de 20 cm entre elas) e passam </w:t>
       </w:r>
       <w:r>
         <w:rPr>
@@ -2842,7 +2882,7 @@
           <w:sz w:val="21"/>
           <w:szCs w:val="21"/>
         </w:rPr>
-        <w:t xml:space="preserve">esteira de separação</w:t>
+        <w:t xml:space="preserve">por dentro do alto giro, por baixo do andar 3 e por cima do andar 4</w:t>
       </w:r>
       <w:r>
         <w:rPr>
@@ -2852,27 +2892,7 @@
           <w:sz w:val="21"/>
           <w:szCs w:val="21"/>
         </w:rPr>
-        <w:t xml:space="preserve"> correm lado a lado, com cerca de 20 cm entre elas. O operador fica entre a esteira de separação e o </w:t>
-      </w:r>
-      <w:r>
-        <w:rPr>
-          <w:rFonts w:ascii="Arial" w:cs="Arial" w:eastAsia="Arial" w:hAnsi="Arial"/>
-          <w:b/>
-          <w:bCs/>
-          <w:sz w:val="21"/>
-          <w:szCs w:val="21"/>
-        </w:rPr>
-        <w:t xml:space="preserve">alto giro</w:t>
-      </w:r>
-      <w:r>
-        <w:rPr>
-          <w:rFonts w:ascii="Arial" w:cs="Arial" w:eastAsia="Arial" w:hAnsi="Arial"/>
-          <w:b w:val="false"/>
-          <w:bCs w:val="false"/>
-          <w:sz w:val="21"/>
-          <w:szCs w:val="21"/>
-        </w:rPr>
-        <w:t xml:space="preserve">, que fica atrás dele, de frente para as esteiras; no meio do alto giro há a passagem para o </w:t>
+        <w:t xml:space="preserve">: a separação do lado do operador e a de transporte atrás. O </w:t>
       </w:r>
       <w:r>
         <w:rPr>
@@ -2892,7 +2912,7 @@
           <w:sz w:val="21"/>
           <w:szCs w:val="21"/>
         </w:rPr>
-        <w:t xml:space="preserve">, perpendicular às esteiras. As prateleiras são alinhadas (mesmos níveis em toda a estante).</w:t>
+        <w:t xml:space="preserve"> fica atrás do operador, perpendicular às esteiras. As prateleiras são alinhadas (mesmos níveis em toda a estante).</w:t>
       </w:r>
     </w:p>
     <w:p>
@@ -3255,7 +3275,7 @@
           <w:sz w:val="18"/>
           <w:szCs w:val="18"/>
         </w:rPr>
-        <w:t xml:space="preserve">Figura 1 — Planta da estação 05 e das vizinhas: esteiras, transferência, alto giro e corredor do baixo giro (sem escala)</w:t>
+        <w:t xml:space="preserve">Figura 1 — Planta da estação 05 e das vizinhas: alto giro com as esteiras por dentro, transferência, operador e corredor do baixo giro (sem escala)</w:t>
       </w:r>
     </w:p>
     <w:p>
@@ -33676,7 +33696,7 @@
                 <w:sz w:val="18"/>
                 <w:szCs w:val="18"/>
               </w:rPr>
-              <w:t xml:space="preserve">Endereços com muita / pouca saída. Alto giro atrás do operador, de frente para as esteiras (prédios 001-010); baixo giro no corredor perpendicular.</w:t>
+              <w:t xml:space="preserve">Endereços com muita / pouca saída. Alto giro na frente do operador (prédios 001-010), com as esteiras passando por dentro entre os andares 3 e 4; baixo giro no corredor atrás do operador.</w:t>
             </w:r>
           </w:p>
         </w:tc>
@@ -33808,7 +33828,7 @@
                 <w:sz w:val="18"/>
                 <w:szCs w:val="18"/>
               </w:rPr>
-              <w:t xml:space="preserve">Esteira paralela à de transporte (≈ 20 cm entre elas) onde a bacia fica durante a separação.</w:t>
+              <w:t xml:space="preserve">Esteira paralela à de transporte (≈ 20 cm entre elas), dentro do alto giro, onde a bacia fica durante a separação.</w:t>
             </w:r>
           </w:p>
         </w:tc>

</xml_diff>

<commit_message>
Separação aberta na frente, 4 zonas por lado no baixo giro com displays na altura dos olhos
- esteira de transporte por dentro do alto giro; separação na frente, aberta
- baixo giro: 4 zonas por lado (E1-E4, D1-D4), display E+Q a ~1,5 m; profundidade ~2 m
- caixas de endereço menores
- orçamento, diagramas, documento e apresentação atualizados

Co-Authored-By: Claude Opus 5.5 <noreply@anthropic.com>
Claude-Session: https://claude.ai/code/session_01TBWA3G7ku1j3oTf4VMkLud
</commit_message>
<xml_diff>
--- a/projeto/entregaveis/Arquitetura_PTL_Documento_Tecnico.docx
+++ b/projeto/entregaveis/Arquitetura_PTL_Documento_Tecnico.docx
@@ -2131,7 +2131,7 @@
                 <w:sz w:val="18"/>
                 <w:szCs w:val="18"/>
               </w:rPr>
-              <w:t xml:space="preserve">Alto giro (na frente do operador; esteiras passam por dentro)</w:t>
+              <w:t xml:space="preserve">Alto giro (na frente do operador; esteira de transporte por dentro)</w:t>
             </w:r>
           </w:p>
         </w:tc>
@@ -2617,7 +2617,7 @@
                 <w:sz w:val="18"/>
                 <w:szCs w:val="18"/>
               </w:rPr>
-              <w:t xml:space="preserve">Zonas de 4 prédios, cada uma com 1 display de endereço + quantidade</w:t>
+              <w:t xml:space="preserve">4 zonas por lado do corredor (≈ 3 prédios cada), cada uma com 1 display de endereço + 1 de quantidade na altura dos olhos</w:t>
             </w:r>
           </w:p>
         </w:tc>
@@ -2842,26 +2842,6 @@
           <w:sz w:val="21"/>
           <w:szCs w:val="21"/>
         </w:rPr>
-        <w:t xml:space="preserve">esteira de separação</w:t>
-      </w:r>
-      <w:r>
-        <w:rPr>
-          <w:rFonts w:ascii="Arial" w:cs="Arial" w:eastAsia="Arial" w:hAnsi="Arial"/>
-          <w:b w:val="false"/>
-          <w:bCs w:val="false"/>
-          <w:sz w:val="21"/>
-          <w:szCs w:val="21"/>
-        </w:rPr>
-        <w:t xml:space="preserve"> e a </w:t>
-      </w:r>
-      <w:r>
-        <w:rPr>
-          <w:rFonts w:ascii="Arial" w:cs="Arial" w:eastAsia="Arial" w:hAnsi="Arial"/>
-          <w:b/>
-          <w:bCs/>
-          <w:sz w:val="21"/>
-          <w:szCs w:val="21"/>
-        </w:rPr>
         <w:t xml:space="preserve">esteira de transporte</w:t>
       </w:r>
       <w:r>
@@ -2872,7 +2852,7 @@
           <w:sz w:val="21"/>
           <w:szCs w:val="21"/>
         </w:rPr>
-        <w:t xml:space="preserve"> correm lado a lado (cerca de 20 cm entre elas) e passam </w:t>
+        <w:t xml:space="preserve"> passa </w:t>
       </w:r>
       <w:r>
         <w:rPr>
@@ -2892,7 +2872,27 @@
           <w:sz w:val="21"/>
           <w:szCs w:val="21"/>
         </w:rPr>
-        <w:t xml:space="preserve">: a separação do lado do operador e a de transporte atrás. O </w:t>
+        <w:t xml:space="preserve">; a </w:t>
+      </w:r>
+      <w:r>
+        <w:rPr>
+          <w:rFonts w:ascii="Arial" w:cs="Arial" w:eastAsia="Arial" w:hAnsi="Arial"/>
+          <w:b/>
+          <w:bCs/>
+          <w:sz w:val="21"/>
+          <w:szCs w:val="21"/>
+        </w:rPr>
+        <w:t xml:space="preserve">esteira de separação</w:t>
+      </w:r>
+      <w:r>
+        <w:rPr>
+          <w:rFonts w:ascii="Arial" w:cs="Arial" w:eastAsia="Arial" w:hAnsi="Arial"/>
+          <w:b w:val="false"/>
+          <w:bCs w:val="false"/>
+          <w:sz w:val="21"/>
+          <w:szCs w:val="21"/>
+        </w:rPr>
+        <w:t xml:space="preserve"> fica na frente da estante, aberta, cerca de 20 cm à frente da de transporte, com os endereços logo acima e abaixo dela. O </w:t>
       </w:r>
       <w:r>
         <w:rPr>
@@ -3275,7 +3275,7 @@
           <w:sz w:val="18"/>
           <w:szCs w:val="18"/>
         </w:rPr>
-        <w:t xml:space="preserve">Figura 1 — Planta da estação 05 e das vizinhas: alto giro com as esteiras por dentro, transferência, operador e corredor do baixo giro (sem escala)</w:t>
+        <w:t xml:space="preserve">Figura 1 — Planta da estação 05 e das vizinhas: alto giro com a esteira de transporte por dentro, esteira de separação, transferência, operador e corredor do baixo giro (sem escala)</w:t>
       </w:r>
     </w:p>
     <w:p>
@@ -3338,7 +3338,7 @@
           <w:sz w:val="18"/>
           <w:szCs w:val="18"/>
         </w:rPr>
-        <w:t xml:space="preserve">Figura 2 — Elevações da estação 05 com os 209 endereços reais (andar 0 em cima) e as 6 zonas do baixo giro</w:t>
+        <w:t xml:space="preserve">Figura 2 — Elevações da estação 05 com os 209 endereços reais (andar 0 em cima) e as 8 zonas do baixo giro (4 por lado)</w:t>
       </w:r>
     </w:p>
     <w:p>
@@ -3777,7 +3777,7 @@
                 <w:sz w:val="18"/>
                 <w:szCs w:val="18"/>
               </w:rPr>
-              <w:t xml:space="preserve">6</w:t>
+              <w:t xml:space="preserve">8</w:t>
             </w:r>
           </w:p>
         </w:tc>
@@ -3971,7 +3971,7 @@
                 <w:sz w:val="18"/>
                 <w:szCs w:val="18"/>
               </w:rPr>
-              <w:t xml:space="preserve">7</w:t>
+              <w:t xml:space="preserve">9</w:t>
             </w:r>
           </w:p>
         </w:tc>
@@ -4165,7 +4165,7 @@
                 <w:sz w:val="18"/>
                 <w:szCs w:val="18"/>
               </w:rPr>
-              <w:t xml:space="preserve">3 / 1</w:t>
+              <w:t xml:space="preserve">4 / 1</w:t>
             </w:r>
           </w:p>
         </w:tc>
@@ -4359,7 +4359,7 @@
                 <w:sz w:val="18"/>
                 <w:szCs w:val="18"/>
               </w:rPr>
-              <w:t xml:space="preserve">6</w:t>
+              <w:t xml:space="preserve">8</w:t>
             </w:r>
           </w:p>
         </w:tc>
@@ -4553,7 +4553,7 @@
                 <w:sz w:val="18"/>
                 <w:szCs w:val="18"/>
               </w:rPr>
-              <w:t xml:space="preserve">9</w:t>
+              <w:t xml:space="preserve">11</w:t>
             </w:r>
           </w:p>
         </w:tc>
@@ -4747,7 +4747,7 @@
                 <w:sz w:val="18"/>
                 <w:szCs w:val="18"/>
               </w:rPr>
-              <w:t xml:space="preserve">6</w:t>
+              <w:t xml:space="preserve">8</w:t>
             </w:r>
           </w:p>
         </w:tc>
@@ -4961,7 +4961,7 @@
                 <w:sz w:val="18"/>
                 <w:szCs w:val="18"/>
               </w:rPr>
-              <w:t xml:space="preserve">248</w:t>
+              <w:t xml:space="preserve">325</w:t>
             </w:r>
           </w:p>
         </w:tc>
@@ -5082,7 +5082,7 @@
           <w:sz w:val="21"/>
           <w:szCs w:val="21"/>
         </w:rPr>
-        <w:t xml:space="preserve">Regra inicial: </w:t>
+        <w:t xml:space="preserve">Para ficar visual e ergonômico, cada lado do corredor tem </w:t>
       </w:r>
       <w:r>
         <w:rPr>
@@ -5092,7 +5092,7 @@
           <w:sz w:val="21"/>
           <w:szCs w:val="21"/>
         </w:rPr>
-        <w:t xml:space="preserve">1 zona a cada 4 prédios</w:t>
+        <w:t xml:space="preserve">4 zonas</w:t>
       </w:r>
       <w:r>
         <w:rPr>
@@ -5102,7 +5102,67 @@
           <w:sz w:val="21"/>
           <w:szCs w:val="21"/>
         </w:rPr>
-        <w:t xml:space="preserve"> do baixo giro, com todas as zonas que têm itens trabalhando ao mesmo tempo. Cada zona mostra </w:t>
+        <w:t xml:space="preserve"> (cerca de 3 prédios cada), e cada zona tem </w:t>
+      </w:r>
+      <w:r>
+        <w:rPr>
+          <w:rFonts w:ascii="Arial" w:cs="Arial" w:eastAsia="Arial" w:hAnsi="Arial"/>
+          <w:b/>
+          <w:bCs/>
+          <w:sz w:val="21"/>
+          <w:szCs w:val="21"/>
+        </w:rPr>
+        <w:t xml:space="preserve">1 display de endereço + 1 de quantidade + botão</w:t>
+      </w:r>
+      <w:r>
+        <w:rPr>
+          <w:rFonts w:ascii="Arial" w:cs="Arial" w:eastAsia="Arial" w:hAnsi="Arial"/>
+          <w:b w:val="false"/>
+          <w:bCs w:val="false"/>
+          <w:sz w:val="21"/>
+          <w:szCs w:val="21"/>
+        </w:rPr>
+        <w:t xml:space="preserve">, preso na longarina </w:t>
+      </w:r>
+      <w:r>
+        <w:rPr>
+          <w:rFonts w:ascii="Arial" w:cs="Arial" w:eastAsia="Arial" w:hAnsi="Arial"/>
+          <w:b/>
+          <w:bCs/>
+          <w:sz w:val="21"/>
+          <w:szCs w:val="21"/>
+        </w:rPr>
+        <w:t xml:space="preserve">na altura dos olhos (≈ 1,5 m)</w:t>
+      </w:r>
+      <w:r>
+        <w:rPr>
+          <w:rFonts w:ascii="Arial" w:cs="Arial" w:eastAsia="Arial" w:hAnsi="Arial"/>
+          <w:b w:val="false"/>
+          <w:bCs w:val="false"/>
+          <w:sz w:val="21"/>
+          <w:szCs w:val="21"/>
+        </w:rPr>
+        <w:t xml:space="preserve">, no meio da zona. Assim, olhando um lado do corredor, o operador vê </w:t>
+      </w:r>
+      <w:r>
+        <w:rPr>
+          <w:rFonts w:ascii="Arial" w:cs="Arial" w:eastAsia="Arial" w:hAnsi="Arial"/>
+          <w:b/>
+          <w:bCs/>
+          <w:sz w:val="21"/>
+          <w:szCs w:val="21"/>
+        </w:rPr>
+        <w:t xml:space="preserve">8 displays</w:t>
+      </w:r>
+      <w:r>
+        <w:rPr>
+          <w:rFonts w:ascii="Arial" w:cs="Arial" w:eastAsia="Arial" w:hAnsi="Arial"/>
+          <w:b w:val="false"/>
+          <w:bCs w:val="false"/>
+          <w:sz w:val="21"/>
+          <w:szCs w:val="21"/>
+        </w:rPr>
+        <w:t xml:space="preserve"> (4 de endereço e 4 de quantidade). Cada zona mostra </w:t>
       </w:r>
       <w:r>
         <w:rPr>
@@ -5122,7 +5182,67 @@
           <w:sz w:val="21"/>
           <w:szCs w:val="21"/>
         </w:rPr>
-        <w:t xml:space="preserve">, na ordem da rota; o botão confirma e o display passa para o próximo item da zona. Com 4 prédios × 8 andares, cada zona tem 20 a 32 endereços — o display mostra prédio e andar (ex.: </w:t>
+        <w:t xml:space="preserve">, na ordem da rota; o botão confirma e o display passa para o próximo item da zona. Todas as zonas com itens trabalham ao mesmo tempo.</w:t>
+      </w:r>
+    </w:p>
+    <w:p>
+      <w:pPr>
+        <w:pStyle w:val="ListParagraph"/>
+        <w:numPr>
+          <w:ilvl w:val="0"/>
+          <w:numId w:val="2"/>
+        </w:numPr>
+        <w:spacing w:after="60" w:line="290"/>
+      </w:pPr>
+      <w:r>
+        <w:rPr>
+          <w:rFonts w:ascii="Arial" w:cs="Arial" w:eastAsia="Arial" w:hAnsi="Arial"/>
+          <w:b w:val="false"/>
+          <w:bCs w:val="false"/>
+          <w:sz w:val="21"/>
+          <w:szCs w:val="21"/>
+        </w:rPr>
+        <w:t xml:space="preserve">Estação comum: lado esquerdo 020-031 em 4 zonas (E1 a E4) e lado direito 015 + 043 → 032 em 4 zonas (D1 a D4): </w:t>
+      </w:r>
+      <w:r>
+        <w:rPr>
+          <w:rFonts w:ascii="Arial" w:cs="Arial" w:eastAsia="Arial" w:hAnsi="Arial"/>
+          <w:b/>
+          <w:bCs/>
+          <w:sz w:val="21"/>
+          <w:szCs w:val="21"/>
+        </w:rPr>
+        <w:t xml:space="preserve">8 zonas por estação</w:t>
+      </w:r>
+      <w:r>
+        <w:rPr>
+          <w:rFonts w:ascii="Arial" w:cs="Arial" w:eastAsia="Arial" w:hAnsi="Arial"/>
+          <w:b w:val="false"/>
+          <w:bCs w:val="false"/>
+          <w:sz w:val="21"/>
+          <w:szCs w:val="21"/>
+        </w:rPr>
+        <w:t xml:space="preserve">. Esquinas mantêm zonas extras de 4 prédios (060-063 / 060-071).</w:t>
+      </w:r>
+    </w:p>
+    <w:p>
+      <w:pPr>
+        <w:pStyle w:val="ListParagraph"/>
+        <w:numPr>
+          <w:ilvl w:val="0"/>
+          <w:numId w:val="2"/>
+        </w:numPr>
+        <w:spacing w:after="60" w:line="290"/>
+      </w:pPr>
+      <w:r>
+        <w:rPr>
+          <w:rFonts w:ascii="Arial" w:cs="Arial" w:eastAsia="Arial" w:hAnsi="Arial"/>
+          <w:b w:val="false"/>
+          <w:bCs w:val="false"/>
+          <w:sz w:val="21"/>
+          <w:szCs w:val="21"/>
+        </w:rPr>
+        <w:t xml:space="preserve">Com 3 prédios por zona, cada zona tem até 24 endereços; o display mostra prédio e andar (ex.: </w:t>
       </w:r>
       <w:r>
         <w:rPr>
@@ -5142,7 +5262,27 @@
           <w:sz w:val="21"/>
           <w:szCs w:val="21"/>
         </w:rPr>
-        <w:t xml:space="preserve">), suficiente para localizar a posição em poucos segundos.</w:t>
+        <w:t xml:space="preserve">).</w:t>
+      </w:r>
+    </w:p>
+    <w:p>
+      <w:pPr>
+        <w:pStyle w:val="ListParagraph"/>
+        <w:numPr>
+          <w:ilvl w:val="0"/>
+          <w:numId w:val="2"/>
+        </w:numPr>
+        <w:spacing w:after="60" w:line="290"/>
+      </w:pPr>
+      <w:r>
+        <w:rPr>
+          <w:rFonts w:ascii="Arial" w:cs="Arial" w:eastAsia="Arial" w:hAnsi="Arial"/>
+          <w:b w:val="false"/>
+          <w:bCs w:val="false"/>
+          <w:sz w:val="21"/>
+          <w:szCs w:val="21"/>
+        </w:rPr>
+        <w:t xml:space="preserve">Profundidade do baixo giro ≈ 2 m; as caixas dos endereços são, em geral, pequenas.</w:t>
       </w:r>
     </w:p>
     <w:p>
@@ -5182,7 +5322,7 @@
           <w:sz w:val="21"/>
           <w:szCs w:val="21"/>
         </w:rPr>
-        <w:t xml:space="preserve"> no topo de cada prédio do baixo giro, que acende a coluna do item atual da zona (≈ R$ 1.000 para toda a operação).</w:t>
+        <w:t xml:space="preserve"> no topo de cada prédio, que acende a coluna do item atual da zona (≈ R$ 1.000 para toda a operação).</w:t>
       </w:r>
     </w:p>
     <w:p>
@@ -5202,7 +5342,7 @@
           <w:sz w:val="21"/>
           <w:szCs w:val="21"/>
         </w:rPr>
-        <w:t xml:space="preserve">O tamanho da zona é parâmetro do sistema (3, 4 ou 6 prédios) e pode ser ajustado no piloto conforme a produtividade medida.</w:t>
+        <w:t xml:space="preserve">O número de zonas por lado é parâmetro do sistema e pode ser ajustado no piloto conforme a produtividade medida.</w:t>
       </w:r>
     </w:p>
     <w:p>
@@ -9958,7 +10098,7 @@
                 <w:sz w:val="18"/>
                 <w:szCs w:val="18"/>
               </w:rPr>
-              <w:t xml:space="preserve">R$ 270 mil</w:t>
+              <w:t xml:space="preserve">R$ 284 mil</w:t>
             </w:r>
           </w:p>
         </w:tc>
@@ -9990,7 +10130,7 @@
                 <w:sz w:val="18"/>
                 <w:szCs w:val="18"/>
               </w:rPr>
-              <w:t xml:space="preserve">R$ 293 mil</w:t>
+              <w:t xml:space="preserve">R$ 308 mil</w:t>
             </w:r>
           </w:p>
         </w:tc>
@@ -14569,7 +14709,7 @@
                 <w:sz w:val="18"/>
                 <w:szCs w:val="18"/>
               </w:rPr>
-              <w:t xml:space="preserve">4 + 6 = 10</w:t>
+              <w:t xml:space="preserve">4 + 8 = 12</w:t>
             </w:r>
           </w:p>
         </w:tc>
@@ -14601,7 +14741,7 @@
                 <w:sz w:val="18"/>
                 <w:szCs w:val="18"/>
               </w:rPr>
-              <w:t xml:space="preserve">20</w:t>
+              <w:t xml:space="preserve">24</w:t>
             </w:r>
           </w:p>
         </w:tc>
@@ -14633,7 +14773,7 @@
                 <w:sz w:val="18"/>
                 <w:szCs w:val="18"/>
               </w:rPr>
-              <w:t xml:space="preserve">408</w:t>
+              <w:t xml:space="preserve">485</w:t>
             </w:r>
           </w:p>
         </w:tc>
@@ -15637,7 +15777,7 @@
                 <w:sz w:val="18"/>
                 <w:szCs w:val="18"/>
               </w:rPr>
-              <w:t xml:space="preserve">≈ R$ 199 mil</w:t>
+              <w:t xml:space="preserve">≈ R$ 211 mil</w:t>
             </w:r>
           </w:p>
         </w:tc>
@@ -15669,7 +15809,7 @@
                 <w:sz w:val="18"/>
                 <w:szCs w:val="18"/>
               </w:rPr>
-              <w:t xml:space="preserve">≈ R$ 197 mil (economia nos reguladores compensada pelo cabo de força)</w:t>
+              <w:t xml:space="preserve">≈ R$ 208 mil (economia nos reguladores compensada pelo cabo de força)</w:t>
             </w:r>
           </w:p>
         </w:tc>
@@ -16972,7 +17112,7 @@
                 <w:sz w:val="18"/>
                 <w:szCs w:val="18"/>
               </w:rPr>
-              <w:t xml:space="preserve">R$ 10.994</w:t>
+              <w:t xml:space="preserve">R$ 11.668</w:t>
             </w:r>
           </w:p>
         </w:tc>
@@ -17004,7 +17144,7 @@
                 <w:sz w:val="18"/>
                 <w:szCs w:val="18"/>
               </w:rPr>
-              <w:t xml:space="preserve">R$ 199.239</w:t>
+              <w:t xml:space="preserve">R$ 210.829</w:t>
             </w:r>
           </w:p>
         </w:tc>
@@ -17036,7 +17176,7 @@
                 <w:sz w:val="18"/>
                 <w:szCs w:val="18"/>
               </w:rPr>
-              <w:t xml:space="preserve">R$ 4.981</w:t>
+              <w:t xml:space="preserve">R$ 5.271</w:t>
             </w:r>
           </w:p>
         </w:tc>
@@ -17102,7 +17242,7 @@
                 <w:sz w:val="18"/>
                 <w:szCs w:val="18"/>
               </w:rPr>
-              <w:t xml:space="preserve">R$ 10.873</w:t>
+              <w:t xml:space="preserve">R$ 11.508</w:t>
             </w:r>
           </w:p>
         </w:tc>
@@ -17134,7 +17274,7 @@
                 <w:sz w:val="18"/>
                 <w:szCs w:val="18"/>
               </w:rPr>
-              <w:t xml:space="preserve">R$ 196.956</w:t>
+              <w:t xml:space="preserve">R$ 207.866</w:t>
             </w:r>
           </w:p>
         </w:tc>
@@ -17166,7 +17306,7 @@
                 <w:sz w:val="18"/>
                 <w:szCs w:val="18"/>
               </w:rPr>
-              <w:t xml:space="preserve">R$ 4.924</w:t>
+              <w:t xml:space="preserve">R$ 5.197</w:t>
             </w:r>
           </w:p>
         </w:tc>
@@ -17232,7 +17372,7 @@
                 <w:sz w:val="18"/>
                 <w:szCs w:val="18"/>
               </w:rPr>
-              <w:t xml:space="preserve">R$ 14.566</w:t>
+              <w:t xml:space="preserve">R$ 15.415</w:t>
             </w:r>
           </w:p>
         </w:tc>
@@ -17264,7 +17404,7 @@
                 <w:sz w:val="18"/>
                 <w:szCs w:val="18"/>
               </w:rPr>
-              <w:t xml:space="preserve">R$ 269.764</w:t>
+              <w:t xml:space="preserve">R$ 284.323</w:t>
             </w:r>
           </w:p>
         </w:tc>
@@ -17296,7 +17436,7 @@
                 <w:sz w:val="18"/>
                 <w:szCs w:val="18"/>
               </w:rPr>
-              <w:t xml:space="preserve">R$ 6.744</w:t>
+              <w:t xml:space="preserve">R$ 7.108</w:t>
             </w:r>
           </w:p>
         </w:tc>
@@ -17362,7 +17502,7 @@
                 <w:sz w:val="18"/>
                 <w:szCs w:val="18"/>
               </w:rPr>
-              <w:t xml:space="preserve">R$ 32.808</w:t>
+              <w:t xml:space="preserve">R$ 34.027</w:t>
             </w:r>
           </w:p>
         </w:tc>
@@ -17394,7 +17534,7 @@
                 <w:sz w:val="18"/>
                 <w:szCs w:val="18"/>
               </w:rPr>
-              <w:t xml:space="preserve">R$ 347.860</w:t>
+              <w:t xml:space="preserve">R$ 368.696</w:t>
             </w:r>
           </w:p>
         </w:tc>
@@ -17426,7 +17566,7 @@
                 <w:sz w:val="18"/>
                 <w:szCs w:val="18"/>
               </w:rPr>
-              <w:t xml:space="preserve">R$ 8.697</w:t>
+              <w:t xml:space="preserve">R$ 9.217</w:t>
             </w:r>
           </w:p>
         </w:tc>
@@ -17492,7 +17632,7 @@
                 <w:sz w:val="18"/>
                 <w:szCs w:val="18"/>
               </w:rPr>
-              <w:t xml:space="preserve">R$ 43.196</w:t>
+              <w:t xml:space="preserve">R$ 46.363</w:t>
             </w:r>
           </w:p>
         </w:tc>
@@ -17524,7 +17664,7 @@
                 <w:sz w:val="18"/>
                 <w:szCs w:val="18"/>
               </w:rPr>
-              <w:t xml:space="preserve">R$ 852.330</w:t>
+              <w:t xml:space="preserve">R$ 906.305</w:t>
             </w:r>
           </w:p>
         </w:tc>
@@ -17556,7 +17696,7 @@
                 <w:sz w:val="18"/>
                 <w:szCs w:val="18"/>
               </w:rPr>
-              <w:t xml:space="preserve">R$ 21.308</w:t>
+              <w:t xml:space="preserve">R$ 22.658</w:t>
             </w:r>
           </w:p>
         </w:tc>
@@ -17622,7 +17762,7 @@
                 <w:sz w:val="18"/>
                 <w:szCs w:val="18"/>
               </w:rPr>
-              <w:t xml:space="preserve">R$ 15.896</w:t>
+              <w:t xml:space="preserve">R$ 16.745</w:t>
             </w:r>
           </w:p>
         </w:tc>
@@ -17654,7 +17794,7 @@
                 <w:sz w:val="18"/>
                 <w:szCs w:val="18"/>
               </w:rPr>
-              <w:t xml:space="preserve">R$ 294.206</w:t>
+              <w:t xml:space="preserve">R$ 308.765</w:t>
             </w:r>
           </w:p>
         </w:tc>
@@ -17686,7 +17826,7 @@
                 <w:sz w:val="18"/>
                 <w:szCs w:val="18"/>
               </w:rPr>
-              <w:t xml:space="preserve">R$ 7.355</w:t>
+              <w:t xml:space="preserve">R$ 7.719</w:t>
             </w:r>
           </w:p>
         </w:tc>
@@ -17752,7 +17892,7 @@
                 <w:sz w:val="18"/>
                 <w:szCs w:val="18"/>
               </w:rPr>
-              <w:t xml:space="preserve">R$ 15.738</w:t>
+              <w:t xml:space="preserve">R$ 16.588</w:t>
             </w:r>
           </w:p>
         </w:tc>
@@ -17784,7 +17924,7 @@
                 <w:sz w:val="18"/>
                 <w:szCs w:val="18"/>
               </w:rPr>
-              <w:t xml:space="preserve">R$ 293.220</w:t>
+              <w:t xml:space="preserve">R$ 307.779</w:t>
             </w:r>
           </w:p>
         </w:tc>
@@ -17816,7 +17956,7 @@
                 <w:sz w:val="18"/>
                 <w:szCs w:val="18"/>
               </w:rPr>
-              <w:t xml:space="preserve">R$ 7.330</w:t>
+              <w:t xml:space="preserve">R$ 7.694</w:t>
             </w:r>
           </w:p>
         </w:tc>
@@ -21097,7 +21237,7 @@
                 <w:sz w:val="16"/>
                 <w:szCs w:val="16"/>
               </w:rPr>
-              <w:t xml:space="preserve">3</w:t>
+              <w:t xml:space="preserve">4</w:t>
             </w:r>
           </w:p>
         </w:tc>
@@ -21131,7 +21271,7 @@
                 <w:sz w:val="16"/>
                 <w:szCs w:val="16"/>
               </w:rPr>
-              <w:t xml:space="preserve">7</w:t>
+              <w:t xml:space="preserve">8</w:t>
             </w:r>
           </w:p>
         </w:tc>
@@ -21405,7 +21545,7 @@
                 <w:sz w:val="16"/>
                 <w:szCs w:val="16"/>
               </w:rPr>
-              <w:t xml:space="preserve">6</w:t>
+              <w:t xml:space="preserve">8</w:t>
             </w:r>
           </w:p>
         </w:tc>
@@ -21439,7 +21579,7 @@
                 <w:sz w:val="16"/>
                 <w:szCs w:val="16"/>
               </w:rPr>
-              <w:t xml:space="preserve">10</w:t>
+              <w:t xml:space="preserve">12</w:t>
             </w:r>
           </w:p>
         </w:tc>
@@ -21713,7 +21853,7 @@
                 <w:sz w:val="16"/>
                 <w:szCs w:val="16"/>
               </w:rPr>
-              <w:t xml:space="preserve">6</w:t>
+              <w:t xml:space="preserve">8</w:t>
             </w:r>
           </w:p>
         </w:tc>
@@ -21747,7 +21887,7 @@
                 <w:sz w:val="16"/>
                 <w:szCs w:val="16"/>
               </w:rPr>
-              <w:t xml:space="preserve">10</w:t>
+              <w:t xml:space="preserve">12</w:t>
             </w:r>
           </w:p>
         </w:tc>
@@ -22021,7 +22161,7 @@
                 <w:sz w:val="16"/>
                 <w:szCs w:val="16"/>
               </w:rPr>
-              <w:t xml:space="preserve">6</w:t>
+              <w:t xml:space="preserve">8</w:t>
             </w:r>
           </w:p>
         </w:tc>
@@ -22055,7 +22195,7 @@
                 <w:sz w:val="16"/>
                 <w:szCs w:val="16"/>
               </w:rPr>
-              <w:t xml:space="preserve">10</w:t>
+              <w:t xml:space="preserve">12</w:t>
             </w:r>
           </w:p>
         </w:tc>
@@ -22329,7 +22469,7 @@
                 <w:sz w:val="16"/>
                 <w:szCs w:val="16"/>
               </w:rPr>
-              <w:t xml:space="preserve">6</w:t>
+              <w:t xml:space="preserve">8</w:t>
             </w:r>
           </w:p>
         </w:tc>
@@ -22363,7 +22503,7 @@
                 <w:sz w:val="16"/>
                 <w:szCs w:val="16"/>
               </w:rPr>
-              <w:t xml:space="preserve">10</w:t>
+              <w:t xml:space="preserve">12</w:t>
             </w:r>
           </w:p>
         </w:tc>
@@ -22637,7 +22777,7 @@
                 <w:sz w:val="16"/>
                 <w:szCs w:val="16"/>
               </w:rPr>
-              <w:t xml:space="preserve">6</w:t>
+              <w:t xml:space="preserve">8</w:t>
             </w:r>
           </w:p>
         </w:tc>
@@ -22671,7 +22811,7 @@
                 <w:sz w:val="16"/>
                 <w:szCs w:val="16"/>
               </w:rPr>
-              <w:t xml:space="preserve">10</w:t>
+              <w:t xml:space="preserve">12</w:t>
             </w:r>
           </w:p>
         </w:tc>
@@ -22945,7 +23085,7 @@
                 <w:sz w:val="16"/>
                 <w:szCs w:val="16"/>
               </w:rPr>
-              <w:t xml:space="preserve">7</w:t>
+              <w:t xml:space="preserve">9</w:t>
             </w:r>
           </w:p>
         </w:tc>
@@ -22979,7 +23119,7 @@
                 <w:sz w:val="16"/>
                 <w:szCs w:val="16"/>
               </w:rPr>
-              <w:t xml:space="preserve">11</w:t>
+              <w:t xml:space="preserve">13</w:t>
             </w:r>
           </w:p>
         </w:tc>
@@ -23253,7 +23393,7 @@
                 <w:sz w:val="16"/>
                 <w:szCs w:val="16"/>
               </w:rPr>
-              <w:t xml:space="preserve">7</w:t>
+              <w:t xml:space="preserve">9</w:t>
             </w:r>
           </w:p>
         </w:tc>
@@ -23287,7 +23427,7 @@
                 <w:sz w:val="16"/>
                 <w:szCs w:val="16"/>
               </w:rPr>
-              <w:t xml:space="preserve">11</w:t>
+              <w:t xml:space="preserve">13</w:t>
             </w:r>
           </w:p>
         </w:tc>
@@ -23561,7 +23701,7 @@
                 <w:sz w:val="16"/>
                 <w:szCs w:val="16"/>
               </w:rPr>
-              <w:t xml:space="preserve">6</w:t>
+              <w:t xml:space="preserve">8</w:t>
             </w:r>
           </w:p>
         </w:tc>
@@ -23595,7 +23735,7 @@
                 <w:sz w:val="16"/>
                 <w:szCs w:val="16"/>
               </w:rPr>
-              <w:t xml:space="preserve">10</w:t>
+              <w:t xml:space="preserve">12</w:t>
             </w:r>
           </w:p>
         </w:tc>
@@ -23869,7 +24009,7 @@
                 <w:sz w:val="16"/>
                 <w:szCs w:val="16"/>
               </w:rPr>
-              <w:t xml:space="preserve">6</w:t>
+              <w:t xml:space="preserve">8</w:t>
             </w:r>
           </w:p>
         </w:tc>
@@ -23903,7 +24043,7 @@
                 <w:sz w:val="16"/>
                 <w:szCs w:val="16"/>
               </w:rPr>
-              <w:t xml:space="preserve">10</w:t>
+              <w:t xml:space="preserve">12</w:t>
             </w:r>
           </w:p>
         </w:tc>
@@ -24177,7 +24317,7 @@
                 <w:sz w:val="16"/>
                 <w:szCs w:val="16"/>
               </w:rPr>
-              <w:t xml:space="preserve">6</w:t>
+              <w:t xml:space="preserve">8</w:t>
             </w:r>
           </w:p>
         </w:tc>
@@ -24211,7 +24351,7 @@
                 <w:sz w:val="16"/>
                 <w:szCs w:val="16"/>
               </w:rPr>
-              <w:t xml:space="preserve">10</w:t>
+              <w:t xml:space="preserve">12</w:t>
             </w:r>
           </w:p>
         </w:tc>
@@ -24485,7 +24625,7 @@
                 <w:sz w:val="16"/>
                 <w:szCs w:val="16"/>
               </w:rPr>
-              <w:t xml:space="preserve">6</w:t>
+              <w:t xml:space="preserve">8</w:t>
             </w:r>
           </w:p>
         </w:tc>
@@ -24519,7 +24659,7 @@
                 <w:sz w:val="16"/>
                 <w:szCs w:val="16"/>
               </w:rPr>
-              <w:t xml:space="preserve">10</w:t>
+              <w:t xml:space="preserve">12</w:t>
             </w:r>
           </w:p>
         </w:tc>
@@ -24793,7 +24933,7 @@
                 <w:sz w:val="16"/>
                 <w:szCs w:val="16"/>
               </w:rPr>
-              <w:t xml:space="preserve">7</w:t>
+              <w:t xml:space="preserve">9</w:t>
             </w:r>
           </w:p>
         </w:tc>
@@ -24827,7 +24967,7 @@
                 <w:sz w:val="16"/>
                 <w:szCs w:val="16"/>
               </w:rPr>
-              <w:t xml:space="preserve">11</w:t>
+              <w:t xml:space="preserve">13</w:t>
             </w:r>
           </w:p>
         </w:tc>
@@ -25101,7 +25241,7 @@
                 <w:sz w:val="16"/>
                 <w:szCs w:val="16"/>
               </w:rPr>
-              <w:t xml:space="preserve">7</w:t>
+              <w:t xml:space="preserve">9</w:t>
             </w:r>
           </w:p>
         </w:tc>
@@ -25135,7 +25275,7 @@
                 <w:sz w:val="16"/>
                 <w:szCs w:val="16"/>
               </w:rPr>
-              <w:t xml:space="preserve">11</w:t>
+              <w:t xml:space="preserve">13</w:t>
             </w:r>
           </w:p>
         </w:tc>
@@ -25409,7 +25549,7 @@
                 <w:sz w:val="16"/>
                 <w:szCs w:val="16"/>
               </w:rPr>
-              <w:t xml:space="preserve">6</w:t>
+              <w:t xml:space="preserve">8</w:t>
             </w:r>
           </w:p>
         </w:tc>
@@ -25443,7 +25583,7 @@
                 <w:sz w:val="16"/>
                 <w:szCs w:val="16"/>
               </w:rPr>
-              <w:t xml:space="preserve">10</w:t>
+              <w:t xml:space="preserve">12</w:t>
             </w:r>
           </w:p>
         </w:tc>
@@ -25717,7 +25857,7 @@
                 <w:sz w:val="16"/>
                 <w:szCs w:val="16"/>
               </w:rPr>
-              <w:t xml:space="preserve">6</w:t>
+              <w:t xml:space="preserve">8</w:t>
             </w:r>
           </w:p>
         </w:tc>
@@ -25751,7 +25891,7 @@
                 <w:sz w:val="16"/>
                 <w:szCs w:val="16"/>
               </w:rPr>
-              <w:t xml:space="preserve">10</w:t>
+              <w:t xml:space="preserve">12</w:t>
             </w:r>
           </w:p>
         </w:tc>
@@ -26025,7 +26165,7 @@
                 <w:sz w:val="16"/>
                 <w:szCs w:val="16"/>
               </w:rPr>
-              <w:t xml:space="preserve">6</w:t>
+              <w:t xml:space="preserve">8</w:t>
             </w:r>
           </w:p>
         </w:tc>
@@ -26059,7 +26199,7 @@
                 <w:sz w:val="16"/>
                 <w:szCs w:val="16"/>
               </w:rPr>
-              <w:t xml:space="preserve">10</w:t>
+              <w:t xml:space="preserve">12</w:t>
             </w:r>
           </w:p>
         </w:tc>
@@ -26333,7 +26473,7 @@
                 <w:sz w:val="16"/>
                 <w:szCs w:val="16"/>
               </w:rPr>
-              <w:t xml:space="preserve">6</w:t>
+              <w:t xml:space="preserve">8</w:t>
             </w:r>
           </w:p>
         </w:tc>
@@ -26367,7 +26507,7 @@
                 <w:sz w:val="16"/>
                 <w:szCs w:val="16"/>
               </w:rPr>
-              <w:t xml:space="preserve">10</w:t>
+              <w:t xml:space="preserve">12</w:t>
             </w:r>
           </w:p>
         </w:tc>
@@ -26641,7 +26781,7 @@
                 <w:sz w:val="16"/>
                 <w:szCs w:val="16"/>
               </w:rPr>
-              <w:t xml:space="preserve">6</w:t>
+              <w:t xml:space="preserve">8</w:t>
             </w:r>
           </w:p>
         </w:tc>
@@ -26675,7 +26815,7 @@
                 <w:sz w:val="16"/>
                 <w:szCs w:val="16"/>
               </w:rPr>
-              <w:t xml:space="preserve">10</w:t>
+              <w:t xml:space="preserve">12</w:t>
             </w:r>
           </w:p>
         </w:tc>
@@ -27257,7 +27397,7 @@
                 <w:sz w:val="16"/>
                 <w:szCs w:val="16"/>
               </w:rPr>
-              <w:t xml:space="preserve">6</w:t>
+              <w:t xml:space="preserve">8</w:t>
             </w:r>
           </w:p>
         </w:tc>
@@ -27291,7 +27431,7 @@
                 <w:sz w:val="16"/>
                 <w:szCs w:val="16"/>
               </w:rPr>
-              <w:t xml:space="preserve">10</w:t>
+              <w:t xml:space="preserve">12</w:t>
             </w:r>
           </w:p>
         </w:tc>
@@ -27565,7 +27705,7 @@
                 <w:sz w:val="16"/>
                 <w:szCs w:val="16"/>
               </w:rPr>
-              <w:t xml:space="preserve">6</w:t>
+              <w:t xml:space="preserve">8</w:t>
             </w:r>
           </w:p>
         </w:tc>
@@ -27599,7 +27739,7 @@
                 <w:sz w:val="16"/>
                 <w:szCs w:val="16"/>
               </w:rPr>
-              <w:t xml:space="preserve">10</w:t>
+              <w:t xml:space="preserve">12</w:t>
             </w:r>
           </w:p>
         </w:tc>
@@ -27873,7 +28013,7 @@
                 <w:sz w:val="16"/>
                 <w:szCs w:val="16"/>
               </w:rPr>
-              <w:t xml:space="preserve">6</w:t>
+              <w:t xml:space="preserve">8</w:t>
             </w:r>
           </w:p>
         </w:tc>
@@ -27907,7 +28047,7 @@
                 <w:sz w:val="16"/>
                 <w:szCs w:val="16"/>
               </w:rPr>
-              <w:t xml:space="preserve">10</w:t>
+              <w:t xml:space="preserve">12</w:t>
             </w:r>
           </w:p>
         </w:tc>
@@ -28181,7 +28321,7 @@
                 <w:sz w:val="16"/>
                 <w:szCs w:val="16"/>
               </w:rPr>
-              <w:t xml:space="preserve">6</w:t>
+              <w:t xml:space="preserve">8</w:t>
             </w:r>
           </w:p>
         </w:tc>
@@ -28215,7 +28355,7 @@
                 <w:sz w:val="16"/>
                 <w:szCs w:val="16"/>
               </w:rPr>
-              <w:t xml:space="preserve">10</w:t>
+              <w:t xml:space="preserve">12</w:t>
             </w:r>
           </w:p>
         </w:tc>
@@ -28489,7 +28629,7 @@
                 <w:sz w:val="16"/>
                 <w:szCs w:val="16"/>
               </w:rPr>
-              <w:t xml:space="preserve">6</w:t>
+              <w:t xml:space="preserve">8</w:t>
             </w:r>
           </w:p>
         </w:tc>
@@ -28523,7 +28663,7 @@
                 <w:sz w:val="16"/>
                 <w:szCs w:val="16"/>
               </w:rPr>
-              <w:t xml:space="preserve">10</w:t>
+              <w:t xml:space="preserve">12</w:t>
             </w:r>
           </w:p>
         </w:tc>
@@ -28797,7 +28937,7 @@
                 <w:sz w:val="16"/>
                 <w:szCs w:val="16"/>
               </w:rPr>
-              <w:t xml:space="preserve">6</w:t>
+              <w:t xml:space="preserve">8</w:t>
             </w:r>
           </w:p>
         </w:tc>
@@ -28831,7 +28971,7 @@
                 <w:sz w:val="16"/>
                 <w:szCs w:val="16"/>
               </w:rPr>
-              <w:t xml:space="preserve">10</w:t>
+              <w:t xml:space="preserve">12</w:t>
             </w:r>
           </w:p>
         </w:tc>
@@ -29105,7 +29245,7 @@
                 <w:sz w:val="16"/>
                 <w:szCs w:val="16"/>
               </w:rPr>
-              <w:t xml:space="preserve">9</w:t>
+              <w:t xml:space="preserve">11</w:t>
             </w:r>
           </w:p>
         </w:tc>
@@ -29139,7 +29279,7 @@
                 <w:sz w:val="16"/>
                 <w:szCs w:val="16"/>
               </w:rPr>
-              <w:t xml:space="preserve">13</w:t>
+              <w:t xml:space="preserve">15</w:t>
             </w:r>
           </w:p>
         </w:tc>
@@ -29413,7 +29553,7 @@
                 <w:sz w:val="16"/>
                 <w:szCs w:val="16"/>
               </w:rPr>
-              <w:t xml:space="preserve">9</w:t>
+              <w:t xml:space="preserve">11</w:t>
             </w:r>
           </w:p>
         </w:tc>
@@ -29447,7 +29587,7 @@
                 <w:sz w:val="16"/>
                 <w:szCs w:val="16"/>
               </w:rPr>
-              <w:t xml:space="preserve">13</w:t>
+              <w:t xml:space="preserve">15</w:t>
             </w:r>
           </w:p>
         </w:tc>
@@ -29721,7 +29861,7 @@
                 <w:sz w:val="16"/>
                 <w:szCs w:val="16"/>
               </w:rPr>
-              <w:t xml:space="preserve">6</w:t>
+              <w:t xml:space="preserve">8</w:t>
             </w:r>
           </w:p>
         </w:tc>
@@ -29755,7 +29895,7 @@
                 <w:sz w:val="16"/>
                 <w:szCs w:val="16"/>
               </w:rPr>
-              <w:t xml:space="preserve">10</w:t>
+              <w:t xml:space="preserve">12</w:t>
             </w:r>
           </w:p>
         </w:tc>
@@ -30029,7 +30169,7 @@
                 <w:sz w:val="16"/>
                 <w:szCs w:val="16"/>
               </w:rPr>
-              <w:t xml:space="preserve">6</w:t>
+              <w:t xml:space="preserve">8</w:t>
             </w:r>
           </w:p>
         </w:tc>
@@ -30063,7 +30203,7 @@
                 <w:sz w:val="16"/>
                 <w:szCs w:val="16"/>
               </w:rPr>
-              <w:t xml:space="preserve">10</w:t>
+              <w:t xml:space="preserve">12</w:t>
             </w:r>
           </w:p>
         </w:tc>
@@ -30337,7 +30477,7 @@
                 <w:sz w:val="16"/>
                 <w:szCs w:val="16"/>
               </w:rPr>
-              <w:t xml:space="preserve">6</w:t>
+              <w:t xml:space="preserve">8</w:t>
             </w:r>
           </w:p>
         </w:tc>
@@ -30371,7 +30511,7 @@
                 <w:sz w:val="16"/>
                 <w:szCs w:val="16"/>
               </w:rPr>
-              <w:t xml:space="preserve">10</w:t>
+              <w:t xml:space="preserve">12</w:t>
             </w:r>
           </w:p>
         </w:tc>
@@ -30645,7 +30785,7 @@
                 <w:sz w:val="16"/>
                 <w:szCs w:val="16"/>
               </w:rPr>
-              <w:t xml:space="preserve">6</w:t>
+              <w:t xml:space="preserve">8</w:t>
             </w:r>
           </w:p>
         </w:tc>
@@ -30679,7 +30819,7 @@
                 <w:sz w:val="16"/>
                 <w:szCs w:val="16"/>
               </w:rPr>
-              <w:t xml:space="preserve">10</w:t>
+              <w:t xml:space="preserve">12</w:t>
             </w:r>
           </w:p>
         </w:tc>
@@ -30953,7 +31093,7 @@
                 <w:sz w:val="16"/>
                 <w:szCs w:val="16"/>
               </w:rPr>
-              <w:t xml:space="preserve">9</w:t>
+              <w:t xml:space="preserve">11</w:t>
             </w:r>
           </w:p>
         </w:tc>
@@ -30987,7 +31127,7 @@
                 <w:sz w:val="16"/>
                 <w:szCs w:val="16"/>
               </w:rPr>
-              <w:t xml:space="preserve">13</w:t>
+              <w:t xml:space="preserve">15</w:t>
             </w:r>
           </w:p>
         </w:tc>
@@ -31261,7 +31401,7 @@
                 <w:sz w:val="16"/>
                 <w:szCs w:val="16"/>
               </w:rPr>
-              <w:t xml:space="preserve">9</w:t>
+              <w:t xml:space="preserve">11</w:t>
             </w:r>
           </w:p>
         </w:tc>
@@ -31295,7 +31435,7 @@
                 <w:sz w:val="16"/>
                 <w:szCs w:val="16"/>
               </w:rPr>
-              <w:t xml:space="preserve">13</w:t>
+              <w:t xml:space="preserve">15</w:t>
             </w:r>
           </w:p>
         </w:tc>
@@ -31569,7 +31709,7 @@
                 <w:sz w:val="16"/>
                 <w:szCs w:val="16"/>
               </w:rPr>
-              <w:t xml:space="preserve">6</w:t>
+              <w:t xml:space="preserve">8</w:t>
             </w:r>
           </w:p>
         </w:tc>
@@ -31603,7 +31743,7 @@
                 <w:sz w:val="16"/>
                 <w:szCs w:val="16"/>
               </w:rPr>
-              <w:t xml:space="preserve">10</w:t>
+              <w:t xml:space="preserve">12</w:t>
             </w:r>
           </w:p>
         </w:tc>
@@ -31877,7 +32017,7 @@
                 <w:sz w:val="16"/>
                 <w:szCs w:val="16"/>
               </w:rPr>
-              <w:t xml:space="preserve">6</w:t>
+              <w:t xml:space="preserve">8</w:t>
             </w:r>
           </w:p>
         </w:tc>
@@ -31911,7 +32051,7 @@
                 <w:sz w:val="16"/>
                 <w:szCs w:val="16"/>
               </w:rPr>
-              <w:t xml:space="preserve">10</w:t>
+              <w:t xml:space="preserve">12</w:t>
             </w:r>
           </w:p>
         </w:tc>
@@ -32185,7 +32325,7 @@
                 <w:sz w:val="16"/>
                 <w:szCs w:val="16"/>
               </w:rPr>
-              <w:t xml:space="preserve">6</w:t>
+              <w:t xml:space="preserve">8</w:t>
             </w:r>
           </w:p>
         </w:tc>
@@ -32219,7 +32359,7 @@
                 <w:sz w:val="16"/>
                 <w:szCs w:val="16"/>
               </w:rPr>
-              <w:t xml:space="preserve">10</w:t>
+              <w:t xml:space="preserve">12</w:t>
             </w:r>
           </w:p>
         </w:tc>
@@ -32493,7 +32633,7 @@
                 <w:sz w:val="16"/>
                 <w:szCs w:val="16"/>
               </w:rPr>
-              <w:t xml:space="preserve">6</w:t>
+              <w:t xml:space="preserve">8</w:t>
             </w:r>
           </w:p>
         </w:tc>
@@ -32527,7 +32667,7 @@
                 <w:sz w:val="16"/>
                 <w:szCs w:val="16"/>
               </w:rPr>
-              <w:t xml:space="preserve">10</w:t>
+              <w:t xml:space="preserve">12</w:t>
             </w:r>
           </w:p>
         </w:tc>
@@ -32801,7 +32941,7 @@
                 <w:sz w:val="16"/>
                 <w:szCs w:val="16"/>
               </w:rPr>
-              <w:t xml:space="preserve">6</w:t>
+              <w:t xml:space="preserve">8</w:t>
             </w:r>
           </w:p>
         </w:tc>
@@ -32835,7 +32975,7 @@
                 <w:sz w:val="16"/>
                 <w:szCs w:val="16"/>
               </w:rPr>
-              <w:t xml:space="preserve">10</w:t>
+              <w:t xml:space="preserve">12</w:t>
             </w:r>
           </w:p>
         </w:tc>
@@ -33109,7 +33249,7 @@
                 <w:sz w:val="16"/>
                 <w:szCs w:val="16"/>
               </w:rPr>
-              <w:t xml:space="preserve">6</w:t>
+              <w:t xml:space="preserve">8</w:t>
             </w:r>
           </w:p>
         </w:tc>
@@ -33143,7 +33283,7 @@
                 <w:sz w:val="16"/>
                 <w:szCs w:val="16"/>
               </w:rPr>
-              <w:t xml:space="preserve">10</w:t>
+              <w:t xml:space="preserve">12</w:t>
             </w:r>
           </w:p>
         </w:tc>
@@ -33425,7 +33565,7 @@
                 <w:sz w:val="16"/>
                 <w:szCs w:val="16"/>
               </w:rPr>
-              <w:t xml:space="preserve">248</w:t>
+              <w:t xml:space="preserve">325</w:t>
             </w:r>
           </w:p>
         </w:tc>
@@ -33460,7 +33600,7 @@
                 <w:sz w:val="16"/>
                 <w:szCs w:val="16"/>
               </w:rPr>
-              <w:t xml:space="preserve">408</w:t>
+              <w:t xml:space="preserve">485</w:t>
             </w:r>
           </w:p>
         </w:tc>
@@ -33696,7 +33836,7 @@
                 <w:sz w:val="18"/>
                 <w:szCs w:val="18"/>
               </w:rPr>
-              <w:t xml:space="preserve">Endereços com muita / pouca saída. Alto giro na frente do operador (prédios 001-010), com as esteiras passando por dentro entre os andares 3 e 4; baixo giro no corredor atrás do operador.</w:t>
+              <w:t xml:space="preserve">Endereços com muita / pouca saída. Alto giro na frente do operador (prédios 001-010), com a esteira de transporte passando por dentro entre os andares 3 e 4; baixo giro no corredor atrás do operador.</w:t>
             </w:r>
           </w:p>
         </w:tc>
@@ -33828,7 +33968,7 @@
                 <w:sz w:val="18"/>
                 <w:szCs w:val="18"/>
               </w:rPr>
-              <w:t xml:space="preserve">Esteira paralela à de transporte (≈ 20 cm entre elas), dentro do alto giro, onde a bacia fica durante a separação.</w:t>
+              <w:t xml:space="preserve">Esteira aberta na frente do alto giro, ≈ 20 cm da de transporte, onde a bacia fica durante a separação.</w:t>
             </w:r>
           </w:p>
         </w:tc>

</xml_diff>

<commit_message>
Revisa o orçamento completo do PTL
- Canaleta calculada pelo layout de cada estação (antes 24 m fixos)
- Barramento: 1 cabo por nó/E+Q + saídas do concentrador
- Itens que faltavam: alimentação e DPS do concentrador, tomadas novas,
  nobreak e mini rack dos switches, uplink, ferramentas e frete
- Botão metálico com anel de LED; instalação por quantidade com hora extra
- Treinamento de operadores e manutenção em todos os cenários
- B1 com 2 pulseiras por estação + carregador; B2 como nó do barramento
- T1 com montagem final dos módulos da EMS; cabo em cadeia de 1 m por Q
- Software a R$ 103,78/h (salário de mercado) + implantação do servidor
- Câmbio atualizado, contingência de 10% e investimento total no Resumo
- Documento (v1.2) e apresentação atualizados com os novos valores

Co-Authored-By: Claude Opus 5.5 <noreply@anthropic.com>
Claude-Session: https://claude.ai/code/session_01TBWA3G7ku1j3oTf4VMkLud
</commit_message>
<xml_diff>
--- a/projeto/entregaveis/Arquitetura_PTL_Documento_Tecnico.docx
+++ b/projeto/entregaveis/Arquitetura_PTL_Documento_Tecnico.docx
@@ -478,7 +478,7 @@
                 <w:sz w:val="18"/>
                 <w:szCs w:val="18"/>
               </w:rPr>
-              <w:t xml:space="preserve">1.1, de 26/10/2026, em revisão pela TI, arquitetura de software e diretoria</w:t>
+              <w:t xml:space="preserve">1.2, de 26/10/2026 (orçamento revisado), em revisão pela TI, arquitetura de software e diretoria</w:t>
             </w:r>
           </w:p>
         </w:tc>
@@ -7418,7 +7418,7 @@
                 <w:sz w:val="17"/>
                 <w:szCs w:val="17"/>
               </w:rPr>
-              <w:t xml:space="preserve">Display de 7 segmentos de 0,56" e botão de 16 mm com LED.</w:t>
+              <w:t xml:space="preserve">Display de 7 segmentos de 0,56" e botão metálico de 16 mm com anel de LED.</w:t>
             </w:r>
           </w:p>
         </w:tc>
@@ -8801,7 +8801,7 @@
                 <w:sz w:val="17"/>
                 <w:szCs w:val="17"/>
               </w:rPr>
-              <w:t xml:space="preserve">Leitor NFC sob a posição de pega na esteira de separação, ligado ao concentrador. Um painel LCD mostra a caixa e os itens que faltam; fecha com nova leitura ou com o botão FECHAR.</w:t>
+              <w:t xml:space="preserve">Leitor NFC sob a posição de pega na esteira de separação, ligado ao barramento da estação como mais um nó. Um painel LCD mostra a caixa e os itens que faltam; fecha com nova leitura ou com o botão FECHAR.</w:t>
             </w:r>
           </w:p>
         </w:tc>
@@ -9540,7 +9540,7 @@
                 <w:sz w:val="18"/>
                 <w:szCs w:val="18"/>
               </w:rPr>
-              <w:t xml:space="preserve">R$ 284 mil</w:t>
+              <w:t xml:space="preserve">R$ 364 mil</w:t>
             </w:r>
           </w:p>
         </w:tc>
@@ -9572,7 +9572,7 @@
                 <w:sz w:val="18"/>
                 <w:szCs w:val="18"/>
               </w:rPr>
-              <w:t xml:space="preserve">R$ 308 mil</w:t>
+              <w:t xml:space="preserve">R$ 391 mil</w:t>
             </w:r>
           </w:p>
         </w:tc>
@@ -9885,7 +9885,7 @@
           <w:sz w:val="18"/>
           <w:szCs w:val="18"/>
         </w:rPr>
-        <w:t xml:space="preserve">* Com mão de obra interna. O detalhamento está no item 12 e na planilha Orcamento_PTL.xlsx.</w:t>
+        <w:t xml:space="preserve">* Com mão de obra interna, instalação e treinamento, sem contingência. O detalhamento está no item 12 e na planilha Orcamento_PTL.xlsx.</w:t>
       </w:r>
     </w:p>
     <w:p>
@@ -14925,7 +14925,7 @@
                 <w:sz w:val="18"/>
                 <w:szCs w:val="18"/>
               </w:rPr>
-              <w:t xml:space="preserve">Custo das peças (operação completa)</w:t>
+              <w:t xml:space="preserve">Custo dos materiais (operação completa)</w:t>
             </w:r>
           </w:p>
         </w:tc>
@@ -14957,7 +14957,7 @@
                 <w:sz w:val="18"/>
                 <w:szCs w:val="18"/>
               </w:rPr>
-              <w:t xml:space="preserve">Cerca de R$ 211 mil</w:t>
+              <w:t xml:space="preserve">Cerca de R$ 266 mil</w:t>
             </w:r>
           </w:p>
         </w:tc>
@@ -14989,7 +14989,7 @@
                 <w:sz w:val="18"/>
                 <w:szCs w:val="18"/>
               </w:rPr>
-              <w:t xml:space="preserve">Cerca de R$ 208 mil; a economia nos reguladores vai para o cabo de força</w:t>
+              <w:t xml:space="preserve">Cerca de R$ 269 mil; o cabo de força extra custa mais do que os reguladores economizados</w:t>
             </w:r>
           </w:p>
         </w:tc>
@@ -15751,7 +15751,7 @@
                 <w:sz w:val="17"/>
                 <w:szCs w:val="17"/>
               </w:rPr>
-              <w:t xml:space="preserve">Custa cerca de três vezes mais; dependência do fornecedor.</w:t>
+              <w:t xml:space="preserve">Custa cerca de duas vezes e meia mais; dependência do fornecedor.</w:t>
             </w:r>
           </w:p>
         </w:tc>
@@ -15978,7 +15978,7 @@
           <w:sz w:val="21"/>
           <w:szCs w:val="21"/>
         </w:rPr>
-        <w:t xml:space="preserve">Treinamento de cerca de 30 minutos para operadores e de 4 horas para a manutenção.</w:t>
+        <w:t xml:space="preserve">Treinamento de cerca de 2 horas por operador, com prática na estação, e de 16 horas para a equipe de manutenção.</w:t>
       </w:r>
     </w:p>
     <w:p>
@@ -16003,7 +16003,7 @@
           <w:sz w:val="21"/>
           <w:szCs w:val="21"/>
         </w:rPr>
-        <w:t xml:space="preserve">Os valores de hardware estão na planilha Orcamento_PTL.xlsx, com preços pesquisados em lojas brasileiras em 23/10/2026. Os itens sem preço público aparecem como estimativa e precisam de cotação. Câmbio usado: US$ 1 = R$ 5,04. Fator de importação estimado: 1,9.</w:t>
+        <w:t xml:space="preserve">Os valores de hardware estão na planilha Orcamento_PTL.xlsx, com preços pesquisados em lojas brasileiras em 23 e 26/10/2026. Os itens sem preço público aparecem como estimativa e precisam de cotação. Câmbio usado: US$ 1 = R$ 5,04. Fator de importação estimado: 1,9.</w:t>
       </w:r>
     </w:p>
     <w:tbl>
@@ -16198,7 +16198,7 @@
                 <w:sz w:val="18"/>
                 <w:szCs w:val="18"/>
               </w:rPr>
-              <w:t xml:space="preserve">A interno, só peças (12 V)</w:t>
+              <w:t xml:space="preserve">A interno, só materiais (12 V)</w:t>
             </w:r>
           </w:p>
         </w:tc>
@@ -16230,7 +16230,7 @@
                 <w:sz w:val="18"/>
                 <w:szCs w:val="18"/>
               </w:rPr>
-              <w:t xml:space="preserve">R$ 11.668</w:t>
+              <w:t xml:space="preserve">R$ 16.707</w:t>
             </w:r>
           </w:p>
         </w:tc>
@@ -16262,7 +16262,7 @@
                 <w:sz w:val="18"/>
                 <w:szCs w:val="18"/>
               </w:rPr>
-              <w:t xml:space="preserve">R$ 210.829</w:t>
+              <w:t xml:space="preserve">R$ 266.040</w:t>
             </w:r>
           </w:p>
         </w:tc>
@@ -16294,7 +16294,7 @@
                 <w:sz w:val="18"/>
                 <w:szCs w:val="18"/>
               </w:rPr>
-              <w:t xml:space="preserve">R$ 5.271</w:t>
+              <w:t xml:space="preserve">R$ 6.651</w:t>
             </w:r>
           </w:p>
         </w:tc>
@@ -16328,7 +16328,7 @@
                 <w:sz w:val="18"/>
                 <w:szCs w:val="18"/>
               </w:rPr>
-              <w:t xml:space="preserve">A interno, só peças (5 V)</w:t>
+              <w:t xml:space="preserve">A interno, só materiais (5 V)</w:t>
             </w:r>
           </w:p>
         </w:tc>
@@ -16360,7 +16360,7 @@
                 <w:sz w:val="18"/>
                 <w:szCs w:val="18"/>
               </w:rPr>
-              <w:t xml:space="preserve">R$ 11.508</w:t>
+              <w:t xml:space="preserve">R$ 16.824</w:t>
             </w:r>
           </w:p>
         </w:tc>
@@ -16392,7 +16392,7 @@
                 <w:sz w:val="18"/>
                 <w:szCs w:val="18"/>
               </w:rPr>
-              <w:t xml:space="preserve">R$ 207.866</w:t>
+              <w:t xml:space="preserve">R$ 268.636</w:t>
             </w:r>
           </w:p>
         </w:tc>
@@ -16424,7 +16424,7 @@
                 <w:sz w:val="18"/>
                 <w:szCs w:val="18"/>
               </w:rPr>
-              <w:t xml:space="preserve">R$ 5.197</w:t>
+              <w:t xml:space="preserve">R$ 6.716</w:t>
             </w:r>
           </w:p>
         </w:tc>
@@ -16458,7 +16458,7 @@
                 <w:sz w:val="18"/>
                 <w:szCs w:val="18"/>
               </w:rPr>
-              <w:t xml:space="preserve">A interno, peças e mão de obra</w:t>
+              <w:t xml:space="preserve">A interno, materiais e mão de obra</w:t>
             </w:r>
           </w:p>
         </w:tc>
@@ -16490,7 +16490,7 @@
                 <w:sz w:val="18"/>
                 <w:szCs w:val="18"/>
               </w:rPr>
-              <w:t xml:space="preserve">R$ 15.415</w:t>
+              <w:t xml:space="preserve">R$ 22.204</w:t>
             </w:r>
           </w:p>
         </w:tc>
@@ -16522,7 +16522,7 @@
                 <w:sz w:val="18"/>
                 <w:szCs w:val="18"/>
               </w:rPr>
-              <w:t xml:space="preserve">R$ 284.323</w:t>
+              <w:t xml:space="preserve">R$ 364.094</w:t>
             </w:r>
           </w:p>
         </w:tc>
@@ -16554,7 +16554,7 @@
                 <w:sz w:val="18"/>
                 <w:szCs w:val="18"/>
               </w:rPr>
-              <w:t xml:space="preserve">R$ 7.108</w:t>
+              <w:t xml:space="preserve">R$ 9.102</w:t>
             </w:r>
           </w:p>
         </w:tc>
@@ -16620,7 +16620,7 @@
                 <w:sz w:val="18"/>
                 <w:szCs w:val="18"/>
               </w:rPr>
-              <w:t xml:space="preserve">R$ 34.027</w:t>
+              <w:t xml:space="preserve">R$ 38.859</w:t>
             </w:r>
           </w:p>
         </w:tc>
@@ -16652,7 +16652,7 @@
                 <w:sz w:val="18"/>
                 <w:szCs w:val="18"/>
               </w:rPr>
-              <w:t xml:space="preserve">R$ 368.696</w:t>
+              <w:t xml:space="preserve">R$ 412.582</w:t>
             </w:r>
           </w:p>
         </w:tc>
@@ -16684,7 +16684,7 @@
                 <w:sz w:val="18"/>
                 <w:szCs w:val="18"/>
               </w:rPr>
-              <w:t xml:space="preserve">R$ 9.217</w:t>
+              <w:t xml:space="preserve">R$ 10.315</w:t>
             </w:r>
           </w:p>
         </w:tc>
@@ -16750,7 +16750,7 @@
                 <w:sz w:val="18"/>
                 <w:szCs w:val="18"/>
               </w:rPr>
-              <w:t xml:space="preserve">R$ 46.363</w:t>
+              <w:t xml:space="preserve">R$ 50.447</w:t>
             </w:r>
           </w:p>
         </w:tc>
@@ -16782,7 +16782,7 @@
                 <w:sz w:val="18"/>
                 <w:szCs w:val="18"/>
               </w:rPr>
-              <w:t xml:space="preserve">R$ 906.305</w:t>
+              <w:t xml:space="preserve">R$ 936.605</w:t>
             </w:r>
           </w:p>
         </w:tc>
@@ -16814,7 +16814,7 @@
                 <w:sz w:val="18"/>
                 <w:szCs w:val="18"/>
               </w:rPr>
-              <w:t xml:space="preserve">R$ 22.658</w:t>
+              <w:t xml:space="preserve">R$ 23.415</w:t>
             </w:r>
           </w:p>
         </w:tc>
@@ -16880,7 +16880,7 @@
                 <w:sz w:val="18"/>
                 <w:szCs w:val="18"/>
               </w:rPr>
-              <w:t xml:space="preserve">R$ 16.745</w:t>
+              <w:t xml:space="preserve">R$ 23.964</w:t>
             </w:r>
           </w:p>
         </w:tc>
@@ -16912,7 +16912,7 @@
                 <w:sz w:val="18"/>
                 <w:szCs w:val="18"/>
               </w:rPr>
-              <w:t xml:space="preserve">R$ 308.765</w:t>
+              <w:t xml:space="preserve">R$ 397.134</w:t>
             </w:r>
           </w:p>
         </w:tc>
@@ -16944,7 +16944,7 @@
                 <w:sz w:val="18"/>
                 <w:szCs w:val="18"/>
               </w:rPr>
-              <w:t xml:space="preserve">R$ 7.719</w:t>
+              <w:t xml:space="preserve">R$ 9.928</w:t>
             </w:r>
           </w:p>
         </w:tc>
@@ -17010,7 +17010,7 @@
                 <w:sz w:val="18"/>
                 <w:szCs w:val="18"/>
               </w:rPr>
-              <w:t xml:space="preserve">R$ 16.588</w:t>
+              <w:t xml:space="preserve">R$ 23.542</w:t>
             </w:r>
           </w:p>
         </w:tc>
@@ -17042,7 +17042,7 @@
                 <w:sz w:val="18"/>
                 <w:szCs w:val="18"/>
               </w:rPr>
-              <w:t xml:space="preserve">R$ 307.779</w:t>
+              <w:t xml:space="preserve">R$ 390.862</w:t>
             </w:r>
           </w:p>
         </w:tc>
@@ -17074,7 +17074,7 @@
                 <w:sz w:val="18"/>
                 <w:szCs w:val="18"/>
               </w:rPr>
-              <w:t xml:space="preserve">R$ 7.694</w:t>
+              <w:t xml:space="preserve">R$ 9.772</w:t>
             </w:r>
           </w:p>
         </w:tc>
@@ -17090,7 +17090,33 @@
           <w:sz w:val="21"/>
           <w:szCs w:val="21"/>
         </w:rPr>
-        <w:t xml:space="preserve">Software, com desenvolvimento interno: cerca de 1.080 h para a Arquitetura A e 1.000 h para a B. A planilha usa R$ 60 por hora, valor que pode ser ajustado.</w:t>
+        <w:t xml:space="preserve">Os materiais incluem, além dos módulos: canaleta calculada pelo layout de cada estação (cerca de 42 m por estação), cabos, alimentação e protetor de surto dos concentradores, pontos de tomada novos onde faltar, switches com nobreak e mini rack, cabo de uplink, ferramentas de montagem e 5% de frete. A mão de obra inclui montagem, instalação fora do horário de separação (hora extra de 50%), comissionamento e treinamento.</w:t>
+      </w:r>
+    </w:p>
+    <w:p>
+      <w:pPr>
+        <w:spacing w:after="120" w:before="0" w:line="300"/>
+      </w:pPr>
+      <w:r>
+        <w:rPr>
+          <w:rFonts w:ascii="Arial" w:cs="Arial" w:eastAsia="Arial" w:hAnsi="Arial"/>
+          <w:sz w:val="21"/>
+          <w:szCs w:val="21"/>
+        </w:rPr>
+        <w:t xml:space="preserve">Software, com desenvolvimento interno: cerca de 1.104 h para a Arquitetura A e 1.024 h para a B, a R$ 103,78 por hora (salário médio de analista de desenvolvimento, R$ 8.458,30, salario.com.br, CBO 212405, com encargos), ou cerca de R$ 115 mil e R$ 106 mil. É custo da equipe interna, não desembolso novo, a menos que o desenvolvimento seja contratado.</w:t>
+      </w:r>
+    </w:p>
+    <w:p>
+      <w:pPr>
+        <w:spacing w:after="120" w:before="0" w:line="300"/>
+      </w:pPr>
+      <w:r>
+        <w:rPr>
+          <w:rFonts w:ascii="Arial" w:cs="Arial" w:eastAsia="Arial" w:hAnsi="Arial"/>
+          <w:sz w:val="21"/>
+          <w:szCs w:val="21"/>
+        </w:rPr>
+        <w:t xml:space="preserve">Com 10% de contingência sobre o hardware e somando o software, o investimento total fica em cerca de R$ 515 mil na Arquitetura A e R$ 536 mil na B2.</w:t>
       </w:r>
     </w:p>
     <w:p>
@@ -33769,7 +33795,7 @@
         <w:sz w:val="16"/>
         <w:szCs w:val="16"/>
       </w:rPr>
-      <w:t xml:space="preserve">Projeto Pick-to-Light · Documento de Arquitetura · versão 1.1</w:t>
+      <w:t xml:space="preserve">Projeto Pick-to-Light · Documento de Arquitetura · versão 1.2</w:t>
     </w:r>
   </w:p>
 </w:hdr>

</xml_diff>

<commit_message>
Layout pelo desenho, etiqueta 0.05.0421.A e interface de controle
- 3D: estação de 2,5 m, corredor de 1,2 m, prateleiras de 50 cm x 2 m,
  P015 na frente do bloco da direita e concentrador atrás da estação
- Endereços no formato da etiqueta (displays com ponto decimal,
  etiquetas nas caixas, telas, quadros RS-485 e demonstração)
- Falha de LED: mostra endereço, nó/porta ou E+Q, local e tipo
  (sem resposta, display sem ACK, botão travado), com destaque no 3D
- Cadastro de LED por endereço: tela + botão (módulo novo pisca CAd)
- Nova aba Controle no simulador unificado
- Corrige o nome do evento que era sobrescrito pelo tipo do módulo
  (botões e falhas não apareciam na tela de comunicação)
- Diagramas, documento (v1.3), apresentação e orçamento atualizados

Co-Authored-By: Claude Opus 5.5 <noreply@anthropic.com>
Claude-Session: https://claude.ai/code/session_01TBWA3G7ku1j3oTf4VMkLud
</commit_message>
<xml_diff>
--- a/projeto/entregaveis/Arquitetura_PTL_Documento_Tecnico.docx
+++ b/projeto/entregaveis/Arquitetura_PTL_Documento_Tecnico.docx
@@ -478,7 +478,7 @@
                 <w:sz w:val="18"/>
                 <w:szCs w:val="18"/>
               </w:rPr>
-              <w:t xml:space="preserve">1.2, de 26/10/2026 (orçamento revisado), em revisão pela TI, arquitetura de software e diretoria</w:t>
+              <w:t xml:space="preserve">1.3, de 26/10/2026 (layout do desenho, interface de controle e cadastro de LED), em revisão pela TI, arquitetura de software e diretoria</w:t>
             </w:r>
           </w:p>
         </w:tc>
@@ -1646,7 +1646,7 @@
           <w:sz w:val="21"/>
           <w:szCs w:val="21"/>
         </w:rPr>
-        <w:t xml:space="preserve">Os números vêm da tabela wms_endereco (esteiras 1 e 2), exportada em 23/10/2026: 7.981 endereços em 40 ruas, e cada rua é uma estação. A rua 90 (Marketing/Almoxarifado, 2 endereços) ficou de fora. O endereço tem 8 posições: bairro (1), rua (2), prédio (3), andar (1) e apartamento (1). Exemplo: 0050230A é a rua 05, prédio 023, andar 0.</w:t>
+        <w:t xml:space="preserve">Os números vêm da tabela wms_endereco (esteiras 1 e 2), exportada em 23/10/2026: 7.981 endereços em 40 ruas, e cada rua é uma estação. A rua 90 (Marketing/Almoxarifado, 2 endereços) ficou de fora. O endereço tem 8 posições: bairro (1), rua (2), prédio (3), andar (1) e apartamento (1). Exemplo: 0050230A é a rua 05, prédio 023, andar 0. Nas etiquetas, nos displays e nas telas ele aparece como 0.05.0230.A (bairro.rua.prédio+andar.apto).</w:t>
       </w:r>
     </w:p>
     <w:p>
@@ -2113,7 +2113,7 @@
                 <w:sz w:val="18"/>
                 <w:szCs w:val="18"/>
               </w:rPr>
-              <w:t xml:space="preserve">Início do lado direito do corredor (150 a 153)</w:t>
+              <w:t xml:space="preserve">Frente do bloco da direita, virada para a esteira (150 a 153)</w:t>
             </w:r>
           </w:p>
         </w:tc>
@@ -2538,7 +2538,7 @@
           <w:sz w:val="21"/>
           <w:szCs w:val="21"/>
         </w:rPr>
-        <w:t xml:space="preserve">O alto giro fica na frente do operador. A esteira de transporte passa por dentro dele, entre o andar 3 e o andar 4. A esteira de separação fica do lado de fora, aberta, uns 20 cm à frente da de transporte, com os endereços logo acima e logo abaixo dela. O corredor do baixo giro fica atrás do operador, perpendicular às esteiras. As prateleiras são alinhadas: os níveis são os mesmos em toda a estante.</w:t>
+        <w:t xml:space="preserve">O alto giro fica na frente do operador. A esteira de transporte passa por dentro dele, entre o andar 3 e o andar 4. A esteira de separação fica do lado de fora, aberta, uns 20 cm à frente da de transporte, com os endereços logo acima e logo abaixo dela. O corredor do baixo giro fica atrás do operador, perpendicular às esteiras. As prateleiras são alinhadas: os níveis são os mesmos em toda a estante. O concentrador fica atrás da estação, do outro lado do alto giro.</w:t>
       </w:r>
     </w:p>
     <w:p>
@@ -2618,7 +2618,7 @@
           <w:sz w:val="21"/>
           <w:szCs w:val="21"/>
         </w:rPr>
-        <w:t xml:space="preserve">No corredor, olhando a partir da esteira, o lado esquerdo tem os prédios 020 (ou 022) a 031 e o lado direito vai do 032 até o último. O percurso é em U: entra pelo lado esquerdo e volta pelo direito. O prédio 015 (150 a 153) é o primeiro do lado direito, na entrada do corredor.</w:t>
+        <w:t xml:space="preserve">No corredor, olhando a partir da esteira, o lado esquerdo tem os prédios 020 (ou 022) a 031 e o lado direito vai do 032 até o último. O percurso é em U: entra pelo lado esquerdo e volta pelo direito. O prédio 015 (150 a 153) fica na frente do bloco da direita, virado para a esteira, e entra na zona D1. A estação 03 também tem o 015 na tabela e ele entra como zona normal.</w:t>
       </w:r>
     </w:p>
     <w:p>
@@ -2638,7 +2638,27 @@
           <w:sz w:val="21"/>
           <w:szCs w:val="21"/>
         </w:rPr>
-        <w:t xml:space="preserve">Os blocos do baixo giro ficam de costas um para o outro: cada bloco tem um lado de uma estação e o outro lado da estação vizinha. A profundidade é de cerca de 2 m.</w:t>
+        <w:t xml:space="preserve">Medidas aproximadas (desenho de 26/10/2026): a frente do alto giro tem 2,5 m por estação (prédios de 25 cm); o corredor tem 1,2 m; as prateleiras têm 50 cm de profundidade e 2 m de comprimento, com 12 prédios de 8 andares por lado. Os 0,3 m que sobram ficam entre as prateleiras de estações vizinhas.</w:t>
+      </w:r>
+    </w:p>
+    <w:p>
+      <w:pPr>
+        <w:pStyle w:val="ListParagraph"/>
+        <w:numPr>
+          <w:ilvl w:val="0"/>
+          <w:numId w:val="2"/>
+        </w:numPr>
+        <w:spacing w:after="60" w:line="290"/>
+      </w:pPr>
+      <w:r>
+        <w:rPr>
+          <w:rFonts w:ascii="Arial" w:cs="Arial" w:eastAsia="Arial" w:hAnsi="Arial"/>
+          <w:b w:val="false"/>
+          <w:bCs w:val="false"/>
+          <w:sz w:val="21"/>
+          <w:szCs w:val="21"/>
+        </w:rPr>
+        <w:t xml:space="preserve">Concentrador atrás da estação: o barramento do alto giro sai direto para os nós de coluna, e o do baixo giro sobe e passa por cima das esteiras, numa eletrocalha, até o corredor.</w:t>
       </w:r>
     </w:p>
     <w:p>
@@ -4596,7 +4616,7 @@
           <w:sz w:val="21"/>
           <w:szCs w:val="21"/>
         </w:rPr>
-        <w:t xml:space="preserve">Com três prédios por zona, uma zona tem até 24 endereços. O display mostra prédio e andar, por exemplo P031 A2.</w:t>
+        <w:t xml:space="preserve">Com três prédios por zona, uma zona tem até 24 endereços. O display mostra o endereço como na etiqueta, por exemplo 0.05.0312.A, usando o ponto decimal dos dígitos.</w:t>
       </w:r>
     </w:p>
     <w:p>
@@ -9540,7 +9560,7 @@
                 <w:sz w:val="18"/>
                 <w:szCs w:val="18"/>
               </w:rPr>
-              <w:t xml:space="preserve">R$ 364 mil</w:t>
+              <w:t xml:space="preserve">R$ 356 mil</w:t>
             </w:r>
           </w:p>
         </w:tc>
@@ -9572,7 +9592,7 @@
                 <w:sz w:val="18"/>
                 <w:szCs w:val="18"/>
               </w:rPr>
-              <w:t xml:space="preserve">R$ 391 mil</w:t>
+              <w:t xml:space="preserve">R$ 383 mil</w:t>
             </w:r>
           </w:p>
         </w:tc>
@@ -11216,7 +11236,7 @@
                 <w:sz w:val="18"/>
                 <w:szCs w:val="18"/>
               </w:rPr>
-              <w:t xml:space="preserve">Módulo sem resposta</w:t>
+              <w:t xml:space="preserve">Falha de LED</w:t>
             </w:r>
           </w:p>
         </w:tc>
@@ -11248,7 +11268,7 @@
                 <w:sz w:val="18"/>
                 <w:szCs w:val="18"/>
               </w:rPr>
-              <w:t xml:space="preserve">O concentrador avisa o Serviço PTL, o coletor mostra o endereço e a quantidade daquele item e o painel gera alerta para a manutenção.</w:t>
+              <w:t xml:space="preserve">Módulo sem resposta, display sem ACK ou botão travado. O concentrador avisa o Serviço PTL com o endereço e o módulo (nó e porta, ou endereço RS-485); a interface de controle mostra qual LED falhou e onde ele fica; o coletor mostra o endereço e a quantidade daquele item.</w:t>
             </w:r>
           </w:p>
         </w:tc>
@@ -11763,7 +11783,7 @@
           <w:sz w:val="21"/>
           <w:szCs w:val="21"/>
         </w:rPr>
-        <w:t xml:space="preserve">O display de 8 dígitos mostra o endereço como "P031 A2" (prédio 031, andar 2). A rua não aparece porque é a própria estação.</w:t>
+        <w:t xml:space="preserve">O display de 8 dígitos mostra o endereço igual à etiqueta, "0.05.0312.A" (bairro 0, rua 05, prédio 031, andar 2, apartamento A). Os pontos usam o ponto decimal de cada dígito, então o endereço completo cabe nos 8 dígitos.</w:t>
       </w:r>
     </w:p>
     <w:p>
@@ -12305,6 +12325,204 @@
           </w:p>
         </w:tc>
       </w:tr>
+      <w:tr>
+        <w:tc>
+          <w:tcPr>
+            <w:tcW w:type="dxa" w:w="3304"/>
+            <w:tcBorders>
+              <w:top w:val="single" w:color="BFC7D2" w:sz="4"/>
+              <w:left w:val="single" w:color="BFC7D2" w:sz="4"/>
+              <w:bottom w:val="single" w:color="BFC7D2" w:sz="4"/>
+              <w:right w:val="single" w:color="BFC7D2" w:sz="4"/>
+            </w:tcBorders>
+            <w:tcMar>
+              <w:top w:type="dxa" w:w="60"/>
+              <w:left w:type="dxa" w:w="100"/>
+              <w:bottom w:type="dxa" w:w="60"/>
+              <w:right w:type="dxa" w:w="100"/>
+            </w:tcMar>
+            <w:vAlign w:val="center"/>
+          </w:tcPr>
+          <w:p>
+            <w:pPr>
+              <w:jc w:val="left"/>
+            </w:pPr>
+            <w:r>
+              <w:rPr>
+                <w:rFonts w:ascii="Arial" w:cs="Arial" w:eastAsia="Arial" w:hAnsi="Arial"/>
+                <w:color w:val="1C2430"/>
+                <w:sz w:val="18"/>
+                <w:szCs w:val="18"/>
+              </w:rPr>
+              <w:t xml:space="preserve">GET /v1/estacoes/{est}/leds</w:t>
+            </w:r>
+          </w:p>
+        </w:tc>
+        <w:tc>
+          <w:tcPr>
+            <w:tcW w:type="dxa" w:w="6334"/>
+            <w:tcBorders>
+              <w:top w:val="single" w:color="BFC7D2" w:sz="4"/>
+              <w:left w:val="single" w:color="BFC7D2" w:sz="4"/>
+              <w:bottom w:val="single" w:color="BFC7D2" w:sz="4"/>
+              <w:right w:val="single" w:color="BFC7D2" w:sz="4"/>
+            </w:tcBorders>
+            <w:tcMar>
+              <w:top w:type="dxa" w:w="60"/>
+              <w:left w:type="dxa" w:w="100"/>
+              <w:bottom w:type="dxa" w:w="60"/>
+              <w:right w:type="dxa" w:w="100"/>
+            </w:tcMar>
+            <w:vAlign w:val="center"/>
+          </w:tcPr>
+          <w:p>
+            <w:pPr>
+              <w:jc w:val="left"/>
+            </w:pPr>
+            <w:r>
+              <w:rPr>
+                <w:rFonts w:ascii="Arial" w:cs="Arial" w:eastAsia="Arial" w:hAnsi="Arial"/>
+                <w:color w:val="1C2430"/>
+                <w:sz w:val="18"/>
+                <w:szCs w:val="18"/>
+              </w:rPr>
+              <w:t xml:space="preserve">LEDs cadastrados por endereço: módulo, nó e porta ou endereço RS-485, serial e situação.</w:t>
+            </w:r>
+          </w:p>
+        </w:tc>
+      </w:tr>
+      <w:tr>
+        <w:tc>
+          <w:tcPr>
+            <w:tcW w:type="dxa" w:w="3304"/>
+            <w:tcBorders>
+              <w:top w:val="single" w:color="BFC7D2" w:sz="4"/>
+              <w:left w:val="single" w:color="BFC7D2" w:sz="4"/>
+              <w:bottom w:val="single" w:color="BFC7D2" w:sz="4"/>
+              <w:right w:val="single" w:color="BFC7D2" w:sz="4"/>
+            </w:tcBorders>
+            <w:tcMar>
+              <w:top w:type="dxa" w:w="60"/>
+              <w:left w:type="dxa" w:w="100"/>
+              <w:bottom w:type="dxa" w:w="60"/>
+              <w:right w:type="dxa" w:w="100"/>
+            </w:tcMar>
+            <w:vAlign w:val="center"/>
+          </w:tcPr>
+          <w:p>
+            <w:pPr>
+              <w:jc w:val="left"/>
+            </w:pPr>
+            <w:r>
+              <w:rPr>
+                <w:rFonts w:ascii="Arial" w:cs="Arial" w:eastAsia="Arial" w:hAnsi="Arial"/>
+                <w:color w:val="1C2430"/>
+                <w:sz w:val="18"/>
+                <w:szCs w:val="18"/>
+              </w:rPr>
+              <w:t xml:space="preserve">POST /v1/estacoes/{est}/cadastro</w:t>
+            </w:r>
+          </w:p>
+        </w:tc>
+        <w:tc>
+          <w:tcPr>
+            <w:tcW w:type="dxa" w:w="6334"/>
+            <w:tcBorders>
+              <w:top w:val="single" w:color="BFC7D2" w:sz="4"/>
+              <w:left w:val="single" w:color="BFC7D2" w:sz="4"/>
+              <w:bottom w:val="single" w:color="BFC7D2" w:sz="4"/>
+              <w:right w:val="single" w:color="BFC7D2" w:sz="4"/>
+            </w:tcBorders>
+            <w:tcMar>
+              <w:top w:type="dxa" w:w="60"/>
+              <w:left w:type="dxa" w:w="100"/>
+              <w:bottom w:type="dxa" w:w="60"/>
+              <w:right w:type="dxa" w:w="100"/>
+            </w:tcMar>
+            <w:vAlign w:val="center"/>
+          </w:tcPr>
+          <w:p>
+            <w:pPr>
+              <w:jc w:val="left"/>
+            </w:pPr>
+            <w:r>
+              <w:rPr>
+                <w:rFonts w:ascii="Arial" w:cs="Arial" w:eastAsia="Arial" w:hAnsi="Arial"/>
+                <w:color w:val="1C2430"/>
+                <w:sz w:val="18"/>
+                <w:szCs w:val="18"/>
+              </w:rPr>
+              <w:t xml:space="preserve">Inicia o cadastro de LED de um endereço {endereco}; DELETE na mesma rota cancela.</w:t>
+            </w:r>
+          </w:p>
+        </w:tc>
+      </w:tr>
+      <w:tr>
+        <w:tc>
+          <w:tcPr>
+            <w:tcW w:type="dxa" w:w="3304"/>
+            <w:tcBorders>
+              <w:top w:val="single" w:color="BFC7D2" w:sz="4"/>
+              <w:left w:val="single" w:color="BFC7D2" w:sz="4"/>
+              <w:bottom w:val="single" w:color="BFC7D2" w:sz="4"/>
+              <w:right w:val="single" w:color="BFC7D2" w:sz="4"/>
+            </w:tcBorders>
+            <w:tcMar>
+              <w:top w:type="dxa" w:w="60"/>
+              <w:left w:type="dxa" w:w="100"/>
+              <w:bottom w:type="dxa" w:w="60"/>
+              <w:right w:type="dxa" w:w="100"/>
+            </w:tcMar>
+            <w:vAlign w:val="center"/>
+          </w:tcPr>
+          <w:p>
+            <w:pPr>
+              <w:jc w:val="left"/>
+            </w:pPr>
+            <w:r>
+              <w:rPr>
+                <w:rFonts w:ascii="Arial" w:cs="Arial" w:eastAsia="Arial" w:hAnsi="Arial"/>
+                <w:color w:val="1C2430"/>
+                <w:sz w:val="18"/>
+                <w:szCs w:val="18"/>
+              </w:rPr>
+              <w:t xml:space="preserve">POST /v1/estacoes/{est}/identificar</w:t>
+            </w:r>
+          </w:p>
+        </w:tc>
+        <w:tc>
+          <w:tcPr>
+            <w:tcW w:type="dxa" w:w="6334"/>
+            <w:tcBorders>
+              <w:top w:val="single" w:color="BFC7D2" w:sz="4"/>
+              <w:left w:val="single" w:color="BFC7D2" w:sz="4"/>
+              <w:bottom w:val="single" w:color="BFC7D2" w:sz="4"/>
+              <w:right w:val="single" w:color="BFC7D2" w:sz="4"/>
+            </w:tcBorders>
+            <w:tcMar>
+              <w:top w:type="dxa" w:w="60"/>
+              <w:left w:type="dxa" w:w="100"/>
+              <w:bottom w:type="dxa" w:w="60"/>
+              <w:right w:type="dxa" w:w="100"/>
+            </w:tcMar>
+            <w:vAlign w:val="center"/>
+          </w:tcPr>
+          <w:p>
+            <w:pPr>
+              <w:jc w:val="left"/>
+            </w:pPr>
+            <w:r>
+              <w:rPr>
+                <w:rFonts w:ascii="Arial" w:cs="Arial" w:eastAsia="Arial" w:hAnsi="Arial"/>
+                <w:color w:val="1C2430"/>
+                <w:sz w:val="18"/>
+                <w:szCs w:val="18"/>
+              </w:rPr>
+              <w:t xml:space="preserve">Mostra 888 no LED do endereço por 3 s, para conferir a posição.</w:t>
+            </w:r>
+          </w:p>
+        </w:tc>
+      </w:tr>
     </w:tbl>
     <w:p>
       <w:pPr>
@@ -12536,7 +12754,7 @@
                 <w:sz w:val="18"/>
                 <w:szCs w:val="18"/>
               </w:rPr>
-              <w:t xml:space="preserve">CANCELAR {caixa} · CONFIG {mapa} · PING</w:t>
+              <w:t xml:space="preserve">CANCELAR {caixa} · CONFIG {mapa} · CONFIG CADASTRO {disp, porta} · CONFIG IDENTIFICAR {disp, porta} · PING</w:t>
             </w:r>
           </w:p>
         </w:tc>
@@ -12668,7 +12886,7 @@
                 <w:sz w:val="18"/>
                 <w:szCs w:val="18"/>
               </w:rPr>
-              <w:t xml:space="preserve">FALHA_MODULO {mod} · HEARTBEAT {uptime, temperatura, versão}</w:t>
+              <w:t xml:space="preserve">FALHA_MODULO {disp, porta, enderecos, falha} · CADASTRO_OK {disp, porta, serial} · HEARTBEAT {uptime, temperatura, versão}</w:t>
             </w:r>
           </w:p>
         </w:tc>
@@ -12789,7 +13007,7 @@
           <w:sz w:val="21"/>
           <w:szCs w:val="21"/>
         </w:rPr>
-        <w:t xml:space="preserve">Comandos: MOSTRAR (endereço, quantidade, modo), APAGAR, PISCAR, LER_BOTOES e AUTO_TESTE. O concentrador consulta todos os dispositivos a cada 50 ms.</w:t>
+        <w:t xml:space="preserve">Comandos: MOSTRAR (endereço em 8 caracteres + máscara dos pontos, quantidade, modo), APAGAR, PISCAR, LER_BOTOES, LER_STATUS (falhas por porta), AUTO_TESTE, IDENTIFICAR, MODO_CADASTRO e DEF_ENDERECO. O concentrador consulta todos os dispositivos a cada 50 ms.</w:t>
       </w:r>
     </w:p>
     <w:p>
@@ -13076,7 +13294,7 @@
                 <w:sz w:val="18"/>
                 <w:szCs w:val="18"/>
               </w:rPr>
-              <w:t xml:space="preserve">ptl_endereco_mapa</w:t>
+              <w:t xml:space="preserve">ptl_mapa_led</w:t>
             </w:r>
           </w:p>
         </w:tc>
@@ -13108,7 +13326,7 @@
                 <w:sz w:val="18"/>
                 <w:szCs w:val="18"/>
               </w:rPr>
-              <w:t xml:space="preserve">cd_endereco e o display correspondente (módulo Q ou zona)</w:t>
+              <w:t xml:space="preserve">cd_endereco, estação, tipo (Q ou E+Q), nó e porta ou endereço RS-485, serial, data e usuário do cadastro</w:t>
             </w:r>
           </w:p>
         </w:tc>
@@ -13306,7 +13524,73 @@
                 <w:sz w:val="18"/>
                 <w:szCs w:val="18"/>
               </w:rPr>
-              <w:t xml:space="preserve">Log de eventos e falhas, com prazo de retenção</w:t>
+              <w:t xml:space="preserve">Log de eventos, com prazo de retenção</w:t>
+            </w:r>
+          </w:p>
+        </w:tc>
+      </w:tr>
+      <w:tr>
+        <w:tc>
+          <w:tcPr>
+            <w:tcW w:type="dxa" w:w="2478"/>
+            <w:tcBorders>
+              <w:top w:val="single" w:color="BFC7D2" w:sz="4"/>
+              <w:left w:val="single" w:color="BFC7D2" w:sz="4"/>
+              <w:bottom w:val="single" w:color="BFC7D2" w:sz="4"/>
+              <w:right w:val="single" w:color="BFC7D2" w:sz="4"/>
+            </w:tcBorders>
+            <w:tcMar>
+              <w:top w:type="dxa" w:w="60"/>
+              <w:left w:type="dxa" w:w="100"/>
+              <w:bottom w:type="dxa" w:w="60"/>
+              <w:right w:type="dxa" w:w="100"/>
+            </w:tcMar>
+            <w:vAlign w:val="center"/>
+          </w:tcPr>
+          <w:p>
+            <w:pPr>
+              <w:jc w:val="left"/>
+            </w:pPr>
+            <w:r>
+              <w:rPr>
+                <w:rFonts w:ascii="Arial" w:cs="Arial" w:eastAsia="Arial" w:hAnsi="Arial"/>
+                <w:color w:val="1C2430"/>
+                <w:sz w:val="18"/>
+                <w:szCs w:val="18"/>
+              </w:rPr>
+              <w:t xml:space="preserve">ptl_evento_falha</w:t>
+            </w:r>
+          </w:p>
+        </w:tc>
+        <w:tc>
+          <w:tcPr>
+            <w:tcW w:type="dxa" w:w="7160"/>
+            <w:tcBorders>
+              <w:top w:val="single" w:color="BFC7D2" w:sz="4"/>
+              <w:left w:val="single" w:color="BFC7D2" w:sz="4"/>
+              <w:bottom w:val="single" w:color="BFC7D2" w:sz="4"/>
+              <w:right w:val="single" w:color="BFC7D2" w:sz="4"/>
+            </w:tcBorders>
+            <w:tcMar>
+              <w:top w:type="dxa" w:w="60"/>
+              <w:left w:type="dxa" w:w="100"/>
+              <w:bottom w:type="dxa" w:w="60"/>
+              <w:right w:type="dxa" w:w="100"/>
+            </w:tcMar>
+            <w:vAlign w:val="center"/>
+          </w:tcPr>
+          <w:p>
+            <w:pPr>
+              <w:jc w:val="left"/>
+            </w:pPr>
+            <w:r>
+              <w:rPr>
+                <w:rFonts w:ascii="Arial" w:cs="Arial" w:eastAsia="Arial" w:hAnsi="Arial"/>
+                <w:color w:val="1C2430"/>
+                <w:sz w:val="18"/>
+                <w:szCs w:val="18"/>
+              </w:rPr>
+              <w:t xml:space="preserve">Estação, cd_endereco, módulo, tipo de falha, abertura e solução</w:t>
             </w:r>
           </w:p>
         </w:tc>
@@ -13400,7 +13684,7 @@
         <w:rPr>
           <w:rFonts w:ascii="Arial" w:cs="Arial" w:eastAsia="Arial" w:hAnsi="Arial"/>
         </w:rPr>
-        <w:t xml:space="preserve">8.7 Painel de acompanhamento</w:t>
+        <w:t xml:space="preserve">8.7 Painel de acompanhamento e interface de controle</w:t>
       </w:r>
     </w:p>
     <w:p>
@@ -13461,6 +13745,46 @@
           <w:szCs w:val="21"/>
         </w:rPr>
         <w:t xml:space="preserve">Saúde do sistema: módulos sem resposta, concentradores sem comunicação, temperatura do gabinete e versão do firmware.</w:t>
+      </w:r>
+    </w:p>
+    <w:p>
+      <w:pPr>
+        <w:pStyle w:val="ListParagraph"/>
+        <w:numPr>
+          <w:ilvl w:val="0"/>
+          <w:numId w:val="2"/>
+        </w:numPr>
+        <w:spacing w:after="60" w:line="290"/>
+      </w:pPr>
+      <w:r>
+        <w:rPr>
+          <w:rFonts w:ascii="Arial" w:cs="Arial" w:eastAsia="Arial" w:hAnsi="Arial"/>
+          <w:b w:val="false"/>
+          <w:bCs w:val="false"/>
+          <w:sz w:val="21"/>
+          <w:szCs w:val="21"/>
+        </w:rPr>
+        <w:t xml:space="preserve">Interface de controle: quando um LED falha, mostra o endereço (por exemplo 0.05.0042.A), o módulo (nó 0x04, porta 3, ou E+Q 0x52), onde ele fica e o tipo de falha.</w:t>
+      </w:r>
+    </w:p>
+    <w:p>
+      <w:pPr>
+        <w:pStyle w:val="ListParagraph"/>
+        <w:numPr>
+          <w:ilvl w:val="0"/>
+          <w:numId w:val="2"/>
+        </w:numPr>
+        <w:spacing w:after="60" w:line="290"/>
+      </w:pPr>
+      <w:r>
+        <w:rPr>
+          <w:rFonts w:ascii="Arial" w:cs="Arial" w:eastAsia="Arial" w:hAnsi="Arial"/>
+          <w:b w:val="false"/>
+          <w:bCs w:val="false"/>
+          <w:sz w:val="21"/>
+          <w:szCs w:val="21"/>
+        </w:rPr>
+        <w:t xml:space="preserve">Cadastro de LED por endereço: tabela de todos os endereços com o LED de cada um, busca por endereço, teste (888) e cadastro na troca de módulo (item 11).</w:t>
       </w:r>
     </w:p>
     <w:p>
@@ -14473,7 +14797,7 @@
           <w:sz w:val="21"/>
           <w:szCs w:val="21"/>
         </w:rPr>
-        <w:t xml:space="preserve">Cada módulo e cada cabo têm etiqueta com o código do dispositivo, e o mapa de cada estação fica no Serviço PTL.</w:t>
+        <w:t xml:space="preserve">Cada módulo tem etiqueta com o endereço (0.05.0421.A) e, no E+Q, o serial. O vínculo entre LED e endereço fica na tabela ptl_mapa_led e é refeito pela interface de controle quando o módulo é trocado.</w:t>
       </w:r>
     </w:p>
     <w:p>
@@ -14957,7 +15281,7 @@
                 <w:sz w:val="18"/>
                 <w:szCs w:val="18"/>
               </w:rPr>
-              <w:t xml:space="preserve">Cerca de R$ 266 mil</w:t>
+              <w:t xml:space="preserve">Cerca de R$ 260 mil</w:t>
             </w:r>
           </w:p>
         </w:tc>
@@ -14989,7 +15313,7 @@
                 <w:sz w:val="18"/>
                 <w:szCs w:val="18"/>
               </w:rPr>
-              <w:t xml:space="preserve">Cerca de R$ 269 mil; o cabo de força extra custa mais do que os reguladores economizados</w:t>
+              <w:t xml:space="preserve">Cerca de R$ 263 mil; o cabo de força extra custa mais do que os reguladores economizados</w:t>
             </w:r>
           </w:p>
         </w:tc>
@@ -15958,7 +16282,47 @@
           <w:sz w:val="21"/>
           <w:szCs w:val="21"/>
         </w:rPr>
-        <w:t xml:space="preserve">Troca de módulo em três passos: desconectar, encaixar o reserva e conferir o teste no painel.</w:t>
+        <w:t xml:space="preserve">A falha chega na interface de controle com o endereço e o módulo. Dá para detectar módulo sem resposta, display do módulo Q desconectado, botão travado e cabo rompido; segmento queimado aparece no teste 8888.</w:t>
+      </w:r>
+    </w:p>
+    <w:p>
+      <w:pPr>
+        <w:pStyle w:val="ListParagraph"/>
+        <w:numPr>
+          <w:ilvl w:val="0"/>
+          <w:numId w:val="2"/>
+        </w:numPr>
+        <w:spacing w:after="60" w:line="290"/>
+      </w:pPr>
+      <w:r>
+        <w:rPr>
+          <w:rFonts w:ascii="Arial" w:cs="Arial" w:eastAsia="Arial" w:hAnsi="Arial"/>
+          <w:b w:val="false"/>
+          <w:bCs w:val="false"/>
+          <w:sz w:val="21"/>
+          <w:szCs w:val="21"/>
+        </w:rPr>
+        <w:t xml:space="preserve">Troca e cadastro: o técnico solta o RJ45 e encaixa o reserva, escolhe o endereço na tela (ou lê a etiqueta com o coletor), o módulo novo pisca CAd e ele aperta o botão desse módulo. O sistema grava o LED no endereço e o display volta ao item que estava aceso.</w:t>
+      </w:r>
+    </w:p>
+    <w:p>
+      <w:pPr>
+        <w:pStyle w:val="ListParagraph"/>
+        <w:numPr>
+          <w:ilvl w:val="0"/>
+          <w:numId w:val="2"/>
+        </w:numPr>
+        <w:spacing w:after="60" w:line="290"/>
+      </w:pPr>
+      <w:r>
+        <w:rPr>
+          <w:rFonts w:ascii="Arial" w:cs="Arial" w:eastAsia="Arial" w:hAnsi="Arial"/>
+          <w:b w:val="false"/>
+          <w:bCs w:val="false"/>
+          <w:sz w:val="21"/>
+          <w:szCs w:val="21"/>
+        </w:rPr>
+        <w:t xml:space="preserve">Módulo Q não tem microcontrolador, então é reconhecido pelo nó e pela porta. Módulo E+Q chega com o endereço de fábrica 0xF0 e recebe o endereço do antigo no cadastro.</w:t>
       </w:r>
     </w:p>
     <w:p>
@@ -15979,6 +16343,69 @@
           <w:szCs w:val="21"/>
         </w:rPr>
         <w:t xml:space="preserve">Treinamento de cerca de 2 horas por operador, com prática na estação, e de 16 horas para a equipe de manutenção.</w:t>
+      </w:r>
+    </w:p>
+    <w:p>
+      <w:pPr>
+        <w:spacing w:after="60" w:before="120"/>
+        <w:jc w:val="center"/>
+      </w:pPr>
+      <w:r>
+        <w:drawing>
+          <wp:inline distT="0" distB="0" distL="0" distR="0">
+            <wp:extent cx="6096000" cy="2600325"/>
+            <wp:effectExtent t="0" r="0" b="0" l="0"/>
+            <wp:docPr id="10" name="" descr="" title=""/>
+            <wp:cNvGraphicFramePr>
+              <a:graphicFrameLocks xmlns:a="http://schemas.openxmlformats.org/drawingml/2006/main" noChangeAspect="1"/>
+            </wp:cNvGraphicFramePr>
+            <a:graphic xmlns:a="http://schemas.openxmlformats.org/drawingml/2006/main">
+              <a:graphicData uri="http://schemas.openxmlformats.org/drawingml/2006/picture">
+                <pic:pic xmlns:pic="http://schemas.openxmlformats.org/drawingml/2006/picture">
+                  <pic:nvPicPr>
+                    <pic:cNvPr id="0" name="" descr=""/>
+                    <pic:cNvPicPr>
+                      <a:picLocks noChangeAspect="1" noChangeArrowheads="1"/>
+                    </pic:cNvPicPr>
+                  </pic:nvPicPr>
+                  <pic:blipFill>
+                    <a:blip r:embed="rId18" cstate="none"/>
+                    <a:srcRect/>
+                    <a:stretch>
+                      <a:fillRect/>
+                    </a:stretch>
+                  </pic:blipFill>
+                  <pic:spPr bwMode="auto">
+                    <a:xfrm>
+                      <a:off x="0" y="0"/>
+                      <a:ext cx="6096000" cy="2600325"/>
+                    </a:xfrm>
+                    <a:prstGeom prst="rect">
+                      <a:avLst/>
+                    </a:prstGeom>
+                  </pic:spPr>
+                </pic:pic>
+              </a:graphicData>
+            </a:graphic>
+          </wp:inline>
+        </w:drawing>
+      </w:r>
+    </w:p>
+    <w:p>
+      <w:pPr>
+        <w:spacing w:after="200"/>
+        <w:jc w:val="center"/>
+      </w:pPr>
+      <w:r>
+        <w:rPr>
+          <w:rFonts w:ascii="Arial" w:cs="Arial" w:eastAsia="Arial" w:hAnsi="Arial"/>
+          <w:i/>
+          <w:iCs/>
+          <w:color w:val="5B6675"/>
+          <w:sz w:val="18"/>
+          <w:szCs w:val="18"/>
+        </w:rPr>
+        <w:t xml:space="preserve">Figura 10. Aviso de falha e cadastro de LED por endereço</w:t>
       </w:r>
     </w:p>
     <w:p>
@@ -16230,7 +16657,7 @@
                 <w:sz w:val="18"/>
                 <w:szCs w:val="18"/>
               </w:rPr>
-              <w:t xml:space="preserve">R$ 16.707</w:t>
+              <w:t xml:space="preserve">R$ 16.431</w:t>
             </w:r>
           </w:p>
         </w:tc>
@@ -16262,7 +16689,7 @@
                 <w:sz w:val="18"/>
                 <w:szCs w:val="18"/>
               </w:rPr>
-              <w:t xml:space="preserve">R$ 266.040</w:t>
+              <w:t xml:space="preserve">R$ 260.373</w:t>
             </w:r>
           </w:p>
         </w:tc>
@@ -16294,7 +16721,7 @@
                 <w:sz w:val="18"/>
                 <w:szCs w:val="18"/>
               </w:rPr>
-              <w:t xml:space="preserve">R$ 6.651</w:t>
+              <w:t xml:space="preserve">R$ 6.509</w:t>
             </w:r>
           </w:p>
         </w:tc>
@@ -16360,7 +16787,7 @@
                 <w:sz w:val="18"/>
                 <w:szCs w:val="18"/>
               </w:rPr>
-              <w:t xml:space="preserve">R$ 16.824</w:t>
+              <w:t xml:space="preserve">R$ 16.548</w:t>
             </w:r>
           </w:p>
         </w:tc>
@@ -16392,7 +16819,7 @@
                 <w:sz w:val="18"/>
                 <w:szCs w:val="18"/>
               </w:rPr>
-              <w:t xml:space="preserve">R$ 268.636</w:t>
+              <w:t xml:space="preserve">R$ 262.970</w:t>
             </w:r>
           </w:p>
         </w:tc>
@@ -16424,7 +16851,7 @@
                 <w:sz w:val="18"/>
                 <w:szCs w:val="18"/>
               </w:rPr>
-              <w:t xml:space="preserve">R$ 6.716</w:t>
+              <w:t xml:space="preserve">R$ 6.574</w:t>
             </w:r>
           </w:p>
         </w:tc>
@@ -16490,7 +16917,7 @@
                 <w:sz w:val="18"/>
                 <w:szCs w:val="18"/>
               </w:rPr>
-              <w:t xml:space="preserve">R$ 22.204</w:t>
+              <w:t xml:space="preserve">R$ 21.806</w:t>
             </w:r>
           </w:p>
         </w:tc>
@@ -16522,7 +16949,7 @@
                 <w:sz w:val="18"/>
                 <w:szCs w:val="18"/>
               </w:rPr>
-              <w:t xml:space="preserve">R$ 364.094</w:t>
+              <w:t xml:space="preserve">R$ 355.914</w:t>
             </w:r>
           </w:p>
         </w:tc>
@@ -16554,7 +16981,7 @@
                 <w:sz w:val="18"/>
                 <w:szCs w:val="18"/>
               </w:rPr>
-              <w:t xml:space="preserve">R$ 9.102</w:t>
+              <w:t xml:space="preserve">R$ 8.898</w:t>
             </w:r>
           </w:p>
         </w:tc>
@@ -16620,7 +17047,7 @@
                 <w:sz w:val="18"/>
                 <w:szCs w:val="18"/>
               </w:rPr>
-              <w:t xml:space="preserve">R$ 38.859</w:t>
+              <w:t xml:space="preserve">R$ 38.473</w:t>
             </w:r>
           </w:p>
         </w:tc>
@@ -16652,7 +17079,7 @@
                 <w:sz w:val="18"/>
                 <w:szCs w:val="18"/>
               </w:rPr>
-              <w:t xml:space="preserve">R$ 412.582</w:t>
+              <w:t xml:space="preserve">R$ 404.672</w:t>
             </w:r>
           </w:p>
         </w:tc>
@@ -16684,7 +17111,7 @@
                 <w:sz w:val="18"/>
                 <w:szCs w:val="18"/>
               </w:rPr>
-              <w:t xml:space="preserve">R$ 10.315</w:t>
+              <w:t xml:space="preserve">R$ 10.117</w:t>
             </w:r>
           </w:p>
         </w:tc>
@@ -16750,7 +17177,7 @@
                 <w:sz w:val="18"/>
                 <w:szCs w:val="18"/>
               </w:rPr>
-              <w:t xml:space="preserve">R$ 50.447</w:t>
+              <w:t xml:space="preserve">R$ 50.062</w:t>
             </w:r>
           </w:p>
         </w:tc>
@@ -16782,7 +17209,7 @@
                 <w:sz w:val="18"/>
                 <w:szCs w:val="18"/>
               </w:rPr>
-              <w:t xml:space="preserve">R$ 936.605</w:t>
+              <w:t xml:space="preserve">R$ 928.695</w:t>
             </w:r>
           </w:p>
         </w:tc>
@@ -16814,7 +17241,7 @@
                 <w:sz w:val="18"/>
                 <w:szCs w:val="18"/>
               </w:rPr>
-              <w:t xml:space="preserve">R$ 23.415</w:t>
+              <w:t xml:space="preserve">R$ 23.217</w:t>
             </w:r>
           </w:p>
         </w:tc>
@@ -16880,7 +17307,7 @@
                 <w:sz w:val="18"/>
                 <w:szCs w:val="18"/>
               </w:rPr>
-              <w:t xml:space="preserve">R$ 23.964</w:t>
+              <w:t xml:space="preserve">R$ 23.566</w:t>
             </w:r>
           </w:p>
         </w:tc>
@@ -16912,7 +17339,7 @@
                 <w:sz w:val="18"/>
                 <w:szCs w:val="18"/>
               </w:rPr>
-              <w:t xml:space="preserve">R$ 397.134</w:t>
+              <w:t xml:space="preserve">R$ 388.954</w:t>
             </w:r>
           </w:p>
         </w:tc>
@@ -16944,7 +17371,7 @@
                 <w:sz w:val="18"/>
                 <w:szCs w:val="18"/>
               </w:rPr>
-              <w:t xml:space="preserve">R$ 9.928</w:t>
+              <w:t xml:space="preserve">R$ 9.724</w:t>
             </w:r>
           </w:p>
         </w:tc>
@@ -17010,7 +17437,7 @@
                 <w:sz w:val="18"/>
                 <w:szCs w:val="18"/>
               </w:rPr>
-              <w:t xml:space="preserve">R$ 23.542</w:t>
+              <w:t xml:space="preserve">R$ 23.144</w:t>
             </w:r>
           </w:p>
         </w:tc>
@@ -17042,7 +17469,7 @@
                 <w:sz w:val="18"/>
                 <w:szCs w:val="18"/>
               </w:rPr>
-              <w:t xml:space="preserve">R$ 390.862</w:t>
+              <w:t xml:space="preserve">R$ 382.682</w:t>
             </w:r>
           </w:p>
         </w:tc>
@@ -17074,7 +17501,7 @@
                 <w:sz w:val="18"/>
                 <w:szCs w:val="18"/>
               </w:rPr>
-              <w:t xml:space="preserve">R$ 9.772</w:t>
+              <w:t xml:space="preserve">R$ 9.567</w:t>
             </w:r>
           </w:p>
         </w:tc>
@@ -17090,7 +17517,7 @@
           <w:sz w:val="21"/>
           <w:szCs w:val="21"/>
         </w:rPr>
-        <w:t xml:space="preserve">Os materiais incluem, além dos módulos: canaleta calculada pelo layout de cada estação (cerca de 42 m por estação), cabos, alimentação e protetor de surto dos concentradores, pontos de tomada novos onde faltar, switches com nobreak e mini rack, cabo de uplink, ferramentas de montagem e 5% de frete. A mão de obra inclui montagem, instalação fora do horário de separação (hora extra de 50%), comissionamento e treinamento.</w:t>
+        <w:t xml:space="preserve">Os materiais incluem, além dos módulos: canaleta calculada pelo layout de cada estação (cerca de 27 m por estação, com as medidas do desenho), cabos, alimentação e protetor de surto dos concentradores, pontos de tomada novos onde faltar, switches com nobreak e mini rack, cabo de uplink, ferramentas de montagem e 5% de frete. A mão de obra inclui montagem, instalação fora do horário de separação (hora extra de 50%), comissionamento e treinamento.</w:t>
       </w:r>
     </w:p>
     <w:p>
@@ -17103,7 +17530,7 @@
           <w:sz w:val="21"/>
           <w:szCs w:val="21"/>
         </w:rPr>
-        <w:t xml:space="preserve">Software, com desenvolvimento interno: cerca de 1.104 h para a Arquitetura A e 1.024 h para a B, a R$ 103,78 por hora (salário médio de analista de desenvolvimento, R$ 8.458,30, salario.com.br, CBO 212405, com encargos), ou cerca de R$ 115 mil e R$ 106 mil. É custo da equipe interna, não desembolso novo, a menos que o desenvolvimento seja contratado.</w:t>
+        <w:t xml:space="preserve">Software, com desenvolvimento interno: cerca de 1.144 h para a Arquitetura A e 1.064 h para a B, a R$ 103,78 por hora (salário médio de analista de desenvolvimento, R$ 8.458,30, salario.com.br, CBO 212405, com encargos), ou cerca de R$ 119 mil e R$ 110 mil. Inclui a interface de controle com o cadastro de LED. É custo da equipe interna, não desembolso novo, a menos que o desenvolvimento seja contratado.</w:t>
       </w:r>
     </w:p>
     <w:p>
@@ -17116,7 +17543,7 @@
           <w:sz w:val="21"/>
           <w:szCs w:val="21"/>
         </w:rPr>
-        <w:t xml:space="preserve">Com 10% de contingência sobre o hardware e somando o software, o investimento total fica em cerca de R$ 515 mil na Arquitetura A e R$ 536 mil na B2.</w:t>
+        <w:t xml:space="preserve">Com 10% de contingência sobre o hardware e somando o software, o investimento total fica em cerca de R$ 510 mil na Arquitetura A e R$ 531 mil na B2.</w:t>
       </w:r>
     </w:p>
     <w:p>
@@ -18886,7 +19313,7 @@
                 <w:sz w:val="18"/>
                 <w:szCs w:val="18"/>
               </w:rPr>
-              <w:t xml:space="preserve">Medidas das estações (largura do prédio, altura dos andares, canaletas)</w:t>
+              <w:t xml:space="preserve">Confirmar altura dos andares, ponto de energia atrás das estações e passagem da eletrocalha por cima das esteiras</w:t>
             </w:r>
           </w:p>
         </w:tc>
@@ -18918,7 +19345,7 @@
                 <w:sz w:val="18"/>
                 <w:szCs w:val="18"/>
               </w:rPr>
-              <w:t xml:space="preserve">Operação</w:t>
+              <w:t xml:space="preserve">Operação / Manutenção</w:t>
             </w:r>
           </w:p>
         </w:tc>
@@ -33200,7 +33627,139 @@
                 <w:sz w:val="18"/>
                 <w:szCs w:val="18"/>
               </w:rPr>
-              <w:t xml:space="preserve">Controlador da estação, ligado à rede e aos barramentos de displays.</w:t>
+              <w:t xml:space="preserve">Controlador da estação, ligado à rede e aos barramentos de displays. Fica atrás da estação.</w:t>
+            </w:r>
+          </w:p>
+        </w:tc>
+      </w:tr>
+      <w:tr>
+        <w:tc>
+          <w:tcPr>
+            <w:tcW w:type="dxa" w:w="2478"/>
+            <w:tcBorders>
+              <w:top w:val="single" w:color="BFC7D2" w:sz="4"/>
+              <w:left w:val="single" w:color="BFC7D2" w:sz="4"/>
+              <w:bottom w:val="single" w:color="BFC7D2" w:sz="4"/>
+              <w:right w:val="single" w:color="BFC7D2" w:sz="4"/>
+            </w:tcBorders>
+            <w:tcMar>
+              <w:top w:type="dxa" w:w="60"/>
+              <w:left w:type="dxa" w:w="100"/>
+              <w:bottom w:type="dxa" w:w="60"/>
+              <w:right w:type="dxa" w:w="100"/>
+            </w:tcMar>
+            <w:vAlign w:val="center"/>
+          </w:tcPr>
+          <w:p>
+            <w:pPr>
+              <w:jc w:val="left"/>
+            </w:pPr>
+            <w:r>
+              <w:rPr>
+                <w:rFonts w:ascii="Arial" w:cs="Arial" w:eastAsia="Arial" w:hAnsi="Arial"/>
+                <w:color w:val="1C2430"/>
+                <w:sz w:val="18"/>
+                <w:szCs w:val="18"/>
+              </w:rPr>
+              <w:t xml:space="preserve">Etiqueta do endereço</w:t>
+            </w:r>
+          </w:p>
+        </w:tc>
+        <w:tc>
+          <w:tcPr>
+            <w:tcW w:type="dxa" w:w="7160"/>
+            <w:tcBorders>
+              <w:top w:val="single" w:color="BFC7D2" w:sz="4"/>
+              <w:left w:val="single" w:color="BFC7D2" w:sz="4"/>
+              <w:bottom w:val="single" w:color="BFC7D2" w:sz="4"/>
+              <w:right w:val="single" w:color="BFC7D2" w:sz="4"/>
+            </w:tcBorders>
+            <w:tcMar>
+              <w:top w:type="dxa" w:w="60"/>
+              <w:left w:type="dxa" w:w="100"/>
+              <w:bottom w:type="dxa" w:w="60"/>
+              <w:right w:type="dxa" w:w="100"/>
+            </w:tcMar>
+            <w:vAlign w:val="center"/>
+          </w:tcPr>
+          <w:p>
+            <w:pPr>
+              <w:jc w:val="left"/>
+            </w:pPr>
+            <w:r>
+              <w:rPr>
+                <w:rFonts w:ascii="Arial" w:cs="Arial" w:eastAsia="Arial" w:hAnsi="Arial"/>
+                <w:color w:val="1C2430"/>
+                <w:sz w:val="18"/>
+                <w:szCs w:val="18"/>
+              </w:rPr>
+              <w:t xml:space="preserve">Endereço no formato 0.05.0421.A: bairro, rua, prédio + andar e apartamento.</w:t>
+            </w:r>
+          </w:p>
+        </w:tc>
+      </w:tr>
+      <w:tr>
+        <w:tc>
+          <w:tcPr>
+            <w:tcW w:type="dxa" w:w="2478"/>
+            <w:tcBorders>
+              <w:top w:val="single" w:color="BFC7D2" w:sz="4"/>
+              <w:left w:val="single" w:color="BFC7D2" w:sz="4"/>
+              <w:bottom w:val="single" w:color="BFC7D2" w:sz="4"/>
+              <w:right w:val="single" w:color="BFC7D2" w:sz="4"/>
+            </w:tcBorders>
+            <w:tcMar>
+              <w:top w:type="dxa" w:w="60"/>
+              <w:left w:type="dxa" w:w="100"/>
+              <w:bottom w:type="dxa" w:w="60"/>
+              <w:right w:type="dxa" w:w="100"/>
+            </w:tcMar>
+            <w:vAlign w:val="center"/>
+          </w:tcPr>
+          <w:p>
+            <w:pPr>
+              <w:jc w:val="left"/>
+            </w:pPr>
+            <w:r>
+              <w:rPr>
+                <w:rFonts w:ascii="Arial" w:cs="Arial" w:eastAsia="Arial" w:hAnsi="Arial"/>
+                <w:color w:val="1C2430"/>
+                <w:sz w:val="18"/>
+                <w:szCs w:val="18"/>
+              </w:rPr>
+              <w:t xml:space="preserve">Cadastro de LED</w:t>
+            </w:r>
+          </w:p>
+        </w:tc>
+        <w:tc>
+          <w:tcPr>
+            <w:tcW w:type="dxa" w:w="7160"/>
+            <w:tcBorders>
+              <w:top w:val="single" w:color="BFC7D2" w:sz="4"/>
+              <w:left w:val="single" w:color="BFC7D2" w:sz="4"/>
+              <w:bottom w:val="single" w:color="BFC7D2" w:sz="4"/>
+              <w:right w:val="single" w:color="BFC7D2" w:sz="4"/>
+            </w:tcBorders>
+            <w:tcMar>
+              <w:top w:type="dxa" w:w="60"/>
+              <w:left w:type="dxa" w:w="100"/>
+              <w:bottom w:type="dxa" w:w="60"/>
+              <w:right w:type="dxa" w:w="100"/>
+            </w:tcMar>
+            <w:vAlign w:val="center"/>
+          </w:tcPr>
+          <w:p>
+            <w:pPr>
+              <w:jc w:val="left"/>
+            </w:pPr>
+            <w:r>
+              <w:rPr>
+                <w:rFonts w:ascii="Arial" w:cs="Arial" w:eastAsia="Arial" w:hAnsi="Arial"/>
+                <w:color w:val="1C2430"/>
+                <w:sz w:val="18"/>
+                <w:szCs w:val="18"/>
+              </w:rPr>
+              <w:t xml:space="preserve">Vínculo entre o LED (nó e porta, ou módulo E+Q) e o endereço, feito na interface de controle com o botão do módulo novo.</w:t>
             </w:r>
           </w:p>
         </w:tc>
@@ -33795,7 +34354,7 @@
         <w:sz w:val="16"/>
         <w:szCs w:val="16"/>
       </w:rPr>
-      <w:t xml:space="preserve">Projeto Pick-to-Light · Documento de Arquitetura · versão 1.2</w:t>
+      <w:t xml:space="preserve">Projeto Pick-to-Light · Documento de Arquitetura · versão 1.3</w:t>
     </w:r>
   </w:p>
 </w:hdr>

</xml_diff>

<commit_message>
Andares 4-5 sob a separação, 2 zonas por lado, sinal de baixo giro
- Andares 4-5 do alto giro por baixo da esteira de separação, com 2 zonas
  (P001-P005 e P006-P010) e 1 display E+Q cada
- Baixo giro com 2 zonas por lado; E+Q por estação passa de 12 para 6
- P015 ocupa a frente do bloco inteiro (1 m); corredor de ~1,5 m
- Barra luminosa âmbar na frente do operador quando a caixa tem itens no
  baixo giro (SINAL_BG pela saída extra do nó do prédio 005)
- Câmera "Visão do operador" (altura dos olhos), além de "Atrás do operador"
- dados.js gerado por projeto/dados/gerar_dados_js.py
- Diagramas, documento (v1.4), apresentação e orçamento atualizados

Co-Authored-By: Claude Opus 5.5 <noreply@anthropic.com>
Claude-Session: https://claude.ai/code/session_01TBWA3G7ku1j3oTf4VMkLud
</commit_message>
<xml_diff>
--- a/projeto/entregaveis/Arquitetura_PTL_Documento_Tecnico.docx
+++ b/projeto/entregaveis/Arquitetura_PTL_Documento_Tecnico.docx
@@ -478,7 +478,7 @@
                 <w:sz w:val="18"/>
                 <w:szCs w:val="18"/>
               </w:rPr>
-              <w:t xml:space="preserve">1.3, de 26/10/2026 (layout do desenho, interface de controle e cadastro de LED), em revisão pela TI, arquitetura de software e diretoria</w:t>
+              <w:t xml:space="preserve">1.4, de 26/10/2026 (2 zonas por lado, andares 4-5 sob a separação, sinal de baixo giro), em revisão pela TI, arquitetura de software e diretoria</w:t>
             </w:r>
           </w:p>
         </w:tc>
@@ -2047,7 +2047,7 @@
                 <w:sz w:val="18"/>
                 <w:szCs w:val="18"/>
               </w:rPr>
-              <w:t xml:space="preserve">4 e 5, abaixo das esteiras</w:t>
+              <w:t xml:space="preserve">4 e 5, por baixo da esteira de separação</w:t>
             </w:r>
           </w:p>
         </w:tc>
@@ -2079,7 +2079,7 @@
                 <w:sz w:val="18"/>
                 <w:szCs w:val="18"/>
               </w:rPr>
-              <w:t xml:space="preserve">Quatro displays de endereço e quantidade: um por andar em cada lado (prédios 001 a 005 e 006 a 010), como no sistema atual</w:t>
+              <w:t xml:space="preserve">Duas zonas (prédios 001 a 005 e 006 a 010), cada uma com um display de endereço e quantidade para os andares 4 e 5</w:t>
             </w:r>
           </w:p>
         </w:tc>
@@ -2113,7 +2113,7 @@
                 <w:sz w:val="18"/>
                 <w:szCs w:val="18"/>
               </w:rPr>
-              <w:t xml:space="preserve">Frente do bloco da direita, virada para a esteira (150 a 153)</w:t>
+              <w:t xml:space="preserve">Frente do bloco inteiro (1 m), virada para a esteira (150 a 153)</w:t>
             </w:r>
           </w:p>
         </w:tc>
@@ -2353,7 +2353,7 @@
                 <w:sz w:val="18"/>
                 <w:szCs w:val="18"/>
               </w:rPr>
-              <w:t xml:space="preserve">Quatro zonas por lado, cada uma com um display de endereço e quantidade na altura dos olhos</w:t>
+              <w:t xml:space="preserve">Duas zonas por lado, cada uma com um display de endereço e quantidade na altura dos olhos</w:t>
             </w:r>
           </w:p>
         </w:tc>
@@ -2618,7 +2618,7 @@
           <w:sz w:val="21"/>
           <w:szCs w:val="21"/>
         </w:rPr>
-        <w:t xml:space="preserve">No corredor, olhando a partir da esteira, o lado esquerdo tem os prédios 020 (ou 022) a 031 e o lado direito vai do 032 até o último. O percurso é em U: entra pelo lado esquerdo e volta pelo direito. O prédio 015 (150 a 153) fica na frente do bloco da direita, virado para a esteira, e entra na zona D1. A estação 03 também tem o 015 na tabela e ele entra como zona normal.</w:t>
+        <w:t xml:space="preserve">No corredor, olhando a partir da esteira, o lado esquerdo tem os prédios 020 (ou 022) a 031 e o lado direito vai do 032 até o último. O percurso é em U: entra pelo lado esquerdo e volta pelo direito. O prédio 015 (150 a 153) ocupa a frente do bloco inteiro (as duas prateleiras de costas, cerca de 1 m), virado para a esteira, e entra na zona D1. A estação 03 também tem o 015 na tabela e ele entra como zona normal.</w:t>
       </w:r>
     </w:p>
     <w:p>
@@ -2638,7 +2638,47 @@
           <w:sz w:val="21"/>
           <w:szCs w:val="21"/>
         </w:rPr>
-        <w:t xml:space="preserve">Medidas aproximadas (desenho de 26/10/2026): a frente do alto giro tem 2,5 m por estação (prédios de 25 cm); o corredor tem 1,2 m; as prateleiras têm 50 cm de profundidade e 2 m de comprimento, com 12 prédios de 8 andares por lado. Os 0,3 m que sobram ficam entre as prateleiras de estações vizinhas.</w:t>
+        <w:t xml:space="preserve">Medidas aproximadas (desenho de 26/10/2026): a frente do alto giro tem 2,5 m por estação (prédios de 25 cm). No baixo giro, cada bloco tem duas prateleiras de 50 cm de costas (1 m), com 2 m de comprimento e 12 prédios de 8 andares por lado, e o corredor fica com cerca de 1,5 m.</w:t>
+      </w:r>
+    </w:p>
+    <w:p>
+      <w:pPr>
+        <w:pStyle w:val="ListParagraph"/>
+        <w:numPr>
+          <w:ilvl w:val="0"/>
+          <w:numId w:val="2"/>
+        </w:numPr>
+        <w:spacing w:after="60" w:line="290"/>
+      </w:pPr>
+      <w:r>
+        <w:rPr>
+          <w:rFonts w:ascii="Arial" w:cs="Arial" w:eastAsia="Arial" w:hAnsi="Arial"/>
+          <w:b w:val="false"/>
+          <w:bCs w:val="false"/>
+          <w:sz w:val="21"/>
+          <w:szCs w:val="21"/>
+        </w:rPr>
+        <w:t xml:space="preserve">Os andares 0 a 3 do alto giro ficam acima da esteira de transporte; os andares 4 e 5 ficam por baixo da esteira de separação, na frente do operador.</w:t>
+      </w:r>
+    </w:p>
+    <w:p>
+      <w:pPr>
+        <w:pStyle w:val="ListParagraph"/>
+        <w:numPr>
+          <w:ilvl w:val="0"/>
+          <w:numId w:val="2"/>
+        </w:numPr>
+        <w:spacing w:after="60" w:line="290"/>
+      </w:pPr>
+      <w:r>
+        <w:rPr>
+          <w:rFonts w:ascii="Arial" w:cs="Arial" w:eastAsia="Arial" w:hAnsi="Arial"/>
+          <w:b w:val="false"/>
+          <w:bCs w:val="false"/>
+          <w:sz w:val="21"/>
+          <w:szCs w:val="21"/>
+        </w:rPr>
+        <w:t xml:space="preserve">Sinal de baixo giro: uma barra luminosa âmbar na frente do alto giro, entre a esteira de transporte e o andar 3, acende quando a caixa tem itens no corredor e apaga quando o baixo giro termina. O operador não precisa ficar olhando para trás.</w:t>
       </w:r>
     </w:p>
     <w:p>
@@ -2804,7 +2844,7 @@
           <w:sz w:val="18"/>
           <w:szCs w:val="18"/>
         </w:rPr>
-        <w:t xml:space="preserve">Figura 2. Vista frontal da estação 05 com os 209 endereços da tabela e as 8 zonas do baixo giro</w:t>
+        <w:t xml:space="preserve">Figura 2. Vista frontal da estação 05 com os 209 endereços da tabela e as 4 zonas do baixo giro</w:t>
       </w:r>
     </w:p>
     <w:p>
@@ -3255,7 +3295,7 @@
                 <w:sz w:val="18"/>
                 <w:szCs w:val="18"/>
               </w:rPr>
-              <w:t xml:space="preserve">8</w:t>
+              <w:t xml:space="preserve">4</w:t>
             </w:r>
           </w:p>
         </w:tc>
@@ -3461,7 +3501,7 @@
                 <w:sz w:val="18"/>
                 <w:szCs w:val="18"/>
               </w:rPr>
-              <w:t xml:space="preserve">9</w:t>
+              <w:t xml:space="preserve">5</w:t>
             </w:r>
           </w:p>
         </w:tc>
@@ -3667,7 +3707,7 @@
                 <w:sz w:val="18"/>
                 <w:szCs w:val="18"/>
               </w:rPr>
-              <w:t xml:space="preserve">4 / 1</w:t>
+              <w:t xml:space="preserve">2 / 1</w:t>
             </w:r>
           </w:p>
         </w:tc>
@@ -3873,7 +3913,7 @@
                 <w:sz w:val="18"/>
                 <w:szCs w:val="18"/>
               </w:rPr>
-              <w:t xml:space="preserve">8</w:t>
+              <w:t xml:space="preserve">4</w:t>
             </w:r>
           </w:p>
         </w:tc>
@@ -4079,7 +4119,7 @@
                 <w:sz w:val="18"/>
                 <w:szCs w:val="18"/>
               </w:rPr>
-              <w:t xml:space="preserve">11</w:t>
+              <w:t xml:space="preserve">7</w:t>
             </w:r>
           </w:p>
         </w:tc>
@@ -4285,7 +4325,7 @@
                 <w:sz w:val="18"/>
                 <w:szCs w:val="18"/>
               </w:rPr>
-              <w:t xml:space="preserve">8</w:t>
+              <w:t xml:space="preserve">4</w:t>
             </w:r>
           </w:p>
         </w:tc>
@@ -4497,7 +4537,7 @@
                 <w:sz w:val="18"/>
                 <w:szCs w:val="18"/>
               </w:rPr>
-              <w:t xml:space="preserve">325</w:t>
+              <w:t xml:space="preserve">171</w:t>
             </w:r>
           </w:p>
         </w:tc>
@@ -4576,7 +4616,7 @@
           <w:sz w:val="21"/>
           <w:szCs w:val="21"/>
         </w:rPr>
-        <w:t xml:space="preserve">Cada lado do corredor tem quatro zonas de cerca de três prédios. Cada zona tem um display de endereço, um de quantidade e um botão, presos na longarina à altura dos olhos (cerca de 1,5 m), no meio da zona. Olhando um lado do corredor, o operador vê oito displays: quatro de endereço e quatro de quantidade. A zona mostra um item por vez, na ordem da rota. O botão confirma a retirada e o display passa ao item seguinte. Todas as zonas com itens trabalham ao mesmo tempo.</w:t>
+        <w:t xml:space="preserve">Cada lado do corredor tem duas zonas de cerca de seis prédios. Cada zona tem um display de endereço, um de quantidade e um botão, presos na longarina à altura dos olhos (cerca de 1,5 m), no meio da zona. A zona mostra um item por vez, na ordem da rota. O botão confirma a retirada e o display passa ao item seguinte. Todas as zonas com itens trabalham ao mesmo tempo. Os andares 4 e 5 do alto giro seguem a mesma lógica, com duas zonas (prédios 001 a 005 e 006 a 010).</w:t>
       </w:r>
     </w:p>
     <w:p>
@@ -4596,7 +4636,7 @@
           <w:sz w:val="21"/>
           <w:szCs w:val="21"/>
         </w:rPr>
-        <w:t xml:space="preserve">Estação comum: lado esquerdo 020 a 031 em quatro zonas (E1 a E4) e lado direito 015 e 043 a 032 em quatro zonas (D1 a D4), oito zonas no total. As esquinas têm zonas a mais, de quatro prédios.</w:t>
+        <w:t xml:space="preserve">Estação comum: lado esquerdo 020 a 031 em duas zonas (E1 e E2) e lado direito 015 e 043 a 032 em duas zonas (D1 e D2), quatro zonas no total. As esquinas têm zonas a mais, de quatro prédios.</w:t>
       </w:r>
     </w:p>
     <w:p>
@@ -4616,7 +4656,7 @@
           <w:sz w:val="21"/>
           <w:szCs w:val="21"/>
         </w:rPr>
-        <w:t xml:space="preserve">Com três prédios por zona, uma zona tem até 24 endereços. O display mostra o endereço como na etiqueta, por exemplo 0.05.0312.A, usando o ponto decimal dos dígitos.</w:t>
+        <w:t xml:space="preserve">Com seis prédios por zona, uma zona tem até 48 endereços. O display mostra o endereço como na etiqueta, por exemplo 0.05.0312.A, usando o ponto decimal dos dígitos.</w:t>
       </w:r>
     </w:p>
     <w:p>
@@ -7504,7 +7544,7 @@
                 <w:sz w:val="17"/>
                 <w:szCs w:val="17"/>
               </w:rPr>
-              <w:t xml:space="preserve">Endereço de 8 dígitos, quantidade de 3 dígitos e botão. Usado nos andares 4 e 5 (quatro por estação) e nas zonas do baixo giro.</w:t>
+              <w:t xml:space="preserve">Endereço de 8 dígitos, quantidade de 3 dígitos e botão. Usado nos andares 4 e 5 (dois por estação, um por zona) e nas zonas do baixo giro (dois por lado do corredor).</w:t>
             </w:r>
           </w:p>
         </w:tc>
@@ -9560,7 +9600,7 @@
                 <w:sz w:val="18"/>
                 <w:szCs w:val="18"/>
               </w:rPr>
-              <w:t xml:space="preserve">R$ 356 mil</w:t>
+              <w:t xml:space="preserve">R$ 305 mil</w:t>
             </w:r>
           </w:p>
         </w:tc>
@@ -9592,7 +9632,7 @@
                 <w:sz w:val="18"/>
                 <w:szCs w:val="18"/>
               </w:rPr>
-              <w:t xml:space="preserve">R$ 383 mil</w:t>
+              <w:t xml:space="preserve">R$ 332 mil</w:t>
             </w:r>
           </w:p>
         </w:tc>
@@ -13007,7 +13047,7 @@
           <w:sz w:val="21"/>
           <w:szCs w:val="21"/>
         </w:rPr>
-        <w:t xml:space="preserve">Comandos: MOSTRAR (endereço em 8 caracteres + máscara dos pontos, quantidade, modo), APAGAR, PISCAR, LER_BOTOES, LER_STATUS (falhas por porta), AUTO_TESTE, IDENTIFICAR, MODO_CADASTRO e DEF_ENDERECO. O concentrador consulta todos os dispositivos a cada 50 ms.</w:t>
+        <w:t xml:space="preserve">Comandos: MOSTRAR (endereço em 8 caracteres + máscara dos pontos, quantidade, modo), APAGAR, PISCAR, SINAL_BG (liga a luz de baixo giro pela saída extra do nó do prédio 005), LER_BOTOES, LER_STATUS (falhas por porta), AUTO_TESTE, IDENTIFICAR, MODO_CADASTRO e DEF_ENDERECO. O concentrador consulta todos os dispositivos a cada 50 ms.</w:t>
       </w:r>
     </w:p>
     <w:p>
@@ -14315,7 +14355,7 @@
                 <w:sz w:val="18"/>
                 <w:szCs w:val="18"/>
               </w:rPr>
-              <w:t xml:space="preserve">4 + 8 = 12</w:t>
+              <w:t xml:space="preserve">2 + 4 = 6</w:t>
             </w:r>
           </w:p>
         </w:tc>
@@ -14347,7 +14387,7 @@
                 <w:sz w:val="18"/>
                 <w:szCs w:val="18"/>
               </w:rPr>
-              <w:t xml:space="preserve">24</w:t>
+              <w:t xml:space="preserve">12</w:t>
             </w:r>
           </w:p>
         </w:tc>
@@ -14379,7 +14419,137 @@
                 <w:sz w:val="18"/>
                 <w:szCs w:val="18"/>
               </w:rPr>
-              <w:t xml:space="preserve">485</w:t>
+              <w:t xml:space="preserve">251</w:t>
+            </w:r>
+          </w:p>
+        </w:tc>
+      </w:tr>
+      <w:tr>
+        <w:tc>
+          <w:tcPr>
+            <w:tcW w:type="dxa" w:w="3480"/>
+            <w:tcBorders>
+              <w:top w:val="single" w:color="BFC7D2" w:sz="4"/>
+              <w:left w:val="single" w:color="BFC7D2" w:sz="4"/>
+              <w:bottom w:val="single" w:color="BFC7D2" w:sz="4"/>
+              <w:right w:val="single" w:color="BFC7D2" w:sz="4"/>
+            </w:tcBorders>
+            <w:tcMar>
+              <w:top w:type="dxa" w:w="60"/>
+              <w:left w:type="dxa" w:w="100"/>
+              <w:bottom w:type="dxa" w:w="60"/>
+              <w:right w:type="dxa" w:w="100"/>
+            </w:tcMar>
+            <w:vAlign w:val="center"/>
+          </w:tcPr>
+          <w:p>
+            <w:pPr>
+              <w:jc w:val="left"/>
+            </w:pPr>
+            <w:r>
+              <w:rPr>
+                <w:rFonts w:ascii="Arial" w:cs="Arial" w:eastAsia="Arial" w:hAnsi="Arial"/>
+                <w:color w:val="1C2430"/>
+                <w:sz w:val="18"/>
+                <w:szCs w:val="18"/>
+              </w:rPr>
+              <w:t xml:space="preserve">Sinal de baixo giro</w:t>
+            </w:r>
+          </w:p>
+        </w:tc>
+        <w:tc>
+          <w:tcPr>
+            <w:tcW w:type="dxa" w:w="2142"/>
+            <w:tcBorders>
+              <w:top w:val="single" w:color="BFC7D2" w:sz="4"/>
+              <w:left w:val="single" w:color="BFC7D2" w:sz="4"/>
+              <w:bottom w:val="single" w:color="BFC7D2" w:sz="4"/>
+              <w:right w:val="single" w:color="BFC7D2" w:sz="4"/>
+            </w:tcBorders>
+            <w:tcMar>
+              <w:top w:type="dxa" w:w="60"/>
+              <w:left w:type="dxa" w:w="100"/>
+              <w:bottom w:type="dxa" w:w="60"/>
+              <w:right w:type="dxa" w:w="100"/>
+            </w:tcMar>
+            <w:vAlign w:val="center"/>
+          </w:tcPr>
+          <w:p>
+            <w:pPr>
+              <w:jc w:val="right"/>
+            </w:pPr>
+            <w:r>
+              <w:rPr>
+                <w:rFonts w:ascii="Arial" w:cs="Arial" w:eastAsia="Arial" w:hAnsi="Arial"/>
+                <w:color w:val="1C2430"/>
+                <w:sz w:val="18"/>
+                <w:szCs w:val="18"/>
+              </w:rPr>
+              <w:t xml:space="preserve">1</w:t>
+            </w:r>
+          </w:p>
+        </w:tc>
+        <w:tc>
+          <w:tcPr>
+            <w:tcW w:type="dxa" w:w="1874"/>
+            <w:tcBorders>
+              <w:top w:val="single" w:color="BFC7D2" w:sz="4"/>
+              <w:left w:val="single" w:color="BFC7D2" w:sz="4"/>
+              <w:bottom w:val="single" w:color="BFC7D2" w:sz="4"/>
+              <w:right w:val="single" w:color="BFC7D2" w:sz="4"/>
+            </w:tcBorders>
+            <w:tcMar>
+              <w:top w:type="dxa" w:w="60"/>
+              <w:left w:type="dxa" w:w="100"/>
+              <w:bottom w:type="dxa" w:w="60"/>
+              <w:right w:type="dxa" w:w="100"/>
+            </w:tcMar>
+            <w:vAlign w:val="center"/>
+          </w:tcPr>
+          <w:p>
+            <w:pPr>
+              <w:jc w:val="right"/>
+            </w:pPr>
+            <w:r>
+              <w:rPr>
+                <w:rFonts w:ascii="Arial" w:cs="Arial" w:eastAsia="Arial" w:hAnsi="Arial"/>
+                <w:color w:val="1C2430"/>
+                <w:sz w:val="18"/>
+                <w:szCs w:val="18"/>
+              </w:rPr>
+              <w:t xml:space="preserve">2</w:t>
+            </w:r>
+          </w:p>
+        </w:tc>
+        <w:tc>
+          <w:tcPr>
+            <w:tcW w:type="dxa" w:w="2142"/>
+            <w:tcBorders>
+              <w:top w:val="single" w:color="BFC7D2" w:sz="4"/>
+              <w:left w:val="single" w:color="BFC7D2" w:sz="4"/>
+              <w:bottom w:val="single" w:color="BFC7D2" w:sz="4"/>
+              <w:right w:val="single" w:color="BFC7D2" w:sz="4"/>
+            </w:tcBorders>
+            <w:tcMar>
+              <w:top w:type="dxa" w:w="60"/>
+              <w:left w:type="dxa" w:w="100"/>
+              <w:bottom w:type="dxa" w:w="60"/>
+              <w:right w:type="dxa" w:w="100"/>
+            </w:tcMar>
+            <w:vAlign w:val="center"/>
+          </w:tcPr>
+          <w:p>
+            <w:pPr>
+              <w:jc w:val="right"/>
+            </w:pPr>
+            <w:r>
+              <w:rPr>
+                <w:rFonts w:ascii="Arial" w:cs="Arial" w:eastAsia="Arial" w:hAnsi="Arial"/>
+                <w:color w:val="1C2430"/>
+                <w:sz w:val="18"/>
+                <w:szCs w:val="18"/>
+              </w:rPr>
+              <w:t xml:space="preserve">40</w:t>
             </w:r>
           </w:p>
         </w:tc>
@@ -15281,7 +15451,7 @@
                 <w:sz w:val="18"/>
                 <w:szCs w:val="18"/>
               </w:rPr>
-              <w:t xml:space="preserve">Cerca de R$ 260 mil</w:t>
+              <w:t xml:space="preserve">Cerca de R$ 222 mil</w:t>
             </w:r>
           </w:p>
         </w:tc>
@@ -15313,7 +15483,7 @@
                 <w:sz w:val="18"/>
                 <w:szCs w:val="18"/>
               </w:rPr>
-              <w:t xml:space="preserve">Cerca de R$ 263 mil; o cabo de força extra custa mais do que os reguladores economizados</w:t>
+              <w:t xml:space="preserve">Cerca de R$ 227 mil; o cabo de força extra custa mais do que os reguladores economizados</w:t>
             </w:r>
           </w:p>
         </w:tc>
@@ -16657,7 +16827,7 @@
                 <w:sz w:val="18"/>
                 <w:szCs w:val="18"/>
               </w:rPr>
-              <w:t xml:space="preserve">R$ 16.431</w:t>
+              <w:t xml:space="preserve">R$ 14.511</w:t>
             </w:r>
           </w:p>
         </w:tc>
@@ -16689,7 +16859,7 @@
                 <w:sz w:val="18"/>
                 <w:szCs w:val="18"/>
               </w:rPr>
-              <w:t xml:space="preserve">R$ 260.373</w:t>
+              <w:t xml:space="preserve">R$ 222.483</w:t>
             </w:r>
           </w:p>
         </w:tc>
@@ -16721,7 +16891,7 @@
                 <w:sz w:val="18"/>
                 <w:szCs w:val="18"/>
               </w:rPr>
-              <w:t xml:space="preserve">R$ 6.509</w:t>
+              <w:t xml:space="preserve">R$ 5.562</w:t>
             </w:r>
           </w:p>
         </w:tc>
@@ -16787,7 +16957,7 @@
                 <w:sz w:val="18"/>
                 <w:szCs w:val="18"/>
               </w:rPr>
-              <w:t xml:space="preserve">R$ 16.548</w:t>
+              <w:t xml:space="preserve">R$ 14.732</w:t>
             </w:r>
           </w:p>
         </w:tc>
@@ -16819,7 +16989,7 @@
                 <w:sz w:val="18"/>
                 <w:szCs w:val="18"/>
               </w:rPr>
-              <w:t xml:space="preserve">R$ 262.970</w:t>
+              <w:t xml:space="preserve">R$ 227.135</w:t>
             </w:r>
           </w:p>
         </w:tc>
@@ -16851,7 +17021,7 @@
                 <w:sz w:val="18"/>
                 <w:szCs w:val="18"/>
               </w:rPr>
-              <w:t xml:space="preserve">R$ 6.574</w:t>
+              <w:t xml:space="preserve">R$ 5.678</w:t>
             </w:r>
           </w:p>
         </w:tc>
@@ -16917,7 +17087,7 @@
                 <w:sz w:val="18"/>
                 <w:szCs w:val="18"/>
               </w:rPr>
-              <w:t xml:space="preserve">R$ 21.806</w:t>
+              <w:t xml:space="preserve">R$ 19.211</w:t>
             </w:r>
           </w:p>
         </w:tc>
@@ -16949,7 +17119,7 @@
                 <w:sz w:val="18"/>
                 <w:szCs w:val="18"/>
               </w:rPr>
-              <w:t xml:space="preserve">R$ 355.914</w:t>
+              <w:t xml:space="preserve">R$ 304.755</w:t>
             </w:r>
           </w:p>
         </w:tc>
@@ -16981,7 +17151,7 @@
                 <w:sz w:val="18"/>
                 <w:szCs w:val="18"/>
               </w:rPr>
-              <w:t xml:space="preserve">R$ 8.898</w:t>
+              <w:t xml:space="preserve">R$ 7.619</w:t>
             </w:r>
           </w:p>
         </w:tc>
@@ -17047,7 +17217,7 @@
                 <w:sz w:val="18"/>
                 <w:szCs w:val="18"/>
               </w:rPr>
-              <w:t xml:space="preserve">R$ 38.473</w:t>
+              <w:t xml:space="preserve">R$ 34.967</w:t>
             </w:r>
           </w:p>
         </w:tc>
@@ -17079,7 +17249,7 @@
                 <w:sz w:val="18"/>
                 <w:szCs w:val="18"/>
               </w:rPr>
-              <w:t xml:space="preserve">R$ 404.672</w:t>
+              <w:t xml:space="preserve">R$ 335.487</w:t>
             </w:r>
           </w:p>
         </w:tc>
@@ -17111,7 +17281,7 @@
                 <w:sz w:val="18"/>
                 <w:szCs w:val="18"/>
               </w:rPr>
-              <w:t xml:space="preserve">R$ 10.117</w:t>
+              <w:t xml:space="preserve">R$ 8.387</w:t>
             </w:r>
           </w:p>
         </w:tc>
@@ -17177,7 +17347,7 @@
                 <w:sz w:val="18"/>
                 <w:szCs w:val="18"/>
               </w:rPr>
-              <w:t xml:space="preserve">R$ 50.062</w:t>
+              <w:t xml:space="preserve">R$ 41.681</w:t>
             </w:r>
           </w:p>
         </w:tc>
@@ -17209,7 +17379,7 @@
                 <w:sz w:val="18"/>
                 <w:szCs w:val="18"/>
               </w:rPr>
-              <w:t xml:space="preserve">R$ 928.695</w:t>
+              <w:t xml:space="preserve">R$ 763.125</w:t>
             </w:r>
           </w:p>
         </w:tc>
@@ -17241,7 +17411,7 @@
                 <w:sz w:val="18"/>
                 <w:szCs w:val="18"/>
               </w:rPr>
-              <w:t xml:space="preserve">R$ 23.217</w:t>
+              <w:t xml:space="preserve">R$ 19.078</w:t>
             </w:r>
           </w:p>
         </w:tc>
@@ -17307,7 +17477,7 @@
                 <w:sz w:val="18"/>
                 <w:szCs w:val="18"/>
               </w:rPr>
-              <w:t xml:space="preserve">R$ 23.566</w:t>
+              <w:t xml:space="preserve">R$ 20.971</w:t>
             </w:r>
           </w:p>
         </w:tc>
@@ -17339,7 +17509,7 @@
                 <w:sz w:val="18"/>
                 <w:szCs w:val="18"/>
               </w:rPr>
-              <w:t xml:space="preserve">R$ 388.954</w:t>
+              <w:t xml:space="preserve">R$ 337.795</w:t>
             </w:r>
           </w:p>
         </w:tc>
@@ -17371,7 +17541,7 @@
                 <w:sz w:val="18"/>
                 <w:szCs w:val="18"/>
               </w:rPr>
-              <w:t xml:space="preserve">R$ 9.724</w:t>
+              <w:t xml:space="preserve">R$ 8.445</w:t>
             </w:r>
           </w:p>
         </w:tc>
@@ -17437,7 +17607,7 @@
                 <w:sz w:val="18"/>
                 <w:szCs w:val="18"/>
               </w:rPr>
-              <w:t xml:space="preserve">R$ 23.144</w:t>
+              <w:t xml:space="preserve">R$ 20.550</w:t>
             </w:r>
           </w:p>
         </w:tc>
@@ -17469,7 +17639,7 @@
                 <w:sz w:val="18"/>
                 <w:szCs w:val="18"/>
               </w:rPr>
-              <w:t xml:space="preserve">R$ 382.682</w:t>
+              <w:t xml:space="preserve">R$ 331.524</w:t>
             </w:r>
           </w:p>
         </w:tc>
@@ -17501,7 +17671,7 @@
                 <w:sz w:val="18"/>
                 <w:szCs w:val="18"/>
               </w:rPr>
-              <w:t xml:space="preserve">R$ 9.567</w:t>
+              <w:t xml:space="preserve">R$ 8.288</w:t>
             </w:r>
           </w:p>
         </w:tc>
@@ -17543,7 +17713,7 @@
           <w:sz w:val="21"/>
           <w:szCs w:val="21"/>
         </w:rPr>
-        <w:t xml:space="preserve">Com 10% de contingência sobre o hardware e somando o software, o investimento total fica em cerca de R$ 510 mil na Arquitetura A e R$ 531 mil na B2.</w:t>
+        <w:t xml:space="preserve">Com 10% de contingência sobre o hardware e somando o software, o investimento total fica em cerca de R$ 454 mil na Arquitetura A e R$ 475 mil na B2.</w:t>
       </w:r>
     </w:p>
     <w:p>
@@ -20764,41 +20934,41 @@
                 <w:sz w:val="16"/>
                 <w:szCs w:val="16"/>
               </w:rPr>
+              <w:t xml:space="preserve">2</w:t>
+            </w:r>
+          </w:p>
+        </w:tc>
+        <w:tc>
+          <w:tcPr>
+            <w:tcW w:type="dxa" w:w="832"/>
+            <w:tcBorders>
+              <w:top w:val="single" w:color="BFC7D2" w:sz="4"/>
+              <w:left w:val="single" w:color="BFC7D2" w:sz="4"/>
+              <w:bottom w:val="single" w:color="BFC7D2" w:sz="4"/>
+              <w:right w:val="single" w:color="BFC7D2" w:sz="4"/>
+            </w:tcBorders>
+            <w:tcMar>
+              <w:top w:type="dxa" w:w="60"/>
+              <w:left w:type="dxa" w:w="100"/>
+              <w:bottom w:type="dxa" w:w="60"/>
+              <w:right w:type="dxa" w:w="100"/>
+            </w:tcMar>
+            <w:vAlign w:val="center"/>
+          </w:tcPr>
+          <w:p>
+            <w:pPr>
+              <w:jc w:val="right"/>
+            </w:pPr>
+            <w:r>
+              <w:rPr>
+                <w:rFonts w:ascii="Arial" w:cs="Arial" w:eastAsia="Arial" w:hAnsi="Arial"/>
+                <w:b w:val="false"/>
+                <w:bCs w:val="false"/>
+                <w:color w:val="1C2430"/>
+                <w:sz w:val="16"/>
+                <w:szCs w:val="16"/>
+              </w:rPr>
               <w:t xml:space="preserve">4</w:t>
-            </w:r>
-          </w:p>
-        </w:tc>
-        <w:tc>
-          <w:tcPr>
-            <w:tcW w:type="dxa" w:w="832"/>
-            <w:tcBorders>
-              <w:top w:val="single" w:color="BFC7D2" w:sz="4"/>
-              <w:left w:val="single" w:color="BFC7D2" w:sz="4"/>
-              <w:bottom w:val="single" w:color="BFC7D2" w:sz="4"/>
-              <w:right w:val="single" w:color="BFC7D2" w:sz="4"/>
-            </w:tcBorders>
-            <w:tcMar>
-              <w:top w:type="dxa" w:w="60"/>
-              <w:left w:type="dxa" w:w="100"/>
-              <w:bottom w:type="dxa" w:w="60"/>
-              <w:right w:type="dxa" w:w="100"/>
-            </w:tcMar>
-            <w:vAlign w:val="center"/>
-          </w:tcPr>
-          <w:p>
-            <w:pPr>
-              <w:jc w:val="right"/>
-            </w:pPr>
-            <w:r>
-              <w:rPr>
-                <w:rFonts w:ascii="Arial" w:cs="Arial" w:eastAsia="Arial" w:hAnsi="Arial"/>
-                <w:b w:val="false"/>
-                <w:bCs w:val="false"/>
-                <w:color w:val="1C2430"/>
-                <w:sz w:val="16"/>
-                <w:szCs w:val="16"/>
-              </w:rPr>
-              <w:t xml:space="preserve">8</w:t>
             </w:r>
           </w:p>
         </w:tc>
@@ -21072,7 +21242,7 @@
                 <w:sz w:val="16"/>
                 <w:szCs w:val="16"/>
               </w:rPr>
-              <w:t xml:space="preserve">8</w:t>
+              <w:t xml:space="preserve">4</w:t>
             </w:r>
           </w:p>
         </w:tc>
@@ -21106,7 +21276,7 @@
                 <w:sz w:val="16"/>
                 <w:szCs w:val="16"/>
               </w:rPr>
-              <w:t xml:space="preserve">12</w:t>
+              <w:t xml:space="preserve">6</w:t>
             </w:r>
           </w:p>
         </w:tc>
@@ -21380,7 +21550,7 @@
                 <w:sz w:val="16"/>
                 <w:szCs w:val="16"/>
               </w:rPr>
-              <w:t xml:space="preserve">8</w:t>
+              <w:t xml:space="preserve">4</w:t>
             </w:r>
           </w:p>
         </w:tc>
@@ -21414,7 +21584,7 @@
                 <w:sz w:val="16"/>
                 <w:szCs w:val="16"/>
               </w:rPr>
-              <w:t xml:space="preserve">12</w:t>
+              <w:t xml:space="preserve">6</w:t>
             </w:r>
           </w:p>
         </w:tc>
@@ -21688,7 +21858,7 @@
                 <w:sz w:val="16"/>
                 <w:szCs w:val="16"/>
               </w:rPr>
-              <w:t xml:space="preserve">8</w:t>
+              <w:t xml:space="preserve">4</w:t>
             </w:r>
           </w:p>
         </w:tc>
@@ -21722,7 +21892,7 @@
                 <w:sz w:val="16"/>
                 <w:szCs w:val="16"/>
               </w:rPr>
-              <w:t xml:space="preserve">12</w:t>
+              <w:t xml:space="preserve">6</w:t>
             </w:r>
           </w:p>
         </w:tc>
@@ -21996,7 +22166,7 @@
                 <w:sz w:val="16"/>
                 <w:szCs w:val="16"/>
               </w:rPr>
-              <w:t xml:space="preserve">8</w:t>
+              <w:t xml:space="preserve">4</w:t>
             </w:r>
           </w:p>
         </w:tc>
@@ -22030,7 +22200,7 @@
                 <w:sz w:val="16"/>
                 <w:szCs w:val="16"/>
               </w:rPr>
-              <w:t xml:space="preserve">12</w:t>
+              <w:t xml:space="preserve">6</w:t>
             </w:r>
           </w:p>
         </w:tc>
@@ -22304,7 +22474,7 @@
                 <w:sz w:val="16"/>
                 <w:szCs w:val="16"/>
               </w:rPr>
-              <w:t xml:space="preserve">8</w:t>
+              <w:t xml:space="preserve">4</w:t>
             </w:r>
           </w:p>
         </w:tc>
@@ -22338,7 +22508,7 @@
                 <w:sz w:val="16"/>
                 <w:szCs w:val="16"/>
               </w:rPr>
-              <w:t xml:space="preserve">12</w:t>
+              <w:t xml:space="preserve">6</w:t>
             </w:r>
           </w:p>
         </w:tc>
@@ -22612,7 +22782,7 @@
                 <w:sz w:val="16"/>
                 <w:szCs w:val="16"/>
               </w:rPr>
-              <w:t xml:space="preserve">9</w:t>
+              <w:t xml:space="preserve">5</w:t>
             </w:r>
           </w:p>
         </w:tc>
@@ -22646,7 +22816,7 @@
                 <w:sz w:val="16"/>
                 <w:szCs w:val="16"/>
               </w:rPr>
-              <w:t xml:space="preserve">13</w:t>
+              <w:t xml:space="preserve">7</w:t>
             </w:r>
           </w:p>
         </w:tc>
@@ -22920,7 +23090,7 @@
                 <w:sz w:val="16"/>
                 <w:szCs w:val="16"/>
               </w:rPr>
-              <w:t xml:space="preserve">9</w:t>
+              <w:t xml:space="preserve">5</w:t>
             </w:r>
           </w:p>
         </w:tc>
@@ -22954,7 +23124,7 @@
                 <w:sz w:val="16"/>
                 <w:szCs w:val="16"/>
               </w:rPr>
-              <w:t xml:space="preserve">13</w:t>
+              <w:t xml:space="preserve">7</w:t>
             </w:r>
           </w:p>
         </w:tc>
@@ -23228,7 +23398,7 @@
                 <w:sz w:val="16"/>
                 <w:szCs w:val="16"/>
               </w:rPr>
-              <w:t xml:space="preserve">8</w:t>
+              <w:t xml:space="preserve">4</w:t>
             </w:r>
           </w:p>
         </w:tc>
@@ -23262,7 +23432,7 @@
                 <w:sz w:val="16"/>
                 <w:szCs w:val="16"/>
               </w:rPr>
-              <w:t xml:space="preserve">12</w:t>
+              <w:t xml:space="preserve">6</w:t>
             </w:r>
           </w:p>
         </w:tc>
@@ -23536,7 +23706,7 @@
                 <w:sz w:val="16"/>
                 <w:szCs w:val="16"/>
               </w:rPr>
-              <w:t xml:space="preserve">8</w:t>
+              <w:t xml:space="preserve">4</w:t>
             </w:r>
           </w:p>
         </w:tc>
@@ -23570,7 +23740,7 @@
                 <w:sz w:val="16"/>
                 <w:szCs w:val="16"/>
               </w:rPr>
-              <w:t xml:space="preserve">12</w:t>
+              <w:t xml:space="preserve">6</w:t>
             </w:r>
           </w:p>
         </w:tc>
@@ -23844,7 +24014,7 @@
                 <w:sz w:val="16"/>
                 <w:szCs w:val="16"/>
               </w:rPr>
-              <w:t xml:space="preserve">8</w:t>
+              <w:t xml:space="preserve">4</w:t>
             </w:r>
           </w:p>
         </w:tc>
@@ -23878,7 +24048,7 @@
                 <w:sz w:val="16"/>
                 <w:szCs w:val="16"/>
               </w:rPr>
-              <w:t xml:space="preserve">12</w:t>
+              <w:t xml:space="preserve">6</w:t>
             </w:r>
           </w:p>
         </w:tc>
@@ -24152,7 +24322,7 @@
                 <w:sz w:val="16"/>
                 <w:szCs w:val="16"/>
               </w:rPr>
-              <w:t xml:space="preserve">8</w:t>
+              <w:t xml:space="preserve">4</w:t>
             </w:r>
           </w:p>
         </w:tc>
@@ -24186,7 +24356,7 @@
                 <w:sz w:val="16"/>
                 <w:szCs w:val="16"/>
               </w:rPr>
-              <w:t xml:space="preserve">12</w:t>
+              <w:t xml:space="preserve">6</w:t>
             </w:r>
           </w:p>
         </w:tc>
@@ -24460,7 +24630,7 @@
                 <w:sz w:val="16"/>
                 <w:szCs w:val="16"/>
               </w:rPr>
-              <w:t xml:space="preserve">9</w:t>
+              <w:t xml:space="preserve">5</w:t>
             </w:r>
           </w:p>
         </w:tc>
@@ -24494,7 +24664,7 @@
                 <w:sz w:val="16"/>
                 <w:szCs w:val="16"/>
               </w:rPr>
-              <w:t xml:space="preserve">13</w:t>
+              <w:t xml:space="preserve">7</w:t>
             </w:r>
           </w:p>
         </w:tc>
@@ -24768,7 +24938,7 @@
                 <w:sz w:val="16"/>
                 <w:szCs w:val="16"/>
               </w:rPr>
-              <w:t xml:space="preserve">9</w:t>
+              <w:t xml:space="preserve">5</w:t>
             </w:r>
           </w:p>
         </w:tc>
@@ -24802,7 +24972,7 @@
                 <w:sz w:val="16"/>
                 <w:szCs w:val="16"/>
               </w:rPr>
-              <w:t xml:space="preserve">13</w:t>
+              <w:t xml:space="preserve">7</w:t>
             </w:r>
           </w:p>
         </w:tc>
@@ -25076,7 +25246,7 @@
                 <w:sz w:val="16"/>
                 <w:szCs w:val="16"/>
               </w:rPr>
-              <w:t xml:space="preserve">8</w:t>
+              <w:t xml:space="preserve">4</w:t>
             </w:r>
           </w:p>
         </w:tc>
@@ -25110,7 +25280,7 @@
                 <w:sz w:val="16"/>
                 <w:szCs w:val="16"/>
               </w:rPr>
-              <w:t xml:space="preserve">12</w:t>
+              <w:t xml:space="preserve">6</w:t>
             </w:r>
           </w:p>
         </w:tc>
@@ -25384,7 +25554,7 @@
                 <w:sz w:val="16"/>
                 <w:szCs w:val="16"/>
               </w:rPr>
-              <w:t xml:space="preserve">8</w:t>
+              <w:t xml:space="preserve">4</w:t>
             </w:r>
           </w:p>
         </w:tc>
@@ -25418,7 +25588,7 @@
                 <w:sz w:val="16"/>
                 <w:szCs w:val="16"/>
               </w:rPr>
-              <w:t xml:space="preserve">12</w:t>
+              <w:t xml:space="preserve">6</w:t>
             </w:r>
           </w:p>
         </w:tc>
@@ -25692,7 +25862,7 @@
                 <w:sz w:val="16"/>
                 <w:szCs w:val="16"/>
               </w:rPr>
-              <w:t xml:space="preserve">8</w:t>
+              <w:t xml:space="preserve">4</w:t>
             </w:r>
           </w:p>
         </w:tc>
@@ -25726,7 +25896,7 @@
                 <w:sz w:val="16"/>
                 <w:szCs w:val="16"/>
               </w:rPr>
-              <w:t xml:space="preserve">12</w:t>
+              <w:t xml:space="preserve">6</w:t>
             </w:r>
           </w:p>
         </w:tc>
@@ -26000,7 +26170,7 @@
                 <w:sz w:val="16"/>
                 <w:szCs w:val="16"/>
               </w:rPr>
-              <w:t xml:space="preserve">8</w:t>
+              <w:t xml:space="preserve">4</w:t>
             </w:r>
           </w:p>
         </w:tc>
@@ -26034,7 +26204,7 @@
                 <w:sz w:val="16"/>
                 <w:szCs w:val="16"/>
               </w:rPr>
-              <w:t xml:space="preserve">12</w:t>
+              <w:t xml:space="preserve">6</w:t>
             </w:r>
           </w:p>
         </w:tc>
@@ -26308,7 +26478,7 @@
                 <w:sz w:val="16"/>
                 <w:szCs w:val="16"/>
               </w:rPr>
-              <w:t xml:space="preserve">8</w:t>
+              <w:t xml:space="preserve">4</w:t>
             </w:r>
           </w:p>
         </w:tc>
@@ -26342,7 +26512,7 @@
                 <w:sz w:val="16"/>
                 <w:szCs w:val="16"/>
               </w:rPr>
-              <w:t xml:space="preserve">12</w:t>
+              <w:t xml:space="preserve">6</w:t>
             </w:r>
           </w:p>
         </w:tc>
@@ -26650,7 +26820,7 @@
                 <w:sz w:val="16"/>
                 <w:szCs w:val="16"/>
               </w:rPr>
-              <w:t xml:space="preserve">5</w:t>
+              <w:t xml:space="preserve">3</w:t>
             </w:r>
           </w:p>
         </w:tc>
@@ -26924,7 +27094,7 @@
                 <w:sz w:val="16"/>
                 <w:szCs w:val="16"/>
               </w:rPr>
-              <w:t xml:space="preserve">8</w:t>
+              <w:t xml:space="preserve">4</w:t>
             </w:r>
           </w:p>
         </w:tc>
@@ -26958,7 +27128,7 @@
                 <w:sz w:val="16"/>
                 <w:szCs w:val="16"/>
               </w:rPr>
-              <w:t xml:space="preserve">12</w:t>
+              <w:t xml:space="preserve">6</w:t>
             </w:r>
           </w:p>
         </w:tc>
@@ -27232,7 +27402,7 @@
                 <w:sz w:val="16"/>
                 <w:szCs w:val="16"/>
               </w:rPr>
-              <w:t xml:space="preserve">8</w:t>
+              <w:t xml:space="preserve">4</w:t>
             </w:r>
           </w:p>
         </w:tc>
@@ -27266,7 +27436,7 @@
                 <w:sz w:val="16"/>
                 <w:szCs w:val="16"/>
               </w:rPr>
-              <w:t xml:space="preserve">12</w:t>
+              <w:t xml:space="preserve">6</w:t>
             </w:r>
           </w:p>
         </w:tc>
@@ -27540,7 +27710,7 @@
                 <w:sz w:val="16"/>
                 <w:szCs w:val="16"/>
               </w:rPr>
-              <w:t xml:space="preserve">8</w:t>
+              <w:t xml:space="preserve">4</w:t>
             </w:r>
           </w:p>
         </w:tc>
@@ -27574,7 +27744,7 @@
                 <w:sz w:val="16"/>
                 <w:szCs w:val="16"/>
               </w:rPr>
-              <w:t xml:space="preserve">12</w:t>
+              <w:t xml:space="preserve">6</w:t>
             </w:r>
           </w:p>
         </w:tc>
@@ -27848,7 +28018,7 @@
                 <w:sz w:val="16"/>
                 <w:szCs w:val="16"/>
               </w:rPr>
-              <w:t xml:space="preserve">8</w:t>
+              <w:t xml:space="preserve">4</w:t>
             </w:r>
           </w:p>
         </w:tc>
@@ -27882,7 +28052,7 @@
                 <w:sz w:val="16"/>
                 <w:szCs w:val="16"/>
               </w:rPr>
-              <w:t xml:space="preserve">12</w:t>
+              <w:t xml:space="preserve">6</w:t>
             </w:r>
           </w:p>
         </w:tc>
@@ -28156,7 +28326,7 @@
                 <w:sz w:val="16"/>
                 <w:szCs w:val="16"/>
               </w:rPr>
-              <w:t xml:space="preserve">8</w:t>
+              <w:t xml:space="preserve">4</w:t>
             </w:r>
           </w:p>
         </w:tc>
@@ -28190,7 +28360,7 @@
                 <w:sz w:val="16"/>
                 <w:szCs w:val="16"/>
               </w:rPr>
-              <w:t xml:space="preserve">12</w:t>
+              <w:t xml:space="preserve">6</w:t>
             </w:r>
           </w:p>
         </w:tc>
@@ -28464,7 +28634,7 @@
                 <w:sz w:val="16"/>
                 <w:szCs w:val="16"/>
               </w:rPr>
-              <w:t xml:space="preserve">8</w:t>
+              <w:t xml:space="preserve">4</w:t>
             </w:r>
           </w:p>
         </w:tc>
@@ -28498,7 +28668,7 @@
                 <w:sz w:val="16"/>
                 <w:szCs w:val="16"/>
               </w:rPr>
-              <w:t xml:space="preserve">12</w:t>
+              <w:t xml:space="preserve">6</w:t>
             </w:r>
           </w:p>
         </w:tc>
@@ -28772,7 +28942,7 @@
                 <w:sz w:val="16"/>
                 <w:szCs w:val="16"/>
               </w:rPr>
-              <w:t xml:space="preserve">11</w:t>
+              <w:t xml:space="preserve">7</w:t>
             </w:r>
           </w:p>
         </w:tc>
@@ -28806,7 +28976,7 @@
                 <w:sz w:val="16"/>
                 <w:szCs w:val="16"/>
               </w:rPr>
-              <w:t xml:space="preserve">15</w:t>
+              <w:t xml:space="preserve">9</w:t>
             </w:r>
           </w:p>
         </w:tc>
@@ -29080,7 +29250,7 @@
                 <w:sz w:val="16"/>
                 <w:szCs w:val="16"/>
               </w:rPr>
-              <w:t xml:space="preserve">11</w:t>
+              <w:t xml:space="preserve">7</w:t>
             </w:r>
           </w:p>
         </w:tc>
@@ -29114,7 +29284,7 @@
                 <w:sz w:val="16"/>
                 <w:szCs w:val="16"/>
               </w:rPr>
-              <w:t xml:space="preserve">15</w:t>
+              <w:t xml:space="preserve">9</w:t>
             </w:r>
           </w:p>
         </w:tc>
@@ -29388,7 +29558,7 @@
                 <w:sz w:val="16"/>
                 <w:szCs w:val="16"/>
               </w:rPr>
-              <w:t xml:space="preserve">8</w:t>
+              <w:t xml:space="preserve">4</w:t>
             </w:r>
           </w:p>
         </w:tc>
@@ -29422,7 +29592,7 @@
                 <w:sz w:val="16"/>
                 <w:szCs w:val="16"/>
               </w:rPr>
-              <w:t xml:space="preserve">12</w:t>
+              <w:t xml:space="preserve">6</w:t>
             </w:r>
           </w:p>
         </w:tc>
@@ -29696,7 +29866,7 @@
                 <w:sz w:val="16"/>
                 <w:szCs w:val="16"/>
               </w:rPr>
-              <w:t xml:space="preserve">8</w:t>
+              <w:t xml:space="preserve">4</w:t>
             </w:r>
           </w:p>
         </w:tc>
@@ -29730,7 +29900,7 @@
                 <w:sz w:val="16"/>
                 <w:szCs w:val="16"/>
               </w:rPr>
-              <w:t xml:space="preserve">12</w:t>
+              <w:t xml:space="preserve">6</w:t>
             </w:r>
           </w:p>
         </w:tc>
@@ -30004,7 +30174,7 @@
                 <w:sz w:val="16"/>
                 <w:szCs w:val="16"/>
               </w:rPr>
-              <w:t xml:space="preserve">8</w:t>
+              <w:t xml:space="preserve">4</w:t>
             </w:r>
           </w:p>
         </w:tc>
@@ -30038,7 +30208,7 @@
                 <w:sz w:val="16"/>
                 <w:szCs w:val="16"/>
               </w:rPr>
-              <w:t xml:space="preserve">12</w:t>
+              <w:t xml:space="preserve">6</w:t>
             </w:r>
           </w:p>
         </w:tc>
@@ -30312,7 +30482,7 @@
                 <w:sz w:val="16"/>
                 <w:szCs w:val="16"/>
               </w:rPr>
-              <w:t xml:space="preserve">8</w:t>
+              <w:t xml:space="preserve">4</w:t>
             </w:r>
           </w:p>
         </w:tc>
@@ -30346,7 +30516,7 @@
                 <w:sz w:val="16"/>
                 <w:szCs w:val="16"/>
               </w:rPr>
-              <w:t xml:space="preserve">12</w:t>
+              <w:t xml:space="preserve">6</w:t>
             </w:r>
           </w:p>
         </w:tc>
@@ -30620,7 +30790,7 @@
                 <w:sz w:val="16"/>
                 <w:szCs w:val="16"/>
               </w:rPr>
-              <w:t xml:space="preserve">11</w:t>
+              <w:t xml:space="preserve">7</w:t>
             </w:r>
           </w:p>
         </w:tc>
@@ -30654,7 +30824,7 @@
                 <w:sz w:val="16"/>
                 <w:szCs w:val="16"/>
               </w:rPr>
-              <w:t xml:space="preserve">15</w:t>
+              <w:t xml:space="preserve">9</w:t>
             </w:r>
           </w:p>
         </w:tc>
@@ -30928,7 +31098,7 @@
                 <w:sz w:val="16"/>
                 <w:szCs w:val="16"/>
               </w:rPr>
-              <w:t xml:space="preserve">11</w:t>
+              <w:t xml:space="preserve">7</w:t>
             </w:r>
           </w:p>
         </w:tc>
@@ -30962,7 +31132,7 @@
                 <w:sz w:val="16"/>
                 <w:szCs w:val="16"/>
               </w:rPr>
-              <w:t xml:space="preserve">15</w:t>
+              <w:t xml:space="preserve">9</w:t>
             </w:r>
           </w:p>
         </w:tc>
@@ -31236,7 +31406,7 @@
                 <w:sz w:val="16"/>
                 <w:szCs w:val="16"/>
               </w:rPr>
-              <w:t xml:space="preserve">8</w:t>
+              <w:t xml:space="preserve">4</w:t>
             </w:r>
           </w:p>
         </w:tc>
@@ -31270,7 +31440,7 @@
                 <w:sz w:val="16"/>
                 <w:szCs w:val="16"/>
               </w:rPr>
-              <w:t xml:space="preserve">12</w:t>
+              <w:t xml:space="preserve">6</w:t>
             </w:r>
           </w:p>
         </w:tc>
@@ -31544,7 +31714,7 @@
                 <w:sz w:val="16"/>
                 <w:szCs w:val="16"/>
               </w:rPr>
-              <w:t xml:space="preserve">8</w:t>
+              <w:t xml:space="preserve">4</w:t>
             </w:r>
           </w:p>
         </w:tc>
@@ -31578,7 +31748,7 @@
                 <w:sz w:val="16"/>
                 <w:szCs w:val="16"/>
               </w:rPr>
-              <w:t xml:space="preserve">12</w:t>
+              <w:t xml:space="preserve">6</w:t>
             </w:r>
           </w:p>
         </w:tc>
@@ -31852,7 +32022,7 @@
                 <w:sz w:val="16"/>
                 <w:szCs w:val="16"/>
               </w:rPr>
-              <w:t xml:space="preserve">8</w:t>
+              <w:t xml:space="preserve">4</w:t>
             </w:r>
           </w:p>
         </w:tc>
@@ -31886,7 +32056,7 @@
                 <w:sz w:val="16"/>
                 <w:szCs w:val="16"/>
               </w:rPr>
-              <w:t xml:space="preserve">12</w:t>
+              <w:t xml:space="preserve">6</w:t>
             </w:r>
           </w:p>
         </w:tc>
@@ -32160,7 +32330,7 @@
                 <w:sz w:val="16"/>
                 <w:szCs w:val="16"/>
               </w:rPr>
-              <w:t xml:space="preserve">8</w:t>
+              <w:t xml:space="preserve">4</w:t>
             </w:r>
           </w:p>
         </w:tc>
@@ -32194,7 +32364,7 @@
                 <w:sz w:val="16"/>
                 <w:szCs w:val="16"/>
               </w:rPr>
-              <w:t xml:space="preserve">12</w:t>
+              <w:t xml:space="preserve">6</w:t>
             </w:r>
           </w:p>
         </w:tc>
@@ -32468,7 +32638,7 @@
                 <w:sz w:val="16"/>
                 <w:szCs w:val="16"/>
               </w:rPr>
-              <w:t xml:space="preserve">8</w:t>
+              <w:t xml:space="preserve">4</w:t>
             </w:r>
           </w:p>
         </w:tc>
@@ -32502,7 +32672,7 @@
                 <w:sz w:val="16"/>
                 <w:szCs w:val="16"/>
               </w:rPr>
-              <w:t xml:space="preserve">12</w:t>
+              <w:t xml:space="preserve">6</w:t>
             </w:r>
           </w:p>
         </w:tc>
@@ -32776,7 +32946,7 @@
                 <w:sz w:val="16"/>
                 <w:szCs w:val="16"/>
               </w:rPr>
-              <w:t xml:space="preserve">8</w:t>
+              <w:t xml:space="preserve">4</w:t>
             </w:r>
           </w:p>
         </w:tc>
@@ -32810,7 +32980,7 @@
                 <w:sz w:val="16"/>
                 <w:szCs w:val="16"/>
               </w:rPr>
-              <w:t xml:space="preserve">12</w:t>
+              <w:t xml:space="preserve">6</w:t>
             </w:r>
           </w:p>
         </w:tc>
@@ -33092,7 +33262,7 @@
                 <w:sz w:val="16"/>
                 <w:szCs w:val="16"/>
               </w:rPr>
-              <w:t xml:space="preserve">325</w:t>
+              <w:t xml:space="preserve">171</w:t>
             </w:r>
           </w:p>
         </w:tc>
@@ -33127,7 +33297,7 @@
                 <w:sz w:val="16"/>
                 <w:szCs w:val="16"/>
               </w:rPr>
-              <w:t xml:space="preserve">485</w:t>
+              <w:t xml:space="preserve">251</w:t>
             </w:r>
           </w:p>
         </w:tc>
@@ -33957,7 +34127,73 @@
                 <w:sz w:val="18"/>
                 <w:szCs w:val="18"/>
               </w:rPr>
-              <w:t xml:space="preserve">Grupo de cerca de três prédios do baixo giro com um display de endereço e quantidade.</w:t>
+              <w:t xml:space="preserve">Grupo de prédios com um display de endereço e quantidade: cerca de seis prédios no baixo giro e cinco nos andares 4 e 5 do alto giro.</w:t>
+            </w:r>
+          </w:p>
+        </w:tc>
+      </w:tr>
+      <w:tr>
+        <w:tc>
+          <w:tcPr>
+            <w:tcW w:type="dxa" w:w="2478"/>
+            <w:tcBorders>
+              <w:top w:val="single" w:color="BFC7D2" w:sz="4"/>
+              <w:left w:val="single" w:color="BFC7D2" w:sz="4"/>
+              <w:bottom w:val="single" w:color="BFC7D2" w:sz="4"/>
+              <w:right w:val="single" w:color="BFC7D2" w:sz="4"/>
+            </w:tcBorders>
+            <w:tcMar>
+              <w:top w:type="dxa" w:w="60"/>
+              <w:left w:type="dxa" w:w="100"/>
+              <w:bottom w:type="dxa" w:w="60"/>
+              <w:right w:type="dxa" w:w="100"/>
+            </w:tcMar>
+            <w:vAlign w:val="center"/>
+          </w:tcPr>
+          <w:p>
+            <w:pPr>
+              <w:jc w:val="left"/>
+            </w:pPr>
+            <w:r>
+              <w:rPr>
+                <w:rFonts w:ascii="Arial" w:cs="Arial" w:eastAsia="Arial" w:hAnsi="Arial"/>
+                <w:color w:val="1C2430"/>
+                <w:sz w:val="18"/>
+                <w:szCs w:val="18"/>
+              </w:rPr>
+              <w:t xml:space="preserve">Sinal de baixo giro</w:t>
+            </w:r>
+          </w:p>
+        </w:tc>
+        <w:tc>
+          <w:tcPr>
+            <w:tcW w:type="dxa" w:w="7160"/>
+            <w:tcBorders>
+              <w:top w:val="single" w:color="BFC7D2" w:sz="4"/>
+              <w:left w:val="single" w:color="BFC7D2" w:sz="4"/>
+              <w:bottom w:val="single" w:color="BFC7D2" w:sz="4"/>
+              <w:right w:val="single" w:color="BFC7D2" w:sz="4"/>
+            </w:tcBorders>
+            <w:tcMar>
+              <w:top w:type="dxa" w:w="60"/>
+              <w:left w:type="dxa" w:w="100"/>
+              <w:bottom w:type="dxa" w:w="60"/>
+              <w:right w:type="dxa" w:w="100"/>
+            </w:tcMar>
+            <w:vAlign w:val="center"/>
+          </w:tcPr>
+          <w:p>
+            <w:pPr>
+              <w:jc w:val="left"/>
+            </w:pPr>
+            <w:r>
+              <w:rPr>
+                <w:rFonts w:ascii="Arial" w:cs="Arial" w:eastAsia="Arial" w:hAnsi="Arial"/>
+                <w:color w:val="1C2430"/>
+                <w:sz w:val="18"/>
+                <w:szCs w:val="18"/>
+              </w:rPr>
+              <w:t xml:space="preserve">Luz âmbar na frente do operador que acende quando a caixa tem itens no corredor.</w:t>
             </w:r>
           </w:p>
         </w:tc>
@@ -34354,7 +34590,7 @@
         <w:sz w:val="16"/>
         <w:szCs w:val="16"/>
       </w:rPr>
-      <w:t xml:space="preserve">Projeto Pick-to-Light · Documento de Arquitetura · versão 1.3</w:t>
+      <w:t xml:space="preserve">Projeto Pick-to-Light · Documento de Arquitetura · versão 1.4</w:t>
     </w:r>
   </w:p>
 </w:hdr>

</xml_diff>

<commit_message>
POC das estações 04 e 27, caixas maiores e sem luzes no topo
- Aba POC no orçamento: fase 1 (bancada) e fase 2 (estações 04 e 27),
  contingência e horas de software da POC; piloto passa a ser 04 e 27
- Diagrama do mockup da bancada (bancada_poc.png)
- 3D: sem LED guia e sem produtos coloridos em cima das caixas; caixas
  ocupam a largura do vão
- LED guia de coluna retirado do orçamento, do documento e dos diagramas

Co-Authored-By: Claude Opus 5.5 <noreply@anthropic.com>
Claude-Session: https://claude.ai/code/session_01TBWA3G7ku1j3oTf4VMkLud
</commit_message>
<xml_diff>
--- a/projeto/entregaveis/Arquitetura_PTL_Documento_Tecnico.docx
+++ b/projeto/entregaveis/Arquitetura_PTL_Documento_Tecnico.docx
@@ -314,7 +314,7 @@
                 <w:sz w:val="18"/>
                 <w:szCs w:val="18"/>
               </w:rPr>
-              <w:t xml:space="preserve">Piloto</w:t>
+              <w:t xml:space="preserve">Piloto (POC)</w:t>
             </w:r>
           </w:p>
         </w:tc>
@@ -346,7 +346,7 @@
                 <w:sz w:val="18"/>
                 <w:szCs w:val="18"/>
               </w:rPr>
-              <w:t xml:space="preserve">Estações 05 (Medicamento) e 27 (Perfumaria)</w:t>
+              <w:t xml:space="preserve">Estações 04 (Medicamento) e 27 (Perfumaria), depois de uma bancada de testes</w:t>
             </w:r>
           </w:p>
         </w:tc>
@@ -745,7 +745,7 @@
           <w:sz w:val="21"/>
           <w:szCs w:val="21"/>
         </w:rPr>
-        <w:t xml:space="preserve">Orçamento do piloto (estações 05 e 27) e da operação completa (40 estações), em 12 V e em 5 V.</w:t>
+        <w:t xml:space="preserve">Orçamento da POC (bancada + estações 04 e 27) e da operação completa (40 estações), em 12 V e em 5 V.</w:t>
       </w:r>
     </w:p>
     <w:p>
@@ -4676,26 +4676,6 @@
           <w:sz w:val="21"/>
           <w:szCs w:val="21"/>
         </w:rPr>
-        <w:t xml:space="preserve">Opcional: um LED guia no topo de cada prédio, que acende a coluna do item atual da zona. Custa cerca de R$ 1.000 para a operação toda.</w:t>
-      </w:r>
-    </w:p>
-    <w:p>
-      <w:pPr>
-        <w:pStyle w:val="ListParagraph"/>
-        <w:numPr>
-          <w:ilvl w:val="0"/>
-          <w:numId w:val="2"/>
-        </w:numPr>
-        <w:spacing w:after="60" w:line="290"/>
-      </w:pPr>
-      <w:r>
-        <w:rPr>
-          <w:rFonts w:ascii="Arial" w:cs="Arial" w:eastAsia="Arial" w:hAnsi="Arial"/>
-          <w:b w:val="false"/>
-          <w:bCs w:val="false"/>
-          <w:sz w:val="21"/>
-          <w:szCs w:val="21"/>
-        </w:rPr>
         <w:t xml:space="preserve">O número de zonas por lado é configurável e pode mudar depois do piloto, conforme a produtividade.</w:t>
       </w:r>
     </w:p>
@@ -13994,7 +13974,7 @@
                 <w:sz w:val="18"/>
                 <w:szCs w:val="18"/>
               </w:rPr>
-              <w:t xml:space="preserve">Piloto (05 e 27)</w:t>
+              <w:t xml:space="preserve">Piloto (04 e 27)</w:t>
             </w:r>
           </w:p>
         </w:tc>
@@ -15019,7 +14999,7 @@
           <w:sz w:val="21"/>
           <w:szCs w:val="21"/>
         </w:rPr>
-        <w:t xml:space="preserve">Fonte Mean Well LRS-150-12 (12 V, 12,5 A). A estação consome cerca de 1,5 A, o que deixa folga para os LEDs guia e para ampliações.</w:t>
+        <w:t xml:space="preserve">Fonte Mean Well LRS-150-12 (12 V, 12,5 A). A estação consome cerca de 1,5 A, o que deixa folga para ampliações.</w:t>
       </w:r>
     </w:p>
     <w:p>
@@ -16691,7 +16671,7 @@
                 <w:sz w:val="18"/>
                 <w:szCs w:val="18"/>
               </w:rPr>
-              <w:t xml:space="preserve">Piloto (05 e 27)</w:t>
+              <w:t xml:space="preserve">Piloto (04 e 27)</w:t>
             </w:r>
           </w:p>
         </w:tc>
@@ -18093,7 +18073,7 @@
                 <w:sz w:val="18"/>
                 <w:szCs w:val="18"/>
               </w:rPr>
-              <w:t xml:space="preserve">2. Piloto</w:t>
+              <w:t xml:space="preserve">2. POC</w:t>
             </w:r>
           </w:p>
         </w:tc>
@@ -18125,7 +18105,7 @@
                 <w:sz w:val="18"/>
                 <w:szCs w:val="18"/>
               </w:rPr>
-              <w:t xml:space="preserve">Estações 05 e 27 completas, app do coletor e painel; medição do tempo por caixa antes e depois</w:t>
+              <w:t xml:space="preserve">Bancada (3 a 4 semanas) e depois as estações 04 e 27 completas, app do coletor e interface de controle; medição do tempo por caixa antes e depois. Hardware: cerca de R$ 22,5 mil com contingência (aba POC)</w:t>
             </w:r>
           </w:p>
         </w:tc>
@@ -18157,7 +18137,7 @@
                 <w:sz w:val="18"/>
                 <w:szCs w:val="18"/>
               </w:rPr>
-              <w:t xml:space="preserve">6 a 8 semanas</w:t>
+              <w:t xml:space="preserve">cerca de 10 semanas</w:t>
             </w:r>
           </w:p>
         </w:tc>

</xml_diff>

<commit_message>
Foco no coletor; leitor fixo retirado e RFID como melhoria futura
- Orçamento: aba B-RFID vira RFID-futuro (tags + pulseiras como acréscimo,
  fora do investimento); B2 retirado; software do RFID separado
- Documento (v1.5), apresentação e diagramas: Arquitetura A na POC e na
  implantação; RFID com pulseira como melhoria futura
- Simulador: sem o modo B2; pulseira marcada como melhoria futura

Co-Authored-By: Claude Opus 5.5 <noreply@anthropic.com>
Claude-Session: https://claude.ai/code/session_01TBWA3G7ku1j3oTf4VMkLud
</commit_message>
<xml_diff>
--- a/projeto/entregaveis/Arquitetura_PTL_Documento_Tecnico.docx
+++ b/projeto/entregaveis/Arquitetura_PTL_Documento_Tecnico.docx
@@ -168,7 +168,7 @@
                 <w:sz w:val="18"/>
                 <w:szCs w:val="18"/>
               </w:rPr>
-              <w:t xml:space="preserve">Arquiteturas</w:t>
+              <w:t xml:space="preserve">Arquitetura</w:t>
             </w:r>
           </w:p>
         </w:tc>
@@ -200,21 +200,21 @@
                 <w:sz w:val="18"/>
                 <w:szCs w:val="18"/>
               </w:rPr>
-              <w:t xml:space="preserve">A: coletor de dados, concentrador e displays</w:t>
-            </w:r>
-          </w:p>
-          <w:p>
-            <w:pPr>
-              <w:jc w:val="left"/>
-            </w:pPr>
-            <w:r>
-              <w:rPr>
-                <w:rFonts w:ascii="Arial" w:cs="Arial" w:eastAsia="Arial" w:hAnsi="Arial"/>
-                <w:color w:val="1C2430"/>
-                <w:sz w:val="18"/>
-                <w:szCs w:val="18"/>
-              </w:rPr>
-              <w:t xml:space="preserve">B: identificação por RFID, concentrador e displays</w:t>
+              <w:t xml:space="preserve">A: coletor de dados, concentrador e displays (POC e implantação)</w:t>
+            </w:r>
+          </w:p>
+          <w:p>
+            <w:pPr>
+              <w:jc w:val="left"/>
+            </w:pPr>
+            <w:r>
+              <w:rPr>
+                <w:rFonts w:ascii="Arial" w:cs="Arial" w:eastAsia="Arial" w:hAnsi="Arial"/>
+                <w:color w:val="1C2430"/>
+                <w:sz w:val="18"/>
+                <w:szCs w:val="18"/>
+              </w:rPr>
+              <w:t xml:space="preserve">Melhoria futura: identificação por RFID com pulseira</w:t>
             </w:r>
           </w:p>
         </w:tc>
@@ -478,7 +478,7 @@
                 <w:sz w:val="18"/>
                 <w:szCs w:val="18"/>
               </w:rPr>
-              <w:t xml:space="preserve">1.4, de 26/10/2026 (2 zonas por lado, andares 4-5 sob a separação, sinal de baixo giro), em revisão pela TI, arquitetura de software e diretoria</w:t>
+              <w:t xml:space="preserve">1.5, de 26/10/2026 (foco no coletor; RFID como melhoria futura; POC 04 e 27), em revisão pela TI, arquitetura de software e diretoria</w:t>
             </w:r>
           </w:p>
         </w:tc>
@@ -665,7 +665,7 @@
           <w:sz w:val="21"/>
           <w:szCs w:val="21"/>
         </w:rPr>
-        <w:t xml:space="preserve">Duas formas de identificar a caixa: pelo coletor de dados MovFast que já usamos (Arquitetura A) ou por uma tag RFID fixa na caixa retornável (Arquitetura B).</w:t>
+        <w:t xml:space="preserve">Identificação da caixa pelo coletor de dados MovFast que já usamos (Arquitetura A). A identificação por RFID com pulseira fica descrita como melhoria futura (item 6).</w:t>
       </w:r>
     </w:p>
     <w:p>
@@ -1288,7 +1288,7 @@
                 <w:sz w:val="18"/>
                 <w:szCs w:val="18"/>
               </w:rPr>
-              <w:t xml:space="preserve">Retornáveis, o que permite fixar uma tag RFID na Arquitetura B.</w:t>
+              <w:t xml:space="preserve">Retornáveis, o que permite fixar uma tag RFID no futuro.</w:t>
             </w:r>
           </w:p>
         </w:tc>
@@ -6094,7 +6094,7 @@
           <w:sz w:val="21"/>
           <w:szCs w:val="21"/>
         </w:rPr>
-        <w:t xml:space="preserve">A Figura 4 mostra os componentes do sistema e como se comunicam. Os blocos em azul são o software novo, os verdes são o hardware novo de cada estação e os marrons são os sistemas que já existem. Os tracejados são opcionais ou só valem para a Arquitetura B.</w:t>
+        <w:t xml:space="preserve">A Figura 4 mostra os componentes do sistema e como se comunicam. Os blocos em azul são o software novo, os verdes são o hardware novo de cada estação e os marrons são os sistemas que já existem. Os tracejados são opcionais ou ficam para a melhoria futura com RFID.</w:t>
       </w:r>
     </w:p>
     <w:p>
@@ -8396,7 +8396,7 @@
         <w:rPr>
           <w:rFonts w:ascii="Arial" w:cs="Arial" w:eastAsia="Arial" w:hAnsi="Arial"/>
         </w:rPr>
-        <w:t xml:space="preserve">6. Arquitetura B: identificação por RFID</w:t>
+        <w:t xml:space="preserve">6. Melhoria futura: identificação por RFID</w:t>
       </w:r>
     </w:p>
     <w:p>
@@ -8409,7 +8409,7 @@
           <w:sz w:val="21"/>
           <w:szCs w:val="21"/>
         </w:rPr>
-        <w:t xml:space="preserve">A Arquitetura B usa os mesmos displays, concentradores e Serviço PTL da A. Muda só a forma de identificar a caixa: cada caixa retornável recebe uma tag NFC (13,56 MHz) fixa e a leitura acontece sem o coletor.</w:t>
+        <w:t xml:space="preserve">Decisão de 26/10/2026: a POC e a implantação inicial usam o coletor (Arquitetura A). O RFID com pulseira fica como melhoria futura e o leitor fixo na estação saiu do projeto. O RFID usa os mesmos displays, concentradores e Serviço PTL da A; muda só a forma de abrir e fechar a caixa: cada caixa retornável recebe uma tag NFC (13,56 MHz) e o operador encosta a pulseira.</w:t>
       </w:r>
     </w:p>
     <w:p>
@@ -8472,7 +8472,7 @@
           <w:sz w:val="18"/>
           <w:szCs w:val="18"/>
         </w:rPr>
-        <w:t xml:space="preserve">Figura 6. Visão geral da Arquitetura B</w:t>
+        <w:t xml:space="preserve">Figura 6. Melhoria futura: RFID com pulseira sobre a Arquitetura A</w:t>
       </w:r>
     </w:p>
     <w:p>
@@ -8679,7 +8679,7 @@
                 <w:sz w:val="17"/>
                 <w:szCs w:val="17"/>
               </w:rPr>
-              <w:t xml:space="preserve">B1: pulseira NFC</w:t>
+              <w:t xml:space="preserve">Pulseira NFC (escolhida para o futuro)</w:t>
             </w:r>
           </w:p>
         </w:tc>
@@ -8776,136 +8776,6 @@
                 <w:szCs w:val="17"/>
               </w:rPr>
               <w:t xml:space="preserve">Pode atrapalhar o operador; precisa de carga diária; higiene e conforto.</w:t>
-            </w:r>
-          </w:p>
-        </w:tc>
-      </w:tr>
-      <w:tr>
-        <w:tc>
-          <w:tcPr>
-            <w:tcW w:type="dxa" w:w="1563"/>
-            <w:tcBorders>
-              <w:top w:val="single" w:color="BFC7D2" w:sz="4"/>
-              <w:left w:val="single" w:color="BFC7D2" w:sz="4"/>
-              <w:bottom w:val="single" w:color="BFC7D2" w:sz="4"/>
-              <w:right w:val="single" w:color="BFC7D2" w:sz="4"/>
-            </w:tcBorders>
-            <w:tcMar>
-              <w:top w:type="dxa" w:w="60"/>
-              <w:left w:type="dxa" w:w="100"/>
-              <w:bottom w:type="dxa" w:w="60"/>
-              <w:right w:type="dxa" w:w="100"/>
-            </w:tcMar>
-            <w:vAlign w:val="center"/>
-          </w:tcPr>
-          <w:p>
-            <w:pPr>
-              <w:jc w:val="left"/>
-            </w:pPr>
-            <w:r>
-              <w:rPr>
-                <w:rFonts w:ascii="Arial" w:cs="Arial" w:eastAsia="Arial" w:hAnsi="Arial"/>
-                <w:color w:val="1C2430"/>
-                <w:sz w:val="17"/>
-                <w:szCs w:val="17"/>
-              </w:rPr>
-              <w:t xml:space="preserve">B2: leitor fixo na estação</w:t>
-            </w:r>
-          </w:p>
-        </w:tc>
-        <w:tc>
-          <w:tcPr>
-            <w:tcW w:type="dxa" w:w="3386"/>
-            <w:tcBorders>
-              <w:top w:val="single" w:color="BFC7D2" w:sz="4"/>
-              <w:left w:val="single" w:color="BFC7D2" w:sz="4"/>
-              <w:bottom w:val="single" w:color="BFC7D2" w:sz="4"/>
-              <w:right w:val="single" w:color="BFC7D2" w:sz="4"/>
-            </w:tcBorders>
-            <w:tcMar>
-              <w:top w:type="dxa" w:w="60"/>
-              <w:left w:type="dxa" w:w="100"/>
-              <w:bottom w:type="dxa" w:w="60"/>
-              <w:right w:type="dxa" w:w="100"/>
-            </w:tcMar>
-            <w:vAlign w:val="center"/>
-          </w:tcPr>
-          <w:p>
-            <w:pPr>
-              <w:jc w:val="left"/>
-            </w:pPr>
-            <w:r>
-              <w:rPr>
-                <w:rFonts w:ascii="Arial" w:cs="Arial" w:eastAsia="Arial" w:hAnsi="Arial"/>
-                <w:color w:val="1C2430"/>
-                <w:sz w:val="17"/>
-                <w:szCs w:val="17"/>
-              </w:rPr>
-              <w:t xml:space="preserve">Leitor NFC sob a posição de pega na esteira de separação, ligado ao barramento da estação como mais um nó. Um painel LCD mostra a caixa e os itens que faltam; fecha com nova leitura ou com o botão FECHAR.</w:t>
-            </w:r>
-          </w:p>
-        </w:tc>
-        <w:tc>
-          <w:tcPr>
-            <w:tcW w:type="dxa" w:w="2344"/>
-            <w:tcBorders>
-              <w:top w:val="single" w:color="BFC7D2" w:sz="4"/>
-              <w:left w:val="single" w:color="BFC7D2" w:sz="4"/>
-              <w:bottom w:val="single" w:color="BFC7D2" w:sz="4"/>
-              <w:right w:val="single" w:color="BFC7D2" w:sz="4"/>
-            </w:tcBorders>
-            <w:tcMar>
-              <w:top w:type="dxa" w:w="60"/>
-              <w:left w:type="dxa" w:w="100"/>
-              <w:bottom w:type="dxa" w:w="60"/>
-              <w:right w:type="dxa" w:w="100"/>
-            </w:tcMar>
-            <w:vAlign w:val="center"/>
-          </w:tcPr>
-          <w:p>
-            <w:pPr>
-              <w:jc w:val="left"/>
-            </w:pPr>
-            <w:r>
-              <w:rPr>
-                <w:rFonts w:ascii="Arial" w:cs="Arial" w:eastAsia="Arial" w:hAnsi="Arial"/>
-                <w:color w:val="1C2430"/>
-                <w:sz w:val="17"/>
-                <w:szCs w:val="17"/>
-              </w:rPr>
-              <w:t xml:space="preserve">Nada no corpo do operador e sem bateria. Abre sozinho.</w:t>
-            </w:r>
-          </w:p>
-        </w:tc>
-        <w:tc>
-          <w:tcPr>
-            <w:tcW w:type="dxa" w:w="2345"/>
-            <w:tcBorders>
-              <w:top w:val="single" w:color="BFC7D2" w:sz="4"/>
-              <w:left w:val="single" w:color="BFC7D2" w:sz="4"/>
-              <w:bottom w:val="single" w:color="BFC7D2" w:sz="4"/>
-              <w:right w:val="single" w:color="BFC7D2" w:sz="4"/>
-            </w:tcBorders>
-            <w:tcMar>
-              <w:top w:type="dxa" w:w="60"/>
-              <w:left w:type="dxa" w:w="100"/>
-              <w:bottom w:type="dxa" w:w="60"/>
-              <w:right w:type="dxa" w:w="100"/>
-            </w:tcMar>
-            <w:vAlign w:val="center"/>
-          </w:tcPr>
-          <w:p>
-            <w:pPr>
-              <w:jc w:val="left"/>
-            </w:pPr>
-            <w:r>
-              <w:rPr>
-                <w:rFonts w:ascii="Arial" w:cs="Arial" w:eastAsia="Arial" w:hAnsi="Arial"/>
-                <w:color w:val="1C2430"/>
-                <w:sz w:val="17"/>
-                <w:szCs w:val="17"/>
-              </w:rPr>
-              <w:t xml:space="preserve">A caixa precisa parar sempre no mesmo ponto; exige instalação mecânica na esteira.</w:t>
             </w:r>
           </w:p>
         </w:tc>
@@ -9086,7 +8956,7 @@
                 <w:sz w:val="19"/>
                 <w:szCs w:val="19"/>
               </w:rPr>
-              <w:t xml:space="preserve">Para a Arquitetura B, indicamos o leitor fixo (B2): ele resolve a preocupação de a pulseira atrapalhar o operador e não tem bateria. A pulseira (B1) fica como alternativa para estações em que a caixa não pare sempre no mesmo lugar.</w:t>
+              <w:t xml:space="preserve">O leitor fixo na posição de pega foi descartado. Quando o RFID for retomado, a opção é a pulseira NFC; o hardware e o software da POC já ficam preparados para receber essa leitura.</w:t>
             </w:r>
           </w:p>
         </w:tc>
@@ -9193,7 +9063,7 @@
         <w:rPr>
           <w:rFonts w:ascii="Arial" w:cs="Arial" w:eastAsia="Arial" w:hAnsi="Arial"/>
         </w:rPr>
-        <w:t xml:space="preserve">6.3 Comparação entre A e B</w:t>
+        <w:t xml:space="preserve">6.3 Coletor hoje e RFID depois</w:t>
       </w:r>
     </w:p>
     <w:tbl>
@@ -9283,7 +9153,7 @@
                 <w:sz w:val="18"/>
                 <w:szCs w:val="18"/>
               </w:rPr>
-              <w:t xml:space="preserve">A: coletor</w:t>
+              <w:t xml:space="preserve">Coletor (POC e implantação)</w:t>
             </w:r>
           </w:p>
         </w:tc>
@@ -9318,7 +9188,7 @@
                 <w:sz w:val="18"/>
                 <w:szCs w:val="18"/>
               </w:rPr>
-              <w:t xml:space="preserve">B: RFID (B2)</w:t>
+              <w:t xml:space="preserve">RFID com pulseira (futuro)</w:t>
             </w:r>
           </w:p>
         </w:tc>
@@ -9416,7 +9286,7 @@
                 <w:sz w:val="18"/>
                 <w:szCs w:val="18"/>
               </w:rPr>
-              <w:t xml:space="preserve">Leitor fixo por estação e tag em cada caixa</w:t>
+              <w:t xml:space="preserve">Tag em cada caixa e pulseira no operador</w:t>
             </w:r>
           </w:p>
         </w:tc>
@@ -9514,7 +9384,7 @@
                 <w:sz w:val="18"/>
                 <w:szCs w:val="18"/>
               </w:rPr>
-              <w:t xml:space="preserve">Coloca a caixa na posição (abre) e faz nova leitura ou aperta o botão (fecha)</w:t>
+              <w:t xml:space="preserve">Encosta o pulso na tag para abrir e de novo para fechar</w:t>
             </w:r>
           </w:p>
         </w:tc>
@@ -9612,7 +9482,7 @@
                 <w:sz w:val="18"/>
                 <w:szCs w:val="18"/>
               </w:rPr>
-              <w:t xml:space="preserve">R$ 332 mil</w:t>
+              <w:t xml:space="preserve">Acréscimo de cerca de R$ 33 mil (R$ 36 mil com contingência)</w:t>
             </w:r>
           </w:p>
         </w:tc>
@@ -9808,7 +9678,7 @@
                 <w:sz w:val="18"/>
                 <w:szCs w:val="18"/>
               </w:rPr>
-              <w:t xml:space="preserve">Posição da caixa na leitura; tamanho da frota</w:t>
+              <w:t xml:space="preserve">Conforto e bateria da pulseira; tamanho da frota</w:t>
             </w:r>
           </w:p>
         </w:tc>
@@ -9906,7 +9776,7 @@
                 <w:sz w:val="18"/>
                 <w:szCs w:val="18"/>
               </w:rPr>
-              <w:t xml:space="preserve">Maior por causa das tags, do cadastro e da instalação</w:t>
+              <w:t xml:space="preserve">Depois da POC: etiquetar a frota e cadastrar as tags</w:t>
             </w:r>
           </w:p>
         </w:tc>
@@ -17425,7 +17295,7 @@
                 <w:sz w:val="18"/>
                 <w:szCs w:val="18"/>
               </w:rPr>
-              <w:t xml:space="preserve">B1, RFID com pulseira</w:t>
+              <w:t xml:space="preserve">Melhoria futura: RFID (acréscimo)</w:t>
             </w:r>
           </w:p>
         </w:tc>
@@ -17457,7 +17327,7 @@
                 <w:sz w:val="18"/>
                 <w:szCs w:val="18"/>
               </w:rPr>
-              <w:t xml:space="preserve">R$ 20.971</w:t>
+              <w:t xml:space="preserve">R$ 1.760</w:t>
             </w:r>
           </w:p>
         </w:tc>
@@ -17489,7 +17359,7 @@
                 <w:sz w:val="18"/>
                 <w:szCs w:val="18"/>
               </w:rPr>
-              <w:t xml:space="preserve">R$ 337.795</w:t>
+              <w:t xml:space="preserve">R$ 33.040</w:t>
             </w:r>
           </w:p>
         </w:tc>
@@ -17521,137 +17391,7 @@
                 <w:sz w:val="18"/>
                 <w:szCs w:val="18"/>
               </w:rPr>
-              <w:t xml:space="preserve">R$ 8.445</w:t>
-            </w:r>
-          </w:p>
-        </w:tc>
-      </w:tr>
-      <w:tr>
-        <w:tc>
-          <w:tcPr>
-            <w:tcW w:type="dxa" w:w="3855"/>
-            <w:tcBorders>
-              <w:top w:val="single" w:color="BFC7D2" w:sz="4"/>
-              <w:left w:val="single" w:color="BFC7D2" w:sz="4"/>
-              <w:bottom w:val="single" w:color="BFC7D2" w:sz="4"/>
-              <w:right w:val="single" w:color="BFC7D2" w:sz="4"/>
-            </w:tcBorders>
-            <w:tcMar>
-              <w:top w:type="dxa" w:w="60"/>
-              <w:left w:type="dxa" w:w="100"/>
-              <w:bottom w:type="dxa" w:w="60"/>
-              <w:right w:type="dxa" w:w="100"/>
-            </w:tcMar>
-            <w:vAlign w:val="center"/>
-          </w:tcPr>
-          <w:p>
-            <w:pPr>
-              <w:jc w:val="left"/>
-            </w:pPr>
-            <w:r>
-              <w:rPr>
-                <w:rFonts w:ascii="Arial" w:cs="Arial" w:eastAsia="Arial" w:hAnsi="Arial"/>
-                <w:color w:val="1C2430"/>
-                <w:sz w:val="18"/>
-                <w:szCs w:val="18"/>
-              </w:rPr>
-              <w:t xml:space="preserve">B2, RFID com leitor fixo</w:t>
-            </w:r>
-          </w:p>
-        </w:tc>
-        <w:tc>
-          <w:tcPr>
-            <w:tcW w:type="dxa" w:w="1928"/>
-            <w:tcBorders>
-              <w:top w:val="single" w:color="BFC7D2" w:sz="4"/>
-              <w:left w:val="single" w:color="BFC7D2" w:sz="4"/>
-              <w:bottom w:val="single" w:color="BFC7D2" w:sz="4"/>
-              <w:right w:val="single" w:color="BFC7D2" w:sz="4"/>
-            </w:tcBorders>
-            <w:tcMar>
-              <w:top w:type="dxa" w:w="60"/>
-              <w:left w:type="dxa" w:w="100"/>
-              <w:bottom w:type="dxa" w:w="60"/>
-              <w:right w:type="dxa" w:w="100"/>
-            </w:tcMar>
-            <w:vAlign w:val="center"/>
-          </w:tcPr>
-          <w:p>
-            <w:pPr>
-              <w:jc w:val="right"/>
-            </w:pPr>
-            <w:r>
-              <w:rPr>
-                <w:rFonts w:ascii="Arial" w:cs="Arial" w:eastAsia="Arial" w:hAnsi="Arial"/>
-                <w:color w:val="1C2430"/>
-                <w:sz w:val="18"/>
-                <w:szCs w:val="18"/>
-              </w:rPr>
-              <w:t xml:space="preserve">R$ 20.550</w:t>
-            </w:r>
-          </w:p>
-        </w:tc>
-        <w:tc>
-          <w:tcPr>
-            <w:tcW w:type="dxa" w:w="2185"/>
-            <w:tcBorders>
-              <w:top w:val="single" w:color="BFC7D2" w:sz="4"/>
-              <w:left w:val="single" w:color="BFC7D2" w:sz="4"/>
-              <w:bottom w:val="single" w:color="BFC7D2" w:sz="4"/>
-              <w:right w:val="single" w:color="BFC7D2" w:sz="4"/>
-            </w:tcBorders>
-            <w:tcMar>
-              <w:top w:type="dxa" w:w="60"/>
-              <w:left w:type="dxa" w:w="100"/>
-              <w:bottom w:type="dxa" w:w="60"/>
-              <w:right w:type="dxa" w:w="100"/>
-            </w:tcMar>
-            <w:vAlign w:val="center"/>
-          </w:tcPr>
-          <w:p>
-            <w:pPr>
-              <w:jc w:val="right"/>
-            </w:pPr>
-            <w:r>
-              <w:rPr>
-                <w:rFonts w:ascii="Arial" w:cs="Arial" w:eastAsia="Arial" w:hAnsi="Arial"/>
-                <w:color w:val="1C2430"/>
-                <w:sz w:val="18"/>
-                <w:szCs w:val="18"/>
-              </w:rPr>
-              <w:t xml:space="preserve">R$ 331.524</w:t>
-            </w:r>
-          </w:p>
-        </w:tc>
-        <w:tc>
-          <w:tcPr>
-            <w:tcW w:type="dxa" w:w="1670"/>
-            <w:tcBorders>
-              <w:top w:val="single" w:color="BFC7D2" w:sz="4"/>
-              <w:left w:val="single" w:color="BFC7D2" w:sz="4"/>
-              <w:bottom w:val="single" w:color="BFC7D2" w:sz="4"/>
-              <w:right w:val="single" w:color="BFC7D2" w:sz="4"/>
-            </w:tcBorders>
-            <w:tcMar>
-              <w:top w:type="dxa" w:w="60"/>
-              <w:left w:type="dxa" w:w="100"/>
-              <w:bottom w:type="dxa" w:w="60"/>
-              <w:right w:type="dxa" w:w="100"/>
-            </w:tcMar>
-            <w:vAlign w:val="center"/>
-          </w:tcPr>
-          <w:p>
-            <w:pPr>
-              <w:jc w:val="right"/>
-            </w:pPr>
-            <w:r>
-              <w:rPr>
-                <w:rFonts w:ascii="Arial" w:cs="Arial" w:eastAsia="Arial" w:hAnsi="Arial"/>
-                <w:color w:val="1C2430"/>
-                <w:sz w:val="18"/>
-                <w:szCs w:val="18"/>
-              </w:rPr>
-              <w:t xml:space="preserve">R$ 8.288</w:t>
+              <w:t xml:space="preserve">R$ 826</w:t>
             </w:r>
           </w:p>
         </w:tc>
@@ -17680,7 +17420,7 @@
           <w:sz w:val="21"/>
           <w:szCs w:val="21"/>
         </w:rPr>
-        <w:t xml:space="preserve">Software, com desenvolvimento interno: cerca de 1.144 h para a Arquitetura A e 1.064 h para a B, a R$ 103,78 por hora (salário médio de analista de desenvolvimento, R$ 8.458,30, salario.com.br, CBO 212405, com encargos), ou cerca de R$ 119 mil e R$ 110 mil. Inclui a interface de controle com o cadastro de LED. É custo da equipe interna, não desembolso novo, a menos que o desenvolvimento seja contratado.</w:t>
+        <w:t xml:space="preserve">Software, com desenvolvimento interno: cerca de 1.144 h para a Arquitetura A (mais 80 h quando o RFID for feito), a R$ 103,78 por hora (salário médio de analista de desenvolvimento, R$ 8.458,30, salario.com.br, CBO 212405, com encargos), ou cerca de R$ 119 mil. Inclui a interface de controle com o cadastro de LED. É custo da equipe interna, não desembolso novo, a menos que o desenvolvimento seja contratado.</w:t>
       </w:r>
     </w:p>
     <w:p>
@@ -17693,7 +17433,7 @@
           <w:sz w:val="21"/>
           <w:szCs w:val="21"/>
         </w:rPr>
-        <w:t xml:space="preserve">Com 10% de contingência sobre o hardware e somando o software, o investimento total fica em cerca de R$ 454 mil na Arquitetura A e R$ 475 mil na B2.</w:t>
+        <w:t xml:space="preserve">Com 10% de contingência sobre o hardware e somando o software, o investimento total fica em cerca de R$ 454 mil na Arquitetura A. A POC (bancada + estações 04 e 27) custa cerca de R$ 22,5 mil de hardware com contingência (aba POC).</w:t>
       </w:r>
     </w:p>
     <w:p>
@@ -19953,7 +19693,7 @@
                 <w:sz w:val="18"/>
                 <w:szCs w:val="18"/>
               </w:rPr>
-              <w:t xml:space="preserve">Tamanho da frota de caixas retornáveis (Arquitetura B)</w:t>
+              <w:t xml:space="preserve">Tamanho da frota de caixas retornáveis (para o RFID futuro)</w:t>
             </w:r>
           </w:p>
         </w:tc>
@@ -34570,7 +34310,7 @@
         <w:sz w:val="16"/>
         <w:szCs w:val="16"/>
       </w:rPr>
-      <w:t xml:space="preserve">Projeto Pick-to-Light · Documento de Arquitetura · versão 1.4</w:t>
+      <w:t xml:space="preserve">Projeto Pick-to-Light · Documento de Arquitetura · versão 1.5</w:t>
     </w:r>
   </w:p>
 </w:hdr>

</xml_diff>

<commit_message>
Preços das peças com link: aba Fontes e Orcamento_Pecas_Fontes.xlsx
Cada peça da Arquitetura A e do RFID futuro tem loja, produto, link e
preço consultados em 27/10/2026 (fontes_precos.py). Orçamentos completo,
POC e projeto interno, documento e apresentação regenerados com os
preços novos.

Co-Authored-By: Claude Opus 5.5 <noreply@anthropic.com>
Claude-Session: https://claude.ai/code/session_01TBWA3G7ku1j3oTf4VMkLud
</commit_message>
<xml_diff>
--- a/projeto/entregaveis/Arquitetura_PTL_Documento_Tecnico.docx
+++ b/projeto/entregaveis/Arquitetura_PTL_Documento_Tecnico.docx
@@ -478,7 +478,7 @@
                 <w:sz w:val="18"/>
                 <w:szCs w:val="18"/>
               </w:rPr>
-              <w:t xml:space="preserve">1.5, de 26/10/2026 (foco no coletor; RFID como melhoria futura; POC 04 e 27), em revisão pela TI, arquitetura de software e diretoria</w:t>
+              <w:t xml:space="preserve">1.6, de 27/10/2026 (preços das peças com link; foco no coletor; RFID como melhoria futura; POC 04 e 27), em revisão pela TI, arquitetura de software e diretoria</w:t>
             </w:r>
           </w:p>
         </w:tc>
@@ -8743,7 +8743,7 @@
                 <w:sz w:val="17"/>
                 <w:szCs w:val="17"/>
               </w:rPr>
-              <w:t xml:space="preserve">Mãos livres, leitura em menos de 1 s, cerca de R$ 130 por unidade.</w:t>
+              <w:t xml:space="preserve">Mãos livres, leitura em menos de 1 s, cerca de R$ 113 por unidade.</w:t>
             </w:r>
           </w:p>
         </w:tc>
@@ -9450,7 +9450,7 @@
                 <w:sz w:val="18"/>
                 <w:szCs w:val="18"/>
               </w:rPr>
-              <w:t xml:space="preserve">R$ 305 mil</w:t>
+              <w:t xml:space="preserve">R$ 326 mil</w:t>
             </w:r>
           </w:p>
         </w:tc>
@@ -9482,7 +9482,7 @@
                 <w:sz w:val="18"/>
                 <w:szCs w:val="18"/>
               </w:rPr>
-              <w:t xml:space="preserve">Acréscimo de cerca de R$ 33 mil (R$ 36 mil com contingência)</w:t>
+              <w:t xml:space="preserve">Acréscimo de cerca de R$ 29 mil (R$ 32 mil com contingência)</w:t>
             </w:r>
           </w:p>
         </w:tc>
@@ -15203,7 +15203,7 @@
                 <w:sz w:val="18"/>
                 <w:szCs w:val="18"/>
               </w:rPr>
-              <w:t xml:space="preserve">Um regulador por nó ou módulo, cerca de R$ 8</w:t>
+              <w:t xml:space="preserve">Um regulador por nó ou módulo, cerca de R$ 11</w:t>
             </w:r>
           </w:p>
         </w:tc>
@@ -15301,7 +15301,7 @@
                 <w:sz w:val="18"/>
                 <w:szCs w:val="18"/>
               </w:rPr>
-              <w:t xml:space="preserve">Cerca de R$ 222 mil</w:t>
+              <w:t xml:space="preserve">Cerca de R$ 244 mil</w:t>
             </w:r>
           </w:p>
         </w:tc>
@@ -15333,7 +15333,7 @@
                 <w:sz w:val="18"/>
                 <w:szCs w:val="18"/>
               </w:rPr>
-              <w:t xml:space="preserve">Cerca de R$ 227 mil; o cabo de força extra custa mais do que os reguladores economizados</w:t>
+              <w:t xml:space="preserve">Cerca de R$ 264 mil; a fonte de 5 V e o cabo de força extra custam mais do que os reguladores economizados</w:t>
             </w:r>
           </w:p>
         </w:tc>
@@ -16450,7 +16450,7 @@
           <w:sz w:val="21"/>
           <w:szCs w:val="21"/>
         </w:rPr>
-        <w:t xml:space="preserve">Os valores de hardware estão na planilha Orcamento_PTL.xlsx, com preços pesquisados em lojas brasileiras em 23 e 26/10/2026. Os itens sem preço público aparecem como estimativa e precisam de cotação. Câmbio usado: US$ 1 = R$ 5,04. Fator de importação estimado: 1,9.</w:t>
+        <w:t xml:space="preserve">Os valores de hardware estão na planilha Orcamento_PTL.xlsx, com preços consultados em lojas on-line em 27/10/2026. Cada peça tem loja, produto e link na aba Fontes da planilha e na planilha Orcamento_Pecas_Fontes.xlsx. Só o ponto de tomada novo (serviço a cotar com a manutenção predial) e a bateria da pulseira do RFID ficaram com valor estimado. Câmbio usado: US$ 1 = R$ 5,04, só para a placa do concentrador, que é importada. Fator de importação estimado: 1,9.</w:t>
       </w:r>
     </w:p>
     <w:tbl>
@@ -16677,7 +16677,7 @@
                 <w:sz w:val="18"/>
                 <w:szCs w:val="18"/>
               </w:rPr>
-              <w:t xml:space="preserve">R$ 14.511</w:t>
+              <w:t xml:space="preserve">R$ 15.479</w:t>
             </w:r>
           </w:p>
         </w:tc>
@@ -16709,7 +16709,7 @@
                 <w:sz w:val="18"/>
                 <w:szCs w:val="18"/>
               </w:rPr>
-              <w:t xml:space="preserve">R$ 222.483</w:t>
+              <w:t xml:space="preserve">R$ 243.797</w:t>
             </w:r>
           </w:p>
         </w:tc>
@@ -16741,7 +16741,7 @@
                 <w:sz w:val="18"/>
                 <w:szCs w:val="18"/>
               </w:rPr>
-              <w:t xml:space="preserve">R$ 5.562</w:t>
+              <w:t xml:space="preserve">R$ 6.095</w:t>
             </w:r>
           </w:p>
         </w:tc>
@@ -16807,7 +16807,7 @@
                 <w:sz w:val="18"/>
                 <w:szCs w:val="18"/>
               </w:rPr>
-              <w:t xml:space="preserve">R$ 14.732</w:t>
+              <w:t xml:space="preserve">R$ 16.813</w:t>
             </w:r>
           </w:p>
         </w:tc>
@@ -16839,7 +16839,7 @@
                 <w:sz w:val="18"/>
                 <w:szCs w:val="18"/>
               </w:rPr>
-              <w:t xml:space="preserve">R$ 227.135</w:t>
+              <w:t xml:space="preserve">R$ 264.262</w:t>
             </w:r>
           </w:p>
         </w:tc>
@@ -16871,7 +16871,7 @@
                 <w:sz w:val="18"/>
                 <w:szCs w:val="18"/>
               </w:rPr>
-              <w:t xml:space="preserve">R$ 5.678</w:t>
+              <w:t xml:space="preserve">R$ 6.607</w:t>
             </w:r>
           </w:p>
         </w:tc>
@@ -16937,7 +16937,7 @@
                 <w:sz w:val="18"/>
                 <w:szCs w:val="18"/>
               </w:rPr>
-              <w:t xml:space="preserve">R$ 19.211</w:t>
+              <w:t xml:space="preserve">R$ 20.180</w:t>
             </w:r>
           </w:p>
         </w:tc>
@@ -16969,7 +16969,7 @@
                 <w:sz w:val="18"/>
                 <w:szCs w:val="18"/>
               </w:rPr>
-              <w:t xml:space="preserve">R$ 304.755</w:t>
+              <w:t xml:space="preserve">R$ 326.069</w:t>
             </w:r>
           </w:p>
         </w:tc>
@@ -17001,7 +17001,7 @@
                 <w:sz w:val="18"/>
                 <w:szCs w:val="18"/>
               </w:rPr>
-              <w:t xml:space="preserve">R$ 7.619</w:t>
+              <w:t xml:space="preserve">R$ 8.152</w:t>
             </w:r>
           </w:p>
         </w:tc>
@@ -17067,7 +17067,7 @@
                 <w:sz w:val="18"/>
                 <w:szCs w:val="18"/>
               </w:rPr>
-              <w:t xml:space="preserve">R$ 34.967</w:t>
+              <w:t xml:space="preserve">R$ 35.194</w:t>
             </w:r>
           </w:p>
         </w:tc>
@@ -17099,7 +17099,7 @@
                 <w:sz w:val="18"/>
                 <w:szCs w:val="18"/>
               </w:rPr>
-              <w:t xml:space="preserve">R$ 335.487</w:t>
+              <w:t xml:space="preserve">R$ 342.032</w:t>
             </w:r>
           </w:p>
         </w:tc>
@@ -17131,7 +17131,7 @@
                 <w:sz w:val="18"/>
                 <w:szCs w:val="18"/>
               </w:rPr>
-              <w:t xml:space="preserve">R$ 8.387</w:t>
+              <w:t xml:space="preserve">R$ 8.551</w:t>
             </w:r>
           </w:p>
         </w:tc>
@@ -17197,7 +17197,7 @@
                 <w:sz w:val="18"/>
                 <w:szCs w:val="18"/>
               </w:rPr>
-              <w:t xml:space="preserve">R$ 41.681</w:t>
+              <w:t xml:space="preserve">R$ 41.047</w:t>
             </w:r>
           </w:p>
         </w:tc>
@@ -17229,7 +17229,7 @@
                 <w:sz w:val="18"/>
                 <w:szCs w:val="18"/>
               </w:rPr>
-              <w:t xml:space="preserve">R$ 763.125</w:t>
+              <w:t xml:space="preserve">R$ 754.457</w:t>
             </w:r>
           </w:p>
         </w:tc>
@@ -17261,7 +17261,7 @@
                 <w:sz w:val="18"/>
                 <w:szCs w:val="18"/>
               </w:rPr>
-              <w:t xml:space="preserve">R$ 19.078</w:t>
+              <w:t xml:space="preserve">R$ 18.861</w:t>
             </w:r>
           </w:p>
         </w:tc>
@@ -17327,7 +17327,7 @@
                 <w:sz w:val="18"/>
                 <w:szCs w:val="18"/>
               </w:rPr>
-              <w:t xml:space="preserve">R$ 1.760</w:t>
+              <w:t xml:space="preserve">R$ 1.550</w:t>
             </w:r>
           </w:p>
         </w:tc>
@@ -17359,7 +17359,7 @@
                 <w:sz w:val="18"/>
                 <w:szCs w:val="18"/>
               </w:rPr>
-              <w:t xml:space="preserve">R$ 33.040</w:t>
+              <w:t xml:space="preserve">R$ 29.017</w:t>
             </w:r>
           </w:p>
         </w:tc>
@@ -17391,7 +17391,7 @@
                 <w:sz w:val="18"/>
                 <w:szCs w:val="18"/>
               </w:rPr>
-              <w:t xml:space="preserve">R$ 826</w:t>
+              <w:t xml:space="preserve">R$ 725</w:t>
             </w:r>
           </w:p>
         </w:tc>
@@ -17433,7 +17433,7 @@
           <w:sz w:val="21"/>
           <w:szCs w:val="21"/>
         </w:rPr>
-        <w:t xml:space="preserve">Com 10% de contingência sobre o hardware e somando o software, o investimento total fica em cerca de R$ 454 mil na Arquitetura A. A POC (bancada + estações 04 e 27) custa cerca de R$ 22,5 mil de hardware com contingência (aba POC).</w:t>
+        <w:t xml:space="preserve">Com 10% de contingência sobre o hardware e somando o software, o investimento total fica em cerca de R$ 477 mil na Arquitetura A. A POC (bancada + estações 04 e 27) custa cerca de R$ 23,4 mil de hardware com contingência (aba POC).</w:t>
       </w:r>
     </w:p>
     <w:p>
@@ -17845,7 +17845,7 @@
                 <w:sz w:val="18"/>
                 <w:szCs w:val="18"/>
               </w:rPr>
-              <w:t xml:space="preserve">Bancada (3 a 4 semanas) e depois as estações 04 e 27 completas, app do coletor e interface de controle; medição do tempo por caixa antes e depois. Hardware: cerca de R$ 22,5 mil com contingência (aba POC)</w:t>
+              <w:t xml:space="preserve">Bancada (3 a 4 semanas) e depois as estações 04 e 27 completas, app do coletor e interface de controle; medição do tempo por caixa antes e depois. Hardware: cerca de R$ 23,4 mil com contingência (aba POC)</w:t>
             </w:r>
           </w:p>
         </w:tc>
@@ -34310,7 +34310,7 @@
         <w:sz w:val="16"/>
         <w:szCs w:val="16"/>
       </w:rPr>
-      <w:t xml:space="preserve">Projeto Pick-to-Light · Documento de Arquitetura · versão 1.5</w:t>
+      <w:t xml:space="preserve">Projeto Pick-to-Light · Documento de Arquitetura · versão 1.6</w:t>
     </w:r>
   </w:p>
 </w:hdr>

</xml_diff>

<commit_message>
Carcaças dos LEDs em 3D com valor estipulado; RFID em abas separadas
P13 e P14 voltam a valor estipulado (impressão 3D, medida padrão compacta).
Fontes e peças do RFID futuro ficam em abas próprias, sem misturar com o
projeto. Orçamentos, documento e apresentação regenerados.

Co-Authored-By: Claude Opus 5.5 <noreply@anthropic.com>
Claude-Session: https://claude.ai/code/session_01TBWA3G7ku1j3oTf4VMkLud
</commit_message>
<xml_diff>
--- a/projeto/entregaveis/Arquitetura_PTL_Documento_Tecnico.docx
+++ b/projeto/entregaveis/Arquitetura_PTL_Documento_Tecnico.docx
@@ -9450,7 +9450,7 @@
                 <w:sz w:val="18"/>
                 <w:szCs w:val="18"/>
               </w:rPr>
-              <w:t xml:space="preserve">R$ 326 mil</w:t>
+              <w:t xml:space="preserve">R$ 305 mil</w:t>
             </w:r>
           </w:p>
         </w:tc>
@@ -15301,7 +15301,7 @@
                 <w:sz w:val="18"/>
                 <w:szCs w:val="18"/>
               </w:rPr>
-              <w:t xml:space="preserve">Cerca de R$ 244 mil</w:t>
+              <w:t xml:space="preserve">Cerca de R$ 223 mil</w:t>
             </w:r>
           </w:p>
         </w:tc>
@@ -15333,7 +15333,7 @@
                 <w:sz w:val="18"/>
                 <w:szCs w:val="18"/>
               </w:rPr>
-              <w:t xml:space="preserve">Cerca de R$ 264 mil; a fonte de 5 V e o cabo de força extra custam mais do que os reguladores economizados</w:t>
+              <w:t xml:space="preserve">Cerca de R$ 243 mil; a fonte de 5 V e o cabo de força extra custam mais do que os reguladores economizados</w:t>
             </w:r>
           </w:p>
         </w:tc>
@@ -16450,7 +16450,7 @@
           <w:sz w:val="21"/>
           <w:szCs w:val="21"/>
         </w:rPr>
-        <w:t xml:space="preserve">Os valores de hardware estão na planilha Orcamento_PTL.xlsx, com preços consultados em lojas on-line em 27/10/2026. Cada peça tem loja, produto e link na aba Fontes da planilha e na planilha Orcamento_Pecas_Fontes.xlsx. Só o ponto de tomada novo (serviço a cotar com a manutenção predial) e a bateria da pulseira do RFID ficaram com valor estimado. Câmbio usado: US$ 1 = R$ 5,04, só para a placa do concentrador, que é importada. Fator de importação estimado: 1,9.</w:t>
+        <w:t xml:space="preserve">Os valores de hardware estão na planilha Orcamento_PTL.xlsx, com preços consultados em lojas on-line em 27/10/2026. Cada peça tem loja, produto e link na aba Fontes da planilha e na planilha Orcamento_Pecas_Fontes.xlsx. Ficaram sem preço de loja, por decisão do projeto, as carcaças dos LEDs (impressas em 3D, em medida padrão compacta, com valor estipulado) e o ponto de tomada novo (serviço a cotar com a manutenção predial). As peças do RFID futuro ficam em abas separadas; nelas, só a bateria da pulseira ficou estimada. Câmbio usado: US$ 1 = R$ 5,04, só para a placa do concentrador, que é importada. Fator de importação estimado: 1,9.</w:t>
       </w:r>
     </w:p>
     <w:tbl>
@@ -16677,7 +16677,7 @@
                 <w:sz w:val="18"/>
                 <w:szCs w:val="18"/>
               </w:rPr>
-              <w:t xml:space="preserve">R$ 15.479</w:t>
+              <w:t xml:space="preserve">R$ 14.434</w:t>
             </w:r>
           </w:p>
         </w:tc>
@@ -16709,7 +16709,7 @@
                 <w:sz w:val="18"/>
                 <w:szCs w:val="18"/>
               </w:rPr>
-              <w:t xml:space="preserve">R$ 243.797</w:t>
+              <w:t xml:space="preserve">R$ 223.030</w:t>
             </w:r>
           </w:p>
         </w:tc>
@@ -16741,7 +16741,7 @@
                 <w:sz w:val="18"/>
                 <w:szCs w:val="18"/>
               </w:rPr>
-              <w:t xml:space="preserve">R$ 6.095</w:t>
+              <w:t xml:space="preserve">R$ 5.576</w:t>
             </w:r>
           </w:p>
         </w:tc>
@@ -16807,7 +16807,7 @@
                 <w:sz w:val="18"/>
                 <w:szCs w:val="18"/>
               </w:rPr>
-              <w:t xml:space="preserve">R$ 16.813</w:t>
+              <w:t xml:space="preserve">R$ 15.768</w:t>
             </w:r>
           </w:p>
         </w:tc>
@@ -16839,7 +16839,7 @@
                 <w:sz w:val="18"/>
                 <w:szCs w:val="18"/>
               </w:rPr>
-              <w:t xml:space="preserve">R$ 264.262</w:t>
+              <w:t xml:space="preserve">R$ 243.495</w:t>
             </w:r>
           </w:p>
         </w:tc>
@@ -16871,7 +16871,7 @@
                 <w:sz w:val="18"/>
                 <w:szCs w:val="18"/>
               </w:rPr>
-              <w:t xml:space="preserve">R$ 6.607</w:t>
+              <w:t xml:space="preserve">R$ 6.087</w:t>
             </w:r>
           </w:p>
         </w:tc>
@@ -16937,7 +16937,7 @@
                 <w:sz w:val="18"/>
                 <w:szCs w:val="18"/>
               </w:rPr>
-              <w:t xml:space="preserve">R$ 20.180</w:t>
+              <w:t xml:space="preserve">R$ 19.135</w:t>
             </w:r>
           </w:p>
         </w:tc>
@@ -16969,7 +16969,7 @@
                 <w:sz w:val="18"/>
                 <w:szCs w:val="18"/>
               </w:rPr>
-              <w:t xml:space="preserve">R$ 326.069</w:t>
+              <w:t xml:space="preserve">R$ 305.303</w:t>
             </w:r>
           </w:p>
         </w:tc>
@@ -17001,7 +17001,7 @@
                 <w:sz w:val="18"/>
                 <w:szCs w:val="18"/>
               </w:rPr>
-              <w:t xml:space="preserve">R$ 8.152</w:t>
+              <w:t xml:space="preserve">R$ 7.633</w:t>
             </w:r>
           </w:p>
         </w:tc>
@@ -17067,7 +17067,7 @@
                 <w:sz w:val="18"/>
                 <w:szCs w:val="18"/>
               </w:rPr>
-              <w:t xml:space="preserve">R$ 35.194</w:t>
+              <w:t xml:space="preserve">R$ 34.489</w:t>
             </w:r>
           </w:p>
         </w:tc>
@@ -17099,7 +17099,7 @@
                 <w:sz w:val="18"/>
                 <w:szCs w:val="18"/>
               </w:rPr>
-              <w:t xml:space="preserve">R$ 342.032</w:t>
+              <w:t xml:space="preserve">R$ 328.049</w:t>
             </w:r>
           </w:p>
         </w:tc>
@@ -17131,7 +17131,7 @@
                 <w:sz w:val="18"/>
                 <w:szCs w:val="18"/>
               </w:rPr>
-              <w:t xml:space="preserve">R$ 8.551</w:t>
+              <w:t xml:space="preserve">R$ 8.201</w:t>
             </w:r>
           </w:p>
         </w:tc>
@@ -17433,7 +17433,7 @@
           <w:sz w:val="21"/>
           <w:szCs w:val="21"/>
         </w:rPr>
-        <w:t xml:space="preserve">Com 10% de contingência sobre o hardware e somando o software, o investimento total fica em cerca de R$ 477 mil na Arquitetura A. A POC (bancada + estações 04 e 27) custa cerca de R$ 23,4 mil de hardware com contingência (aba POC).</w:t>
+        <w:t xml:space="preserve">Com 10% de contingência sobre o hardware e somando o software, o investimento total fica em cerca de R$ 455 mil na Arquitetura A. A POC (bancada + estações 04 e 27) custa cerca de R$ 22,2 mil de hardware com contingência (aba POC).</w:t>
       </w:r>
     </w:p>
     <w:p>
@@ -17845,7 +17845,7 @@
                 <w:sz w:val="18"/>
                 <w:szCs w:val="18"/>
               </w:rPr>
-              <w:t xml:space="preserve">Bancada (3 a 4 semanas) e depois as estações 04 e 27 completas, app do coletor e interface de controle; medição do tempo por caixa antes e depois. Hardware: cerca de R$ 23,4 mil com contingência (aba POC)</w:t>
+              <w:t xml:space="preserve">Bancada (3 a 4 semanas) e depois as estações 04 e 27 completas, app do coletor e interface de controle; medição do tempo por caixa antes e depois. Hardware: cerca de R$ 22,2 mil com contingência (aba POC)</w:t>
             </w:r>
           </w:p>
         </w:tc>

</xml_diff>